<commit_message>
Kiem tra va chinh sua doc va database lai
</commit_message>
<xml_diff>
--- a/docs/baocao/baocao.docx
+++ b/docs/baocao/baocao.docx
@@ -10433,8 +10433,8 @@
           <w:color w:val="auto"/>
         </w:rPr>
       </w:pPr>
-      <w:bookmarkStart w:id="29" w:name="_Hlk234497810"/>
-      <w:bookmarkStart w:id="30" w:name="_Toc236173471"/>
+      <w:bookmarkStart w:id="29" w:name="_Toc236173471"/>
+      <w:bookmarkStart w:id="30" w:name="_Hlk234497810"/>
       <w:r>
         <w:rPr>
           <w:b/>
@@ -10443,7 +10443,7 @@
         </w:rPr>
         <w:t>Chương 3. PHÂN TÍCH &amp; THIẾT KẾ HỆ THỐNG</w:t>
       </w:r>
-      <w:bookmarkEnd w:id="30"/>
+      <w:bookmarkEnd w:id="29"/>
     </w:p>
     <w:p>
       <w:pPr>
@@ -10718,7 +10718,14 @@
                 <w:sz w:val="26"/>
                 <w:szCs w:val="26"/>
               </w:rPr>
-              <w:t>tạo, chỉnh sửa, xóa và xem danh sách các ví</w:t>
+              <w:t xml:space="preserve">tạo, chỉnh sửa, xóa và xem danh sách các </w:t>
+            </w:r>
+            <w:r>
+              <w:rPr>
+                <w:sz w:val="26"/>
+                <w:szCs w:val="26"/>
+              </w:rPr>
+              <w:t>giao dịch</w:t>
             </w:r>
             <w:r>
               <w:rPr>
@@ -13983,9 +13990,9 @@
         <w:tblLook w:val="04A0" w:firstRow="1" w:lastRow="0" w:firstColumn="1" w:lastColumn="0" w:noHBand="0" w:noVBand="1"/>
       </w:tblPr>
       <w:tblGrid>
-        <w:gridCol w:w="1559"/>
-        <w:gridCol w:w="1738"/>
-        <w:gridCol w:w="1632"/>
+        <w:gridCol w:w="1528"/>
+        <w:gridCol w:w="1787"/>
+        <w:gridCol w:w="1614"/>
         <w:gridCol w:w="1899"/>
         <w:gridCol w:w="1899"/>
       </w:tblGrid>
@@ -14263,7 +14270,7 @@
                 <w:sz w:val="26"/>
                 <w:szCs w:val="26"/>
               </w:rPr>
-              <w:t>Quản lý ví/phiên giao dịch (thêm/sửa/xóa ví)</w:t>
+              <w:t>Quản lý phiên giao dịch (thêm/sửa/xóa)</w:t>
             </w:r>
           </w:p>
         </w:tc>
@@ -14305,6 +14312,29 @@
                 <w:sz w:val="26"/>
                 <w:szCs w:val="26"/>
               </w:rPr>
+              <w:t>Transaction</w:t>
+            </w:r>
+            <w:r>
+              <w:rPr>
+                <w:sz w:val="26"/>
+                <w:szCs w:val="26"/>
+              </w:rPr>
+              <w:t>.</w:t>
+            </w:r>
+          </w:p>
+          <w:p>
+            <w:pPr>
+              <w:spacing w:line="360" w:lineRule="auto"/>
+              <w:rPr>
+                <w:sz w:val="26"/>
+                <w:szCs w:val="26"/>
+              </w:rPr>
+            </w:pPr>
+            <w:r>
+              <w:rPr>
+                <w:sz w:val="26"/>
+                <w:szCs w:val="26"/>
+              </w:rPr>
               <w:t>Wallet, WalletMember</w:t>
             </w:r>
           </w:p>
@@ -14313,6 +14343,29 @@
           <w:tcPr>
             <w:tcW w:w="1899" w:type="dxa"/>
           </w:tcPr>
+          <w:p>
+            <w:pPr>
+              <w:spacing w:line="360" w:lineRule="auto"/>
+              <w:rPr>
+                <w:sz w:val="26"/>
+                <w:szCs w:val="26"/>
+              </w:rPr>
+            </w:pPr>
+            <w:r>
+              <w:rPr>
+                <w:sz w:val="26"/>
+                <w:szCs w:val="26"/>
+              </w:rPr>
+              <w:t>Transaction</w:t>
+            </w:r>
+            <w:r>
+              <w:rPr>
+                <w:sz w:val="26"/>
+                <w:szCs w:val="26"/>
+              </w:rPr>
+              <w:t>.</w:t>
+            </w:r>
+          </w:p>
           <w:p>
             <w:pPr>
               <w:spacing w:line="360" w:lineRule="auto"/>
@@ -15777,7 +15830,6 @@
                 <w:sz w:val="26"/>
                 <w:szCs w:val="26"/>
               </w:rPr>
-              <w:lastRenderedPageBreak/>
               <w:t>FR-17</w:t>
             </w:r>
           </w:p>
@@ -15873,6 +15925,7 @@
           <w:sz w:val="26"/>
           <w:szCs w:val="26"/>
         </w:rPr>
+        <w:lastRenderedPageBreak/>
         <w:t xml:space="preserve">Bảng </w:t>
       </w:r>
       <w:r>
@@ -16287,7 +16340,6 @@
                 <w:sz w:val="24"/>
                 <w:szCs w:val="24"/>
               </w:rPr>
-              <w:lastRenderedPageBreak/>
               <w:t>Actor chính</w:t>
             </w:r>
           </w:p>
@@ -16426,6 +16478,7 @@
                 <w:sz w:val="24"/>
                 <w:szCs w:val="24"/>
               </w:rPr>
+              <w:lastRenderedPageBreak/>
               <w:t>Hậu điều kiện</w:t>
             </w:r>
           </w:p>
@@ -17406,7 +17459,6 @@
                 <w:sz w:val="24"/>
                 <w:szCs w:val="24"/>
               </w:rPr>
-              <w:lastRenderedPageBreak/>
               <w:t>B2.3:</w:t>
             </w:r>
             <w:r>
@@ -17438,7 +17490,6 @@
           <w:sz w:val="26"/>
           <w:szCs w:val="26"/>
         </w:rPr>
-        <w:lastRenderedPageBreak/>
         <w:t xml:space="preserve">Bảng </w:t>
       </w:r>
       <w:r>
@@ -17507,6 +17558,7 @@
           <w:sz w:val="26"/>
           <w:szCs w:val="26"/>
         </w:rPr>
+        <w:lastRenderedPageBreak/>
         <w:t>UC-03: Nhập dữ liệu CSV, hình ảnh</w:t>
       </w:r>
     </w:p>
@@ -18511,7 +18563,6 @@
                 <w:sz w:val="24"/>
                 <w:szCs w:val="24"/>
               </w:rPr>
-              <w:lastRenderedPageBreak/>
               <w:t>Luồng hoạt động chính</w:t>
             </w:r>
           </w:p>
@@ -18663,6 +18714,7 @@
                 <w:sz w:val="24"/>
                 <w:szCs w:val="24"/>
               </w:rPr>
+              <w:lastRenderedPageBreak/>
               <w:t>Luồng ngoại lệ</w:t>
             </w:r>
           </w:p>
@@ -18775,599 +18827,6 @@
           <w:szCs w:val="26"/>
         </w:rPr>
         <w:t>UC-05: Theo dõi các chi tiêu</w:t>
-      </w:r>
-    </w:p>
-    <w:tbl>
-      <w:tblPr>
-        <w:tblW w:w="5000" w:type="pct"/>
-        <w:tblBorders>
-          <w:top w:val="single" w:sz="4" w:space="0" w:color="auto"/>
-          <w:left w:val="single" w:sz="4" w:space="0" w:color="auto"/>
-          <w:bottom w:val="single" w:sz="4" w:space="0" w:color="auto"/>
-          <w:right w:val="single" w:sz="4" w:space="0" w:color="auto"/>
-          <w:insideH w:val="single" w:sz="4" w:space="0" w:color="auto"/>
-          <w:insideV w:val="single" w:sz="4" w:space="0" w:color="auto"/>
-        </w:tblBorders>
-        <w:tblLayout w:type="fixed"/>
-        <w:tblCellMar>
-          <w:top w:w="80" w:type="dxa"/>
-          <w:left w:w="120" w:type="dxa"/>
-          <w:bottom w:w="80" w:type="dxa"/>
-          <w:right w:w="120" w:type="dxa"/>
-        </w:tblCellMar>
-        <w:tblLook w:val="04A0" w:firstRow="1" w:lastRow="0" w:firstColumn="1" w:lastColumn="0" w:noHBand="0" w:noVBand="1"/>
-      </w:tblPr>
-      <w:tblGrid>
-        <w:gridCol w:w="2534"/>
-        <w:gridCol w:w="6193"/>
-      </w:tblGrid>
-      <w:tr>
-        <w:trPr>
-          <w:tblHeader/>
-        </w:trPr>
-        <w:tc>
-          <w:tcPr>
-            <w:tcW w:w="2709" w:type="dxa"/>
-          </w:tcPr>
-          <w:p>
-            <w:pPr>
-              <w:spacing w:before="0" w:line="240" w:lineRule="auto"/>
-              <w:rPr>
-                <w:sz w:val="24"/>
-                <w:szCs w:val="24"/>
-              </w:rPr>
-            </w:pPr>
-            <w:r>
-              <w:rPr>
-                <w:b/>
-                <w:bCs/>
-                <w:sz w:val="24"/>
-                <w:szCs w:val="24"/>
-              </w:rPr>
-              <w:t>Mục</w:t>
-            </w:r>
-          </w:p>
-        </w:tc>
-        <w:tc>
-          <w:tcPr>
-            <w:tcW w:w="6651" w:type="dxa"/>
-          </w:tcPr>
-          <w:p>
-            <w:pPr>
-              <w:spacing w:before="0" w:line="240" w:lineRule="auto"/>
-              <w:rPr>
-                <w:sz w:val="24"/>
-                <w:szCs w:val="24"/>
-              </w:rPr>
-            </w:pPr>
-            <w:r>
-              <w:rPr>
-                <w:b/>
-                <w:bCs/>
-                <w:sz w:val="24"/>
-                <w:szCs w:val="24"/>
-              </w:rPr>
-              <w:t>Nội dung</w:t>
-            </w:r>
-          </w:p>
-        </w:tc>
-      </w:tr>
-      <w:tr>
-        <w:tc>
-          <w:tcPr>
-            <w:tcW w:w="2709" w:type="dxa"/>
-          </w:tcPr>
-          <w:p>
-            <w:pPr>
-              <w:spacing w:before="0" w:line="240" w:lineRule="auto"/>
-              <w:rPr>
-                <w:sz w:val="24"/>
-                <w:szCs w:val="24"/>
-              </w:rPr>
-            </w:pPr>
-            <w:r>
-              <w:rPr>
-                <w:b/>
-                <w:bCs/>
-                <w:sz w:val="24"/>
-                <w:szCs w:val="24"/>
-              </w:rPr>
-              <w:t>Mô tả</w:t>
-            </w:r>
-          </w:p>
-        </w:tc>
-        <w:tc>
-          <w:tcPr>
-            <w:tcW w:w="6651" w:type="dxa"/>
-          </w:tcPr>
-          <w:p>
-            <w:pPr>
-              <w:spacing w:before="0" w:line="240" w:lineRule="auto"/>
-              <w:rPr>
-                <w:sz w:val="24"/>
-                <w:szCs w:val="24"/>
-              </w:rPr>
-            </w:pPr>
-            <w:r>
-              <w:rPr>
-                <w:sz w:val="24"/>
-                <w:szCs w:val="24"/>
-              </w:rPr>
-              <w:t>Cho phép người dùng đặt hạn mức chi tiêu theo danh mục theo tháng; hệ thống cảnh báo khi vượt.</w:t>
-            </w:r>
-          </w:p>
-        </w:tc>
-      </w:tr>
-      <w:tr>
-        <w:tc>
-          <w:tcPr>
-            <w:tcW w:w="2709" w:type="dxa"/>
-          </w:tcPr>
-          <w:p>
-            <w:pPr>
-              <w:spacing w:before="0" w:line="240" w:lineRule="auto"/>
-              <w:rPr>
-                <w:sz w:val="24"/>
-                <w:szCs w:val="24"/>
-              </w:rPr>
-            </w:pPr>
-            <w:r>
-              <w:rPr>
-                <w:b/>
-                <w:bCs/>
-                <w:sz w:val="24"/>
-                <w:szCs w:val="24"/>
-              </w:rPr>
-              <w:t>Actor chính</w:t>
-            </w:r>
-          </w:p>
-        </w:tc>
-        <w:tc>
-          <w:tcPr>
-            <w:tcW w:w="6651" w:type="dxa"/>
-          </w:tcPr>
-          <w:p>
-            <w:pPr>
-              <w:spacing w:before="0" w:line="240" w:lineRule="auto"/>
-              <w:rPr>
-                <w:sz w:val="24"/>
-                <w:szCs w:val="24"/>
-              </w:rPr>
-            </w:pPr>
-            <w:r>
-              <w:rPr>
-                <w:sz w:val="24"/>
-                <w:szCs w:val="24"/>
-              </w:rPr>
-              <w:t>Cá nhân</w:t>
-            </w:r>
-          </w:p>
-        </w:tc>
-      </w:tr>
-      <w:tr>
-        <w:tc>
-          <w:tcPr>
-            <w:tcW w:w="2709" w:type="dxa"/>
-          </w:tcPr>
-          <w:p>
-            <w:pPr>
-              <w:spacing w:before="0" w:line="240" w:lineRule="auto"/>
-              <w:rPr>
-                <w:sz w:val="24"/>
-                <w:szCs w:val="24"/>
-              </w:rPr>
-            </w:pPr>
-            <w:r>
-              <w:rPr>
-                <w:b/>
-                <w:bCs/>
-                <w:sz w:val="24"/>
-                <w:szCs w:val="24"/>
-              </w:rPr>
-              <w:t>Actor phụ</w:t>
-            </w:r>
-          </w:p>
-        </w:tc>
-        <w:tc>
-          <w:tcPr>
-            <w:tcW w:w="6651" w:type="dxa"/>
-          </w:tcPr>
-          <w:p>
-            <w:pPr>
-              <w:spacing w:before="0" w:line="240" w:lineRule="auto"/>
-              <w:rPr>
-                <w:sz w:val="24"/>
-                <w:szCs w:val="24"/>
-              </w:rPr>
-            </w:pPr>
-            <w:r>
-              <w:rPr>
-                <w:sz w:val="24"/>
-                <w:szCs w:val="24"/>
-              </w:rPr>
-              <w:t>Hệ thống thông báo (email)</w:t>
-            </w:r>
-          </w:p>
-        </w:tc>
-      </w:tr>
-      <w:tr>
-        <w:tc>
-          <w:tcPr>
-            <w:tcW w:w="2709" w:type="dxa"/>
-          </w:tcPr>
-          <w:p>
-            <w:pPr>
-              <w:spacing w:before="0" w:line="240" w:lineRule="auto"/>
-              <w:rPr>
-                <w:sz w:val="24"/>
-                <w:szCs w:val="24"/>
-              </w:rPr>
-            </w:pPr>
-            <w:r>
-              <w:rPr>
-                <w:b/>
-                <w:bCs/>
-                <w:sz w:val="24"/>
-                <w:szCs w:val="24"/>
-              </w:rPr>
-              <w:t>Tiền điều kiện</w:t>
-            </w:r>
-          </w:p>
-        </w:tc>
-        <w:tc>
-          <w:tcPr>
-            <w:tcW w:w="6651" w:type="dxa"/>
-          </w:tcPr>
-          <w:p>
-            <w:pPr>
-              <w:spacing w:before="0" w:line="240" w:lineRule="auto"/>
-              <w:rPr>
-                <w:sz w:val="24"/>
-                <w:szCs w:val="24"/>
-              </w:rPr>
-            </w:pPr>
-            <w:r>
-              <w:rPr>
-                <w:sz w:val="24"/>
-                <w:szCs w:val="24"/>
-              </w:rPr>
-              <w:t>Đã đăng nhập; đã có danh mục chi tiêu</w:t>
-            </w:r>
-          </w:p>
-        </w:tc>
-      </w:tr>
-      <w:tr>
-        <w:tc>
-          <w:tcPr>
-            <w:tcW w:w="2709" w:type="dxa"/>
-          </w:tcPr>
-          <w:p>
-            <w:pPr>
-              <w:spacing w:before="0" w:line="240" w:lineRule="auto"/>
-              <w:rPr>
-                <w:sz w:val="24"/>
-                <w:szCs w:val="24"/>
-              </w:rPr>
-            </w:pPr>
-            <w:r>
-              <w:rPr>
-                <w:b/>
-                <w:bCs/>
-                <w:sz w:val="24"/>
-                <w:szCs w:val="24"/>
-              </w:rPr>
-              <w:t>Hậu điều kiện</w:t>
-            </w:r>
-          </w:p>
-        </w:tc>
-        <w:tc>
-          <w:tcPr>
-            <w:tcW w:w="6651" w:type="dxa"/>
-          </w:tcPr>
-          <w:p>
-            <w:pPr>
-              <w:spacing w:before="0" w:line="240" w:lineRule="auto"/>
-              <w:rPr>
-                <w:sz w:val="24"/>
-                <w:szCs w:val="24"/>
-              </w:rPr>
-            </w:pPr>
-            <w:r>
-              <w:rPr>
-                <w:sz w:val="24"/>
-                <w:szCs w:val="24"/>
-              </w:rPr>
-              <w:t>Ngân sách được lưu và bắt đầu theo dõi trong kỳ hiện tại</w:t>
-            </w:r>
-          </w:p>
-        </w:tc>
-      </w:tr>
-      <w:tr>
-        <w:tc>
-          <w:tcPr>
-            <w:tcW w:w="2709" w:type="dxa"/>
-          </w:tcPr>
-          <w:p>
-            <w:pPr>
-              <w:spacing w:before="0" w:line="240" w:lineRule="auto"/>
-              <w:rPr>
-                <w:sz w:val="24"/>
-                <w:szCs w:val="24"/>
-              </w:rPr>
-            </w:pPr>
-            <w:r>
-              <w:rPr>
-                <w:b/>
-                <w:bCs/>
-                <w:sz w:val="24"/>
-                <w:szCs w:val="24"/>
-              </w:rPr>
-              <w:t>Luồng hoạt động chính</w:t>
-            </w:r>
-          </w:p>
-        </w:tc>
-        <w:tc>
-          <w:tcPr>
-            <w:tcW w:w="6651" w:type="dxa"/>
-          </w:tcPr>
-          <w:p>
-            <w:pPr>
-              <w:spacing w:before="0" w:line="240" w:lineRule="auto"/>
-              <w:rPr>
-                <w:sz w:val="24"/>
-                <w:szCs w:val="24"/>
-              </w:rPr>
-            </w:pPr>
-            <w:r>
-              <w:rPr>
-                <w:b/>
-                <w:bCs/>
-                <w:sz w:val="24"/>
-                <w:szCs w:val="24"/>
-              </w:rPr>
-              <w:t>B1:</w:t>
-            </w:r>
-            <w:r>
-              <w:rPr>
-                <w:sz w:val="24"/>
-                <w:szCs w:val="24"/>
-              </w:rPr>
-              <w:t xml:space="preserve"> Người dùng chọn danh mục và nhập hạn mức, kỳ áp dụng</w:t>
-            </w:r>
-          </w:p>
-          <w:p>
-            <w:pPr>
-              <w:spacing w:before="0" w:line="240" w:lineRule="auto"/>
-              <w:rPr>
-                <w:sz w:val="24"/>
-                <w:szCs w:val="24"/>
-              </w:rPr>
-            </w:pPr>
-            <w:r>
-              <w:rPr>
-                <w:b/>
-                <w:bCs/>
-                <w:sz w:val="24"/>
-                <w:szCs w:val="24"/>
-              </w:rPr>
-              <w:t>B2:</w:t>
-            </w:r>
-            <w:r>
-              <w:rPr>
-                <w:sz w:val="24"/>
-                <w:szCs w:val="24"/>
-              </w:rPr>
-              <w:t xml:space="preserve"> Hệ thống lưu ngân sách và bắt đầu đối chiếu chi tiêu thực tế</w:t>
-            </w:r>
-          </w:p>
-          <w:p>
-            <w:pPr>
-              <w:spacing w:before="0" w:line="240" w:lineRule="auto"/>
-              <w:rPr>
-                <w:sz w:val="24"/>
-                <w:szCs w:val="24"/>
-              </w:rPr>
-            </w:pPr>
-            <w:r>
-              <w:rPr>
-                <w:b/>
-                <w:bCs/>
-                <w:sz w:val="24"/>
-                <w:szCs w:val="24"/>
-              </w:rPr>
-              <w:t>B3:</w:t>
-            </w:r>
-            <w:r>
-              <w:rPr>
-                <w:sz w:val="24"/>
-                <w:szCs w:val="24"/>
-              </w:rPr>
-              <w:t xml:space="preserve"> Kết thúc</w:t>
-            </w:r>
-          </w:p>
-        </w:tc>
-      </w:tr>
-      <w:tr>
-        <w:tc>
-          <w:tcPr>
-            <w:tcW w:w="2709" w:type="dxa"/>
-          </w:tcPr>
-          <w:p>
-            <w:pPr>
-              <w:spacing w:before="0" w:line="240" w:lineRule="auto"/>
-              <w:rPr>
-                <w:sz w:val="24"/>
-                <w:szCs w:val="24"/>
-              </w:rPr>
-            </w:pPr>
-            <w:r>
-              <w:rPr>
-                <w:b/>
-                <w:bCs/>
-                <w:sz w:val="24"/>
-                <w:szCs w:val="24"/>
-              </w:rPr>
-              <w:t>Luồng thay thế</w:t>
-            </w:r>
-          </w:p>
-        </w:tc>
-        <w:tc>
-          <w:tcPr>
-            <w:tcW w:w="6651" w:type="dxa"/>
-          </w:tcPr>
-          <w:p>
-            <w:pPr>
-              <w:spacing w:before="0" w:line="240" w:lineRule="auto"/>
-              <w:rPr>
-                <w:sz w:val="24"/>
-                <w:szCs w:val="24"/>
-              </w:rPr>
-            </w:pPr>
-            <w:r>
-              <w:rPr>
-                <w:sz w:val="24"/>
-                <w:szCs w:val="24"/>
-              </w:rPr>
-              <w:t>Khi chi tiêu đạt ngưỡng cảnh báo → Cảnh báo vượt ngân sách: hệ thống gửi thông báo qua Hệ thống thông báo (email)</w:t>
-            </w:r>
-          </w:p>
-        </w:tc>
-      </w:tr>
-      <w:tr>
-        <w:tc>
-          <w:tcPr>
-            <w:tcW w:w="2709" w:type="dxa"/>
-          </w:tcPr>
-          <w:p>
-            <w:pPr>
-              <w:spacing w:before="0" w:line="240" w:lineRule="auto"/>
-              <w:rPr>
-                <w:sz w:val="24"/>
-                <w:szCs w:val="24"/>
-              </w:rPr>
-            </w:pPr>
-            <w:r>
-              <w:rPr>
-                <w:b/>
-                <w:bCs/>
-                <w:sz w:val="24"/>
-                <w:szCs w:val="24"/>
-              </w:rPr>
-              <w:t>Luồng ngoại lệ</w:t>
-            </w:r>
-          </w:p>
-        </w:tc>
-        <w:tc>
-          <w:tcPr>
-            <w:tcW w:w="6651" w:type="dxa"/>
-          </w:tcPr>
-          <w:p>
-            <w:pPr>
-              <w:spacing w:before="0" w:line="240" w:lineRule="auto"/>
-              <w:rPr>
-                <w:sz w:val="24"/>
-                <w:szCs w:val="24"/>
-              </w:rPr>
-            </w:pPr>
-            <w:r>
-              <w:rPr>
-                <w:sz w:val="24"/>
-                <w:szCs w:val="24"/>
-              </w:rPr>
-              <w:t>Nếu hạn mức nhập không hợp lệ (≤0), thông báo lỗi và yêu cầu nhập lại</w:t>
-            </w:r>
-          </w:p>
-        </w:tc>
-      </w:tr>
-    </w:tbl>
-    <w:p>
-      <w:pPr>
-        <w:pStyle w:val="Caption"/>
-        <w:jc w:val="center"/>
-        <w:rPr>
-          <w:color w:val="auto"/>
-          <w:sz w:val="26"/>
-          <w:szCs w:val="26"/>
-        </w:rPr>
-      </w:pPr>
-      <w:bookmarkStart w:id="49" w:name="_Toc236173652"/>
-      <w:r>
-        <w:rPr>
-          <w:color w:val="auto"/>
-          <w:sz w:val="26"/>
-          <w:szCs w:val="26"/>
-        </w:rPr>
-        <w:t xml:space="preserve">Bảng </w:t>
-      </w:r>
-      <w:r>
-        <w:rPr>
-          <w:color w:val="auto"/>
-          <w:sz w:val="26"/>
-          <w:szCs w:val="26"/>
-        </w:rPr>
-        <w:fldChar w:fldCharType="begin"/>
-      </w:r>
-      <w:r>
-        <w:rPr>
-          <w:color w:val="auto"/>
-          <w:sz w:val="26"/>
-          <w:szCs w:val="26"/>
-        </w:rPr>
-        <w:instrText xml:space="preserve"> SEQ Bảng \* ARABIC </w:instrText>
-      </w:r>
-      <w:r>
-        <w:rPr>
-          <w:color w:val="auto"/>
-          <w:sz w:val="26"/>
-          <w:szCs w:val="26"/>
-        </w:rPr>
-        <w:fldChar w:fldCharType="separate"/>
-      </w:r>
-      <w:r>
-        <w:rPr>
-          <w:noProof/>
-          <w:color w:val="auto"/>
-          <w:sz w:val="26"/>
-          <w:szCs w:val="26"/>
-        </w:rPr>
-        <w:t>10</w:t>
-      </w:r>
-      <w:r>
-        <w:rPr>
-          <w:noProof/>
-          <w:color w:val="auto"/>
-          <w:sz w:val="26"/>
-          <w:szCs w:val="26"/>
-        </w:rPr>
-        <w:fldChar w:fldCharType="end"/>
-      </w:r>
-      <w:r>
-        <w:rPr>
-          <w:color w:val="auto"/>
-          <w:sz w:val="26"/>
-          <w:szCs w:val="26"/>
-        </w:rPr>
-        <w:t>. Đặc tả uc theo dõi chi tiêu</w:t>
-      </w:r>
-      <w:bookmarkEnd w:id="49"/>
-    </w:p>
-    <w:p>
-      <w:pPr>
-        <w:rPr>
-          <w:b/>
-          <w:bCs/>
-          <w:sz w:val="26"/>
-          <w:szCs w:val="26"/>
-        </w:rPr>
-      </w:pPr>
-      <w:r>
-        <w:rPr>
-          <w:b/>
-          <w:bCs/>
-          <w:sz w:val="26"/>
-          <w:szCs w:val="26"/>
-        </w:rPr>
-        <w:t>UC-06: Chia sẻ tài khoản</w:t>
       </w:r>
     </w:p>
     <w:tbl>
@@ -19406,12 +18865,15 @@
             <w:pPr>
               <w:spacing w:before="0" w:line="240" w:lineRule="auto"/>
               <w:rPr>
-                <w:sz w:val="24"/>
-                <w:szCs w:val="24"/>
-              </w:rPr>
-            </w:pPr>
-            <w:r>
-              <w:rPr>
+                <w:rFonts w:eastAsia="Times New Roman"/>
+                <w:sz w:val="24"/>
+                <w:szCs w:val="24"/>
+              </w:rPr>
+            </w:pPr>
+            <w:bookmarkStart w:id="49" w:name="_Toc236173652"/>
+            <w:r>
+              <w:rPr>
+                <w:rFonts w:eastAsia="Times New Roman"/>
                 <w:b/>
                 <w:bCs/>
                 <w:sz w:val="24"/>
@@ -19429,12 +18891,14 @@
             <w:pPr>
               <w:spacing w:before="0" w:line="240" w:lineRule="auto"/>
               <w:rPr>
-                <w:sz w:val="24"/>
-                <w:szCs w:val="24"/>
-              </w:rPr>
-            </w:pPr>
-            <w:r>
-              <w:rPr>
+                <w:rFonts w:eastAsia="Times New Roman"/>
+                <w:sz w:val="24"/>
+                <w:szCs w:val="24"/>
+              </w:rPr>
+            </w:pPr>
+            <w:r>
+              <w:rPr>
+                <w:rFonts w:eastAsia="Times New Roman"/>
                 <w:b/>
                 <w:bCs/>
                 <w:sz w:val="24"/>
@@ -19454,12 +18918,14 @@
             <w:pPr>
               <w:spacing w:before="0" w:line="240" w:lineRule="auto"/>
               <w:rPr>
-                <w:sz w:val="24"/>
-                <w:szCs w:val="24"/>
-              </w:rPr>
-            </w:pPr>
-            <w:r>
-              <w:rPr>
+                <w:rFonts w:eastAsia="Times New Roman"/>
+                <w:sz w:val="24"/>
+                <w:szCs w:val="24"/>
+              </w:rPr>
+            </w:pPr>
+            <w:r>
+              <w:rPr>
+                <w:rFonts w:eastAsia="Times New Roman"/>
                 <w:b/>
                 <w:bCs/>
                 <w:sz w:val="24"/>
@@ -19477,16 +18943,18 @@
             <w:pPr>
               <w:spacing w:before="0" w:line="240" w:lineRule="auto"/>
               <w:rPr>
-                <w:sz w:val="24"/>
-                <w:szCs w:val="24"/>
-              </w:rPr>
-            </w:pPr>
-            <w:r>
-              <w:rPr>
-                <w:sz w:val="24"/>
-                <w:szCs w:val="24"/>
-              </w:rPr>
-              <w:t>Cho phép chủ tài khoản mời thành viên gia đình cùng theo dõi chi tiêu chung.</w:t>
+                <w:rFonts w:eastAsia="Times New Roman"/>
+                <w:sz w:val="24"/>
+                <w:szCs w:val="24"/>
+              </w:rPr>
+            </w:pPr>
+            <w:r>
+              <w:rPr>
+                <w:rFonts w:eastAsia="Times New Roman"/>
+                <w:sz w:val="24"/>
+                <w:szCs w:val="24"/>
+              </w:rPr>
+              <w:t>Hiển thị biểu đồ, số liệu chi tiêu và nhận xét thói quen chi tiêu do AI phân tích.</w:t>
             </w:r>
           </w:p>
         </w:tc>
@@ -19500,12 +18968,14 @@
             <w:pPr>
               <w:spacing w:before="0" w:line="240" w:lineRule="auto"/>
               <w:rPr>
-                <w:sz w:val="24"/>
-                <w:szCs w:val="24"/>
-              </w:rPr>
-            </w:pPr>
-            <w:r>
-              <w:rPr>
+                <w:rFonts w:eastAsia="Times New Roman"/>
+                <w:sz w:val="24"/>
+                <w:szCs w:val="24"/>
+              </w:rPr>
+            </w:pPr>
+            <w:r>
+              <w:rPr>
+                <w:rFonts w:eastAsia="Times New Roman"/>
                 <w:b/>
                 <w:bCs/>
                 <w:sz w:val="24"/>
@@ -19523,12 +18993,14 @@
             <w:pPr>
               <w:spacing w:before="0" w:line="240" w:lineRule="auto"/>
               <w:rPr>
-                <w:sz w:val="24"/>
-                <w:szCs w:val="24"/>
-              </w:rPr>
-            </w:pPr>
-            <w:r>
-              <w:rPr>
+                <w:rFonts w:eastAsia="Times New Roman"/>
+                <w:sz w:val="24"/>
+                <w:szCs w:val="24"/>
+              </w:rPr>
+            </w:pPr>
+            <w:r>
+              <w:rPr>
+                <w:rFonts w:eastAsia="Times New Roman"/>
                 <w:sz w:val="24"/>
                 <w:szCs w:val="24"/>
               </w:rPr>
@@ -19546,12 +19018,14 @@
             <w:pPr>
               <w:spacing w:before="0" w:line="240" w:lineRule="auto"/>
               <w:rPr>
-                <w:sz w:val="24"/>
-                <w:szCs w:val="24"/>
-              </w:rPr>
-            </w:pPr>
-            <w:r>
-              <w:rPr>
+                <w:rFonts w:eastAsia="Times New Roman"/>
+                <w:sz w:val="24"/>
+                <w:szCs w:val="24"/>
+              </w:rPr>
+            </w:pPr>
+            <w:r>
+              <w:rPr>
+                <w:rFonts w:eastAsia="Times New Roman"/>
                 <w:b/>
                 <w:bCs/>
                 <w:sz w:val="24"/>
@@ -19569,16 +19043,18 @@
             <w:pPr>
               <w:spacing w:before="0" w:line="240" w:lineRule="auto"/>
               <w:rPr>
-                <w:sz w:val="24"/>
-                <w:szCs w:val="24"/>
-              </w:rPr>
-            </w:pPr>
-            <w:r>
-              <w:rPr>
-                <w:sz w:val="24"/>
-                <w:szCs w:val="24"/>
-              </w:rPr>
-              <w:t>Gia đình (thành viên được mời)</w:t>
+                <w:rFonts w:eastAsia="Times New Roman"/>
+                <w:sz w:val="24"/>
+                <w:szCs w:val="24"/>
+              </w:rPr>
+            </w:pPr>
+            <w:r>
+              <w:rPr>
+                <w:rFonts w:eastAsia="Times New Roman"/>
+                <w:sz w:val="24"/>
+                <w:szCs w:val="24"/>
+              </w:rPr>
+              <w:t>Hệ thống AI nhận xét</w:t>
             </w:r>
           </w:p>
         </w:tc>
@@ -19592,18 +19068,19 @@
             <w:pPr>
               <w:spacing w:before="0" w:line="240" w:lineRule="auto"/>
               <w:rPr>
-                <w:sz w:val="24"/>
-                <w:szCs w:val="24"/>
-              </w:rPr>
-            </w:pPr>
-            <w:r>
-              <w:rPr>
+                <w:rFonts w:eastAsia="Times New Roman"/>
+                <w:sz w:val="24"/>
+                <w:szCs w:val="24"/>
+              </w:rPr>
+            </w:pPr>
+            <w:r>
+              <w:rPr>
+                <w:rFonts w:eastAsia="Times New Roman"/>
                 <w:b/>
                 <w:bCs/>
                 <w:sz w:val="24"/>
                 <w:szCs w:val="24"/>
               </w:rPr>
-              <w:lastRenderedPageBreak/>
               <w:t>Tiền điều kiện</w:t>
             </w:r>
           </w:p>
@@ -19616,16 +19093,18 @@
             <w:pPr>
               <w:spacing w:before="0" w:line="240" w:lineRule="auto"/>
               <w:rPr>
-                <w:sz w:val="24"/>
-                <w:szCs w:val="24"/>
-              </w:rPr>
-            </w:pPr>
-            <w:r>
-              <w:rPr>
-                <w:sz w:val="24"/>
-                <w:szCs w:val="24"/>
-              </w:rPr>
-              <w:t>Người mời là chủ sở hữu tài khoản</w:t>
+                <w:rFonts w:eastAsia="Times New Roman"/>
+                <w:sz w:val="24"/>
+                <w:szCs w:val="24"/>
+              </w:rPr>
+            </w:pPr>
+            <w:r>
+              <w:rPr>
+                <w:rFonts w:eastAsia="Times New Roman"/>
+                <w:sz w:val="24"/>
+                <w:szCs w:val="24"/>
+              </w:rPr>
+              <w:t>Đã có dữ liệu giao dịch trong hệ thống</w:t>
             </w:r>
           </w:p>
         </w:tc>
@@ -19639,12 +19118,14 @@
             <w:pPr>
               <w:spacing w:before="0" w:line="240" w:lineRule="auto"/>
               <w:rPr>
-                <w:sz w:val="24"/>
-                <w:szCs w:val="24"/>
-              </w:rPr>
-            </w:pPr>
-            <w:r>
-              <w:rPr>
+                <w:rFonts w:eastAsia="Times New Roman"/>
+                <w:sz w:val="24"/>
+                <w:szCs w:val="24"/>
+              </w:rPr>
+            </w:pPr>
+            <w:r>
+              <w:rPr>
+                <w:rFonts w:eastAsia="Times New Roman"/>
                 <w:b/>
                 <w:bCs/>
                 <w:sz w:val="24"/>
@@ -19662,16 +19143,18 @@
             <w:pPr>
               <w:spacing w:before="0" w:line="240" w:lineRule="auto"/>
               <w:rPr>
-                <w:sz w:val="24"/>
-                <w:szCs w:val="24"/>
-              </w:rPr>
-            </w:pPr>
-            <w:r>
-              <w:rPr>
-                <w:sz w:val="24"/>
-                <w:szCs w:val="24"/>
-              </w:rPr>
-              <w:t>Thành viên được cấp quyền truy cập tài khoản theo vai trò đã chọn</w:t>
+                <w:rFonts w:eastAsia="Times New Roman"/>
+                <w:sz w:val="24"/>
+                <w:szCs w:val="24"/>
+              </w:rPr>
+            </w:pPr>
+            <w:r>
+              <w:rPr>
+                <w:rFonts w:eastAsia="Times New Roman"/>
+                <w:sz w:val="24"/>
+                <w:szCs w:val="24"/>
+              </w:rPr>
+              <w:t>Người dùng xem được xu hướng, cơ cấu chi tiêu và nhận xét từ AI</w:t>
             </w:r>
           </w:p>
         </w:tc>
@@ -19685,17 +19168,695 @@
             <w:pPr>
               <w:spacing w:before="0" w:line="240" w:lineRule="auto"/>
               <w:rPr>
-                <w:sz w:val="24"/>
-                <w:szCs w:val="24"/>
-              </w:rPr>
-            </w:pPr>
-            <w:r>
-              <w:rPr>
+                <w:rFonts w:eastAsia="Times New Roman"/>
+                <w:sz w:val="24"/>
+                <w:szCs w:val="24"/>
+              </w:rPr>
+            </w:pPr>
+            <w:r>
+              <w:rPr>
+                <w:rFonts w:eastAsia="Times New Roman"/>
                 <w:b/>
                 <w:bCs/>
                 <w:sz w:val="24"/>
                 <w:szCs w:val="24"/>
               </w:rPr>
+              <w:t>Luồng hoạt động chính</w:t>
+            </w:r>
+          </w:p>
+        </w:tc>
+        <w:tc>
+          <w:tcPr>
+            <w:tcW w:w="6849" w:type="dxa"/>
+          </w:tcPr>
+          <w:p>
+            <w:pPr>
+              <w:spacing w:before="0" w:line="240" w:lineRule="auto"/>
+              <w:rPr>
+                <w:rFonts w:eastAsia="Times New Roman"/>
+                <w:sz w:val="24"/>
+                <w:szCs w:val="24"/>
+              </w:rPr>
+            </w:pPr>
+            <w:r>
+              <w:rPr>
+                <w:rFonts w:eastAsia="Times New Roman"/>
+                <w:b/>
+                <w:bCs/>
+                <w:sz w:val="24"/>
+                <w:szCs w:val="24"/>
+              </w:rPr>
+              <w:t>B1:</w:t>
+            </w:r>
+            <w:r>
+              <w:rPr>
+                <w:rFonts w:eastAsia="Times New Roman"/>
+                <w:sz w:val="24"/>
+                <w:szCs w:val="24"/>
+              </w:rPr>
+              <w:t xml:space="preserve"> Người dùng chọn khoảng thời gian cần xem</w:t>
+            </w:r>
+          </w:p>
+          <w:p>
+            <w:pPr>
+              <w:spacing w:before="0" w:line="240" w:lineRule="auto"/>
+              <w:rPr>
+                <w:rFonts w:eastAsia="Times New Roman"/>
+                <w:sz w:val="24"/>
+                <w:szCs w:val="24"/>
+              </w:rPr>
+            </w:pPr>
+            <w:r>
+              <w:rPr>
+                <w:rFonts w:eastAsia="Times New Roman"/>
+                <w:b/>
+                <w:bCs/>
+                <w:sz w:val="24"/>
+                <w:szCs w:val="24"/>
+              </w:rPr>
+              <w:t>B2:</w:t>
+            </w:r>
+            <w:r>
+              <w:rPr>
+                <w:rFonts w:eastAsia="Times New Roman"/>
+                <w:sz w:val="24"/>
+                <w:szCs w:val="24"/>
+              </w:rPr>
+              <w:t xml:space="preserve"> Hệ thống tổng hợp dữ liệu giao dịch theo danh mục và thời gian</w:t>
+            </w:r>
+          </w:p>
+          <w:p>
+            <w:pPr>
+              <w:spacing w:before="0" w:line="240" w:lineRule="auto"/>
+              <w:rPr>
+                <w:rFonts w:eastAsia="Times New Roman"/>
+                <w:sz w:val="24"/>
+                <w:szCs w:val="24"/>
+              </w:rPr>
+            </w:pPr>
+            <w:r>
+              <w:rPr>
+                <w:rFonts w:eastAsia="Times New Roman"/>
+                <w:b/>
+                <w:bCs/>
+                <w:sz w:val="24"/>
+                <w:szCs w:val="24"/>
+              </w:rPr>
+              <w:t>B3:</w:t>
+            </w:r>
+            <w:r>
+              <w:rPr>
+                <w:rFonts w:eastAsia="Times New Roman"/>
+                <w:sz w:val="24"/>
+                <w:szCs w:val="24"/>
+              </w:rPr>
+              <w:t xml:space="preserve"> Hệ thống gửi dữ liệu tổng hợp (có thể cho hệ thống AI để sinh nhận xét)</w:t>
+            </w:r>
+          </w:p>
+          <w:p>
+            <w:pPr>
+              <w:spacing w:before="0" w:line="240" w:lineRule="auto"/>
+              <w:rPr>
+                <w:rFonts w:eastAsia="Times New Roman"/>
+                <w:sz w:val="24"/>
+                <w:szCs w:val="24"/>
+              </w:rPr>
+            </w:pPr>
+            <w:r>
+              <w:rPr>
+                <w:rFonts w:eastAsia="Times New Roman"/>
+                <w:b/>
+                <w:bCs/>
+                <w:sz w:val="24"/>
+                <w:szCs w:val="24"/>
+              </w:rPr>
+              <w:t>B4:</w:t>
+            </w:r>
+            <w:r>
+              <w:rPr>
+                <w:rFonts w:eastAsia="Times New Roman"/>
+                <w:sz w:val="24"/>
+                <w:szCs w:val="24"/>
+              </w:rPr>
+              <w:t xml:space="preserve"> Hệ thống hiển thị biểu đồ</w:t>
+            </w:r>
+          </w:p>
+          <w:p>
+            <w:pPr>
+              <w:spacing w:before="0" w:line="240" w:lineRule="auto"/>
+              <w:rPr>
+                <w:rFonts w:eastAsia="Times New Roman"/>
+                <w:sz w:val="24"/>
+                <w:szCs w:val="24"/>
+              </w:rPr>
+            </w:pPr>
+            <w:r>
+              <w:rPr>
+                <w:rFonts w:eastAsia="Times New Roman"/>
+                <w:b/>
+                <w:bCs/>
+                <w:sz w:val="24"/>
+                <w:szCs w:val="24"/>
+              </w:rPr>
+              <w:t>B5:</w:t>
+            </w:r>
+            <w:r>
+              <w:rPr>
+                <w:rFonts w:eastAsia="Times New Roman"/>
+                <w:sz w:val="24"/>
+                <w:szCs w:val="24"/>
+              </w:rPr>
+              <w:t xml:space="preserve"> Kết thúc</w:t>
+            </w:r>
+          </w:p>
+        </w:tc>
+      </w:tr>
+      <w:tr>
+        <w:tc>
+          <w:tcPr>
+            <w:tcW w:w="2511" w:type="dxa"/>
+          </w:tcPr>
+          <w:p>
+            <w:pPr>
+              <w:spacing w:before="0" w:line="240" w:lineRule="auto"/>
+              <w:rPr>
+                <w:rFonts w:eastAsia="Times New Roman"/>
+                <w:sz w:val="24"/>
+                <w:szCs w:val="24"/>
+              </w:rPr>
+            </w:pPr>
+            <w:r>
+              <w:rPr>
+                <w:rFonts w:eastAsia="Times New Roman"/>
+                <w:b/>
+                <w:bCs/>
+                <w:sz w:val="24"/>
+                <w:szCs w:val="24"/>
+              </w:rPr>
+              <w:t>Luồng thay thế</w:t>
+            </w:r>
+          </w:p>
+        </w:tc>
+        <w:tc>
+          <w:tcPr>
+            <w:tcW w:w="6849" w:type="dxa"/>
+          </w:tcPr>
+          <w:p>
+            <w:pPr>
+              <w:spacing w:before="0" w:line="240" w:lineRule="auto"/>
+              <w:rPr>
+                <w:rFonts w:eastAsia="Times New Roman"/>
+                <w:sz w:val="24"/>
+                <w:szCs w:val="24"/>
+              </w:rPr>
+            </w:pPr>
+            <w:r>
+              <w:rPr>
+                <w:rFonts w:eastAsia="Times New Roman"/>
+                <w:b/>
+                <w:bCs/>
+                <w:sz w:val="24"/>
+                <w:szCs w:val="24"/>
+              </w:rPr>
+              <w:t>B3.1:</w:t>
+            </w:r>
+            <w:r>
+              <w:rPr>
+                <w:rFonts w:eastAsia="Times New Roman"/>
+                <w:sz w:val="24"/>
+                <w:szCs w:val="24"/>
+              </w:rPr>
+              <w:t xml:space="preserve"> Nếu AI không phản hồi kịp thời, hiển thị biểu đồ mà không kèm nhận xét</w:t>
+            </w:r>
+          </w:p>
+        </w:tc>
+      </w:tr>
+      <w:tr>
+        <w:tc>
+          <w:tcPr>
+            <w:tcW w:w="2511" w:type="dxa"/>
+          </w:tcPr>
+          <w:p>
+            <w:pPr>
+              <w:spacing w:before="0" w:line="240" w:lineRule="auto"/>
+              <w:rPr>
+                <w:rFonts w:eastAsia="Times New Roman"/>
+                <w:sz w:val="24"/>
+                <w:szCs w:val="24"/>
+              </w:rPr>
+            </w:pPr>
+            <w:r>
+              <w:rPr>
+                <w:rFonts w:eastAsia="Times New Roman"/>
+                <w:b/>
+                <w:bCs/>
+                <w:sz w:val="24"/>
+                <w:szCs w:val="24"/>
+              </w:rPr>
+              <w:t>Luồng ngoại lệ</w:t>
+            </w:r>
+          </w:p>
+        </w:tc>
+        <w:tc>
+          <w:tcPr>
+            <w:tcW w:w="6849" w:type="dxa"/>
+          </w:tcPr>
+          <w:p>
+            <w:pPr>
+              <w:spacing w:before="0" w:line="240" w:lineRule="auto"/>
+              <w:rPr>
+                <w:rFonts w:eastAsia="Times New Roman"/>
+                <w:sz w:val="24"/>
+                <w:szCs w:val="24"/>
+              </w:rPr>
+            </w:pPr>
+            <w:r>
+              <w:rPr>
+                <w:rFonts w:eastAsia="Times New Roman"/>
+                <w:sz w:val="24"/>
+                <w:szCs w:val="24"/>
+              </w:rPr>
+              <w:t>Nếu không có dữ liệu trong kỳ đã chọn, thông báo "chưa có dữ liệu"</w:t>
+            </w:r>
+          </w:p>
+        </w:tc>
+      </w:tr>
+    </w:tbl>
+    <w:p>
+      <w:pPr>
+        <w:pStyle w:val="Caption"/>
+        <w:jc w:val="center"/>
+        <w:rPr>
+          <w:color w:val="auto"/>
+          <w:sz w:val="26"/>
+          <w:szCs w:val="26"/>
+        </w:rPr>
+      </w:pPr>
+      <w:r>
+        <w:rPr>
+          <w:color w:val="auto"/>
+          <w:sz w:val="26"/>
+          <w:szCs w:val="26"/>
+        </w:rPr>
+        <w:t xml:space="preserve">Bảng </w:t>
+      </w:r>
+      <w:r>
+        <w:rPr>
+          <w:color w:val="auto"/>
+          <w:sz w:val="26"/>
+          <w:szCs w:val="26"/>
+        </w:rPr>
+        <w:fldChar w:fldCharType="begin"/>
+      </w:r>
+      <w:r>
+        <w:rPr>
+          <w:color w:val="auto"/>
+          <w:sz w:val="26"/>
+          <w:szCs w:val="26"/>
+        </w:rPr>
+        <w:instrText xml:space="preserve"> SEQ Bảng \* ARABIC </w:instrText>
+      </w:r>
+      <w:r>
+        <w:rPr>
+          <w:color w:val="auto"/>
+          <w:sz w:val="26"/>
+          <w:szCs w:val="26"/>
+        </w:rPr>
+        <w:fldChar w:fldCharType="separate"/>
+      </w:r>
+      <w:r>
+        <w:rPr>
+          <w:noProof/>
+          <w:color w:val="auto"/>
+          <w:sz w:val="26"/>
+          <w:szCs w:val="26"/>
+        </w:rPr>
+        <w:t>10</w:t>
+      </w:r>
+      <w:r>
+        <w:rPr>
+          <w:noProof/>
+          <w:color w:val="auto"/>
+          <w:sz w:val="26"/>
+          <w:szCs w:val="26"/>
+        </w:rPr>
+        <w:fldChar w:fldCharType="end"/>
+      </w:r>
+      <w:r>
+        <w:rPr>
+          <w:color w:val="auto"/>
+          <w:sz w:val="26"/>
+          <w:szCs w:val="26"/>
+        </w:rPr>
+        <w:t>. Đặc tả uc theo dõi chi tiêu</w:t>
+      </w:r>
+      <w:bookmarkEnd w:id="49"/>
+    </w:p>
+    <w:p>
+      <w:pPr>
+        <w:rPr>
+          <w:b/>
+          <w:bCs/>
+          <w:sz w:val="26"/>
+          <w:szCs w:val="26"/>
+        </w:rPr>
+      </w:pPr>
+      <w:r>
+        <w:rPr>
+          <w:b/>
+          <w:bCs/>
+          <w:sz w:val="26"/>
+          <w:szCs w:val="26"/>
+        </w:rPr>
+        <w:t>UC-06: Chia sẻ tài khoản</w:t>
+      </w:r>
+    </w:p>
+    <w:tbl>
+      <w:tblPr>
+        <w:tblW w:w="5000" w:type="pct"/>
+        <w:tblBorders>
+          <w:top w:val="single" w:sz="4" w:space="0" w:color="auto"/>
+          <w:left w:val="single" w:sz="4" w:space="0" w:color="auto"/>
+          <w:bottom w:val="single" w:sz="4" w:space="0" w:color="auto"/>
+          <w:right w:val="single" w:sz="4" w:space="0" w:color="auto"/>
+          <w:insideH w:val="single" w:sz="4" w:space="0" w:color="auto"/>
+          <w:insideV w:val="single" w:sz="4" w:space="0" w:color="auto"/>
+        </w:tblBorders>
+        <w:tblLayout w:type="fixed"/>
+        <w:tblCellMar>
+          <w:top w:w="80" w:type="dxa"/>
+          <w:left w:w="120" w:type="dxa"/>
+          <w:bottom w:w="80" w:type="dxa"/>
+          <w:right w:w="120" w:type="dxa"/>
+        </w:tblCellMar>
+        <w:tblLook w:val="04A0" w:firstRow="1" w:lastRow="0" w:firstColumn="1" w:lastColumn="0" w:noHBand="0" w:noVBand="1"/>
+      </w:tblPr>
+      <w:tblGrid>
+        <w:gridCol w:w="2350"/>
+        <w:gridCol w:w="6377"/>
+      </w:tblGrid>
+      <w:tr>
+        <w:trPr>
+          <w:tblHeader/>
+        </w:trPr>
+        <w:tc>
+          <w:tcPr>
+            <w:tcW w:w="2511" w:type="dxa"/>
+          </w:tcPr>
+          <w:p>
+            <w:pPr>
+              <w:spacing w:before="0" w:line="240" w:lineRule="auto"/>
+              <w:rPr>
+                <w:sz w:val="24"/>
+                <w:szCs w:val="24"/>
+              </w:rPr>
+            </w:pPr>
+            <w:r>
+              <w:rPr>
+                <w:b/>
+                <w:bCs/>
+                <w:sz w:val="24"/>
+                <w:szCs w:val="24"/>
+              </w:rPr>
+              <w:t>Mục</w:t>
+            </w:r>
+          </w:p>
+        </w:tc>
+        <w:tc>
+          <w:tcPr>
+            <w:tcW w:w="6849" w:type="dxa"/>
+          </w:tcPr>
+          <w:p>
+            <w:pPr>
+              <w:spacing w:before="0" w:line="240" w:lineRule="auto"/>
+              <w:rPr>
+                <w:sz w:val="24"/>
+                <w:szCs w:val="24"/>
+              </w:rPr>
+            </w:pPr>
+            <w:r>
+              <w:rPr>
+                <w:b/>
+                <w:bCs/>
+                <w:sz w:val="24"/>
+                <w:szCs w:val="24"/>
+              </w:rPr>
+              <w:t>Nội dung</w:t>
+            </w:r>
+          </w:p>
+        </w:tc>
+      </w:tr>
+      <w:tr>
+        <w:tc>
+          <w:tcPr>
+            <w:tcW w:w="2511" w:type="dxa"/>
+          </w:tcPr>
+          <w:p>
+            <w:pPr>
+              <w:spacing w:before="0" w:line="240" w:lineRule="auto"/>
+              <w:rPr>
+                <w:sz w:val="24"/>
+                <w:szCs w:val="24"/>
+              </w:rPr>
+            </w:pPr>
+            <w:r>
+              <w:rPr>
+                <w:b/>
+                <w:bCs/>
+                <w:sz w:val="24"/>
+                <w:szCs w:val="24"/>
+              </w:rPr>
+              <w:t>Mô tả</w:t>
+            </w:r>
+          </w:p>
+        </w:tc>
+        <w:tc>
+          <w:tcPr>
+            <w:tcW w:w="6849" w:type="dxa"/>
+          </w:tcPr>
+          <w:p>
+            <w:pPr>
+              <w:spacing w:before="0" w:line="240" w:lineRule="auto"/>
+              <w:rPr>
+                <w:sz w:val="24"/>
+                <w:szCs w:val="24"/>
+              </w:rPr>
+            </w:pPr>
+            <w:r>
+              <w:rPr>
+                <w:sz w:val="24"/>
+                <w:szCs w:val="24"/>
+              </w:rPr>
+              <w:t>Cho phép chủ tài khoản mời thành viên gia đình cùng theo dõi chi tiêu chung.</w:t>
+            </w:r>
+          </w:p>
+        </w:tc>
+      </w:tr>
+      <w:tr>
+        <w:tc>
+          <w:tcPr>
+            <w:tcW w:w="2511" w:type="dxa"/>
+          </w:tcPr>
+          <w:p>
+            <w:pPr>
+              <w:spacing w:before="0" w:line="240" w:lineRule="auto"/>
+              <w:rPr>
+                <w:sz w:val="24"/>
+                <w:szCs w:val="24"/>
+              </w:rPr>
+            </w:pPr>
+            <w:r>
+              <w:rPr>
+                <w:b/>
+                <w:bCs/>
+                <w:sz w:val="24"/>
+                <w:szCs w:val="24"/>
+              </w:rPr>
+              <w:t>Actor chính</w:t>
+            </w:r>
+          </w:p>
+        </w:tc>
+        <w:tc>
+          <w:tcPr>
+            <w:tcW w:w="6849" w:type="dxa"/>
+          </w:tcPr>
+          <w:p>
+            <w:pPr>
+              <w:spacing w:before="0" w:line="240" w:lineRule="auto"/>
+              <w:rPr>
+                <w:sz w:val="24"/>
+                <w:szCs w:val="24"/>
+              </w:rPr>
+            </w:pPr>
+            <w:r>
+              <w:rPr>
+                <w:sz w:val="24"/>
+                <w:szCs w:val="24"/>
+              </w:rPr>
+              <w:t>Cá nhân</w:t>
+            </w:r>
+          </w:p>
+        </w:tc>
+      </w:tr>
+      <w:tr>
+        <w:tc>
+          <w:tcPr>
+            <w:tcW w:w="2511" w:type="dxa"/>
+          </w:tcPr>
+          <w:p>
+            <w:pPr>
+              <w:spacing w:before="0" w:line="240" w:lineRule="auto"/>
+              <w:rPr>
+                <w:sz w:val="24"/>
+                <w:szCs w:val="24"/>
+              </w:rPr>
+            </w:pPr>
+            <w:r>
+              <w:rPr>
+                <w:b/>
+                <w:bCs/>
+                <w:sz w:val="24"/>
+                <w:szCs w:val="24"/>
+              </w:rPr>
+              <w:t>Actor phụ</w:t>
+            </w:r>
+          </w:p>
+        </w:tc>
+        <w:tc>
+          <w:tcPr>
+            <w:tcW w:w="6849" w:type="dxa"/>
+          </w:tcPr>
+          <w:p>
+            <w:pPr>
+              <w:spacing w:before="0" w:line="240" w:lineRule="auto"/>
+              <w:rPr>
+                <w:sz w:val="24"/>
+                <w:szCs w:val="24"/>
+              </w:rPr>
+            </w:pPr>
+            <w:r>
+              <w:rPr>
+                <w:sz w:val="24"/>
+                <w:szCs w:val="24"/>
+              </w:rPr>
+              <w:t>Gia đình (thành viên được mời)</w:t>
+            </w:r>
+          </w:p>
+        </w:tc>
+      </w:tr>
+      <w:tr>
+        <w:tc>
+          <w:tcPr>
+            <w:tcW w:w="2511" w:type="dxa"/>
+          </w:tcPr>
+          <w:p>
+            <w:pPr>
+              <w:spacing w:before="0" w:line="240" w:lineRule="auto"/>
+              <w:rPr>
+                <w:sz w:val="24"/>
+                <w:szCs w:val="24"/>
+              </w:rPr>
+            </w:pPr>
+            <w:r>
+              <w:rPr>
+                <w:b/>
+                <w:bCs/>
+                <w:sz w:val="24"/>
+                <w:szCs w:val="24"/>
+              </w:rPr>
+              <w:t>Tiền điều kiện</w:t>
+            </w:r>
+          </w:p>
+        </w:tc>
+        <w:tc>
+          <w:tcPr>
+            <w:tcW w:w="6849" w:type="dxa"/>
+          </w:tcPr>
+          <w:p>
+            <w:pPr>
+              <w:spacing w:before="0" w:line="240" w:lineRule="auto"/>
+              <w:rPr>
+                <w:sz w:val="24"/>
+                <w:szCs w:val="24"/>
+              </w:rPr>
+            </w:pPr>
+            <w:r>
+              <w:rPr>
+                <w:sz w:val="24"/>
+                <w:szCs w:val="24"/>
+              </w:rPr>
+              <w:t>Người mời là chủ sở hữu tài khoản</w:t>
+            </w:r>
+          </w:p>
+        </w:tc>
+      </w:tr>
+      <w:tr>
+        <w:tc>
+          <w:tcPr>
+            <w:tcW w:w="2511" w:type="dxa"/>
+          </w:tcPr>
+          <w:p>
+            <w:pPr>
+              <w:spacing w:before="0" w:line="240" w:lineRule="auto"/>
+              <w:rPr>
+                <w:sz w:val="24"/>
+                <w:szCs w:val="24"/>
+              </w:rPr>
+            </w:pPr>
+            <w:r>
+              <w:rPr>
+                <w:b/>
+                <w:bCs/>
+                <w:sz w:val="24"/>
+                <w:szCs w:val="24"/>
+              </w:rPr>
+              <w:t>Hậu điều kiện</w:t>
+            </w:r>
+          </w:p>
+        </w:tc>
+        <w:tc>
+          <w:tcPr>
+            <w:tcW w:w="6849" w:type="dxa"/>
+          </w:tcPr>
+          <w:p>
+            <w:pPr>
+              <w:spacing w:before="0" w:line="240" w:lineRule="auto"/>
+              <w:rPr>
+                <w:sz w:val="24"/>
+                <w:szCs w:val="24"/>
+              </w:rPr>
+            </w:pPr>
+            <w:r>
+              <w:rPr>
+                <w:sz w:val="24"/>
+                <w:szCs w:val="24"/>
+              </w:rPr>
+              <w:t>Thành viên được cấp quyền truy cập tài khoản theo vai trò đã chọn</w:t>
+            </w:r>
+          </w:p>
+        </w:tc>
+      </w:tr>
+      <w:tr>
+        <w:tc>
+          <w:tcPr>
+            <w:tcW w:w="2511" w:type="dxa"/>
+          </w:tcPr>
+          <w:p>
+            <w:pPr>
+              <w:spacing w:before="0" w:line="240" w:lineRule="auto"/>
+              <w:rPr>
+                <w:sz w:val="24"/>
+                <w:szCs w:val="24"/>
+              </w:rPr>
+            </w:pPr>
+            <w:r>
+              <w:rPr>
+                <w:b/>
+                <w:bCs/>
+                <w:sz w:val="24"/>
+                <w:szCs w:val="24"/>
+              </w:rPr>
+              <w:lastRenderedPageBreak/>
               <w:t>Luồng hoạt động chính</w:t>
             </w:r>
           </w:p>
@@ -25333,7 +25494,7 @@
         <w:lastRenderedPageBreak/>
         <w:t>TÀI LIỆU THAM KHẢO</w:t>
       </w:r>
-      <w:bookmarkEnd w:id="29"/>
+      <w:bookmarkEnd w:id="30"/>
       <w:bookmarkEnd w:id="70"/>
     </w:p>
     <w:p>

</xml_diff>

<commit_message>
edit section 5 and 6
</commit_message>
<xml_diff>
--- a/docs/baocao/baocao.docx
+++ b/docs/baocao/baocao.docx
@@ -18923,16 +18923,29 @@
       <w:pPr>
         <w:pStyle w:val="Heading3"/>
         <w:rPr>
+          <w:b/>
+          <w:bCs/>
+          <w:color w:val="auto"/>
           <w:sz w:val="26"/>
           <w:szCs w:val="26"/>
         </w:rPr>
       </w:pPr>
       <w:bookmarkStart w:id="62" w:name="_Toc236173483"/>
       <w:r>
+        <w:rPr>
+          <w:b/>
+          <w:bCs/>
+          <w:color w:val="auto"/>
+          <w:sz w:val="26"/>
+          <w:szCs w:val="26"/>
+        </w:rPr>
         <w:t xml:space="preserve">3.2.6. </w:t>
       </w:r>
       <w:r>
         <w:rPr>
+          <w:b/>
+          <w:bCs/>
+          <w:color w:val="auto"/>
           <w:sz w:val="26"/>
           <w:szCs w:val="26"/>
         </w:rPr>
@@ -18941,6 +18954,9 @@
       <w:bookmarkEnd w:id="62"/>
       <w:r>
         <w:rPr>
+          <w:b/>
+          <w:bCs/>
+          <w:color w:val="auto"/>
           <w:sz w:val="26"/>
           <w:szCs w:val="26"/>
         </w:rPr>
@@ -18948,6 +18964,9 @@
       </w:r>
       <w:r>
         <w:rPr>
+          <w:b/>
+          <w:bCs/>
+          <w:color w:val="auto"/>
           <w:sz w:val="26"/>
           <w:szCs w:val="26"/>
         </w:rPr>
@@ -18989,9 +19008,9 @@
         </w:rPr>
         <w:lastRenderedPageBreak/>
         <w:drawing>
-          <wp:inline distT="0" distB="0" distL="0" distR="0" wp14:anchorId="1553AD76" wp14:editId="48A02F5F">
-            <wp:extent cx="5158501" cy="5458265"/>
-            <wp:effectExtent l="0" t="0" r="4445" b="9525"/>
+          <wp:inline distT="0" distB="0" distL="0" distR="0" wp14:anchorId="1553AD76" wp14:editId="6DB5BFDD">
+            <wp:extent cx="4545956" cy="4810125"/>
+            <wp:effectExtent l="0" t="0" r="7620" b="0"/>
             <wp:docPr id="10" name="Picture 10"/>
             <wp:cNvGraphicFramePr>
               <a:graphicFrameLocks xmlns:a="http://schemas.openxmlformats.org/drawingml/2006/main" noChangeAspect="1"/>
@@ -19021,7 +19040,7 @@
                   <pic:spPr bwMode="auto">
                     <a:xfrm>
                       <a:off x="0" y="0"/>
-                      <a:ext cx="5165825" cy="5466015"/>
+                      <a:ext cx="4554134" cy="4818778"/>
                     </a:xfrm>
                     <a:prstGeom prst="rect">
                       <a:avLst/>
@@ -19984,12 +20003,16 @@
       <w:pPr>
         <w:keepNext/>
         <w:rPr>
-          <w:sz w:val="26"/>
-          <w:szCs w:val="26"/>
-        </w:rPr>
-      </w:pPr>
-      <w:r>
-        <w:rPr>
+          <w:b/>
+          <w:bCs/>
+          <w:sz w:val="26"/>
+          <w:szCs w:val="26"/>
+        </w:rPr>
+      </w:pPr>
+      <w:r>
+        <w:rPr>
+          <w:b/>
+          <w:bCs/>
           <w:sz w:val="26"/>
           <w:szCs w:val="26"/>
         </w:rPr>
@@ -22304,17 +22327,7 @@
           <w:sz w:val="26"/>
           <w:szCs w:val="26"/>
         </w:rPr>
-        <w:t xml:space="preserve">: </w:t>
-      </w:r>
-      <w:r>
-        <w:rPr>
-          <w:i w:val="0"/>
-          <w:iCs w:val="0"/>
-          <w:color w:val="auto"/>
-          <w:sz w:val="26"/>
-          <w:szCs w:val="26"/>
-        </w:rPr>
-        <w:t>Các công nghệ và phiên bản của backend</w:t>
+        <w:t>: Các công nghệ và phiên bản của backend</w:t>
       </w:r>
     </w:p>
     <w:p>
@@ -23052,14 +23065,7 @@
           <w:sz w:val="26"/>
           <w:szCs w:val="26"/>
         </w:rPr>
-        <w:t xml:space="preserve">: </w:t>
-      </w:r>
-      <w:r>
-        <w:rPr>
-          <w:sz w:val="26"/>
-          <w:szCs w:val="26"/>
-        </w:rPr>
-        <w:t>Cấu trúc thư mục của mã nguồn</w:t>
+        <w:t>: Cấu trúc thư mục của mã nguồn</w:t>
       </w:r>
     </w:p>
     <w:p>
@@ -25476,17 +25482,7 @@
           <w:sz w:val="26"/>
           <w:szCs w:val="26"/>
         </w:rPr>
-        <w:t xml:space="preserve">: </w:t>
-      </w:r>
-      <w:r>
-        <w:rPr>
-          <w:i w:val="0"/>
-          <w:iCs w:val="0"/>
-          <w:color w:val="auto"/>
-          <w:sz w:val="26"/>
-          <w:szCs w:val="26"/>
-        </w:rPr>
-        <w:t>Bảng đối chiếu giữa thực thể trong ERD và bảng dữ liệu thật</w:t>
+        <w:t>: Bảng đối chiếu giữa thực thể trong ERD và bảng dữ liệu thật</w:t>
       </w:r>
     </w:p>
     <w:p>
@@ -25596,21 +25592,7 @@
           <w:sz w:val="26"/>
           <w:szCs w:val="26"/>
         </w:rPr>
-        <w:t xml:space="preserve"> </w:t>
-      </w:r>
-      <w:r>
-        <w:rPr>
-          <w:sz w:val="26"/>
-          <w:szCs w:val="26"/>
-        </w:rPr>
-        <w:t>(quản lý các giao dịch và ví),</w:t>
-      </w:r>
-      <w:r>
-        <w:rPr>
-          <w:sz w:val="26"/>
-          <w:szCs w:val="26"/>
-        </w:rPr>
-        <w:t>, đồng thời tuân thủ nghiêm ngặt quy tắc nghiệm vụ BR-02(mọi thay đổi số dư phải thông qua giao dịch),</w:t>
+        <w:t xml:space="preserve"> (quản lý các giao dịch và ví),, đồng thời tuân thủ nghiêm ngặt quy tắc nghiệm vụ BR-02(mọi thay đổi số dư phải thông qua giao dịch),</w:t>
       </w:r>
       <w:r>
         <w:rPr>
@@ -25891,6 +25873,7 @@
       </w:pPr>
       <w:r>
         <w:rPr>
+          <w:noProof/>
           <w:sz w:val="26"/>
           <w:szCs w:val="26"/>
         </w:rPr>
@@ -26300,6 +26283,7 @@
       </w:pPr>
       <w:r>
         <w:rPr>
+          <w:noProof/>
           <w:sz w:val="26"/>
           <w:szCs w:val="26"/>
         </w:rPr>
@@ -27095,6 +27079,7 @@
       </w:pPr>
       <w:r>
         <w:rPr>
+          <w:noProof/>
           <w:sz w:val="26"/>
           <w:szCs w:val="26"/>
         </w:rPr>
@@ -27417,6 +27402,7 @@
       </w:pPr>
       <w:r>
         <w:rPr>
+          <w:noProof/>
           <w:sz w:val="26"/>
           <w:szCs w:val="26"/>
         </w:rPr>
@@ -27627,6 +27613,7 @@
       </w:pPr>
       <w:r>
         <w:rPr>
+          <w:noProof/>
           <w:sz w:val="26"/>
           <w:szCs w:val="26"/>
         </w:rPr>
@@ -27973,6 +27960,7 @@
       </w:pPr>
       <w:r>
         <w:rPr>
+          <w:noProof/>
           <w:sz w:val="26"/>
           <w:szCs w:val="26"/>
         </w:rPr>
@@ -28119,12 +28107,16 @@
       <w:pPr>
         <w:spacing w:after="120"/>
         <w:rPr>
-          <w:sz w:val="26"/>
-          <w:szCs w:val="26"/>
-        </w:rPr>
-      </w:pPr>
-      <w:r>
-        <w:rPr>
+          <w:b/>
+          <w:bCs/>
+          <w:sz w:val="26"/>
+          <w:szCs w:val="26"/>
+        </w:rPr>
+      </w:pPr>
+      <w:r>
+        <w:rPr>
+          <w:b/>
+          <w:bCs/>
           <w:sz w:val="26"/>
           <w:szCs w:val="26"/>
         </w:rPr>
@@ -28682,7 +28674,11 @@
     <w:p>
       <w:pPr>
         <w:pStyle w:val="Heading1"/>
-        <w:rPr>
+        <w:jc w:val="center"/>
+        <w:rPr>
+          <w:b/>
+          <w:bCs/>
+          <w:color w:val="auto"/>
           <w:sz w:val="26"/>
           <w:szCs w:val="26"/>
         </w:rPr>
@@ -28690,15 +28686,64 @@
       <w:bookmarkStart w:id="66" w:name="_Toc236173487"/>
       <w:r>
         <w:rPr>
-          <w:sz w:val="26"/>
-          <w:szCs w:val="26"/>
-        </w:rPr>
-        <w:t>Chương 5. KIỂM THỬ &amp; ĐÁNH GIÁ</w:t>
+          <w:b/>
+          <w:bCs/>
+          <w:color w:val="auto"/>
+          <w:sz w:val="26"/>
+          <w:szCs w:val="26"/>
+        </w:rPr>
+        <w:t xml:space="preserve">Chương 5. KIỂM THỬ </w:t>
+      </w:r>
+      <w:r>
+        <w:rPr>
+          <w:b/>
+          <w:bCs/>
+          <w:color w:val="auto"/>
+          <w:sz w:val="26"/>
+          <w:szCs w:val="26"/>
+        </w:rPr>
+        <w:t>VÀ</w:t>
+      </w:r>
+      <w:r>
+        <w:rPr>
+          <w:b/>
+          <w:bCs/>
+          <w:color w:val="auto"/>
+          <w:sz w:val="26"/>
+          <w:szCs w:val="26"/>
+        </w:rPr>
+        <w:t xml:space="preserve"> ĐÁNH GIÁ</w:t>
       </w:r>
       <w:bookmarkEnd w:id="66"/>
     </w:p>
     <w:p>
       <w:pPr>
+        <w:pStyle w:val="Heading2"/>
+        <w:rPr>
+          <w:b/>
+          <w:bCs/>
+          <w:color w:val="auto"/>
+        </w:rPr>
+      </w:pPr>
+      <w:r>
+        <w:rPr>
+          <w:b/>
+          <w:bCs/>
+          <w:color w:val="auto"/>
+        </w:rPr>
+        <w:t xml:space="preserve">5.1. </w:t>
+      </w:r>
+      <w:r>
+        <w:rPr>
+          <w:b/>
+          <w:bCs/>
+          <w:color w:val="auto"/>
+        </w:rPr>
+        <w:t>Chiến lược kiểm thử</w:t>
+      </w:r>
+    </w:p>
+    <w:p>
+      <w:pPr>
         <w:spacing w:after="120"/>
         <w:rPr>
           <w:sz w:val="26"/>
@@ -28710,7 +28755,1535 @@
           <w:sz w:val="26"/>
           <w:szCs w:val="26"/>
         </w:rPr>
-        <w:t>5.1. Kịch bản kiểm thử</w:t>
+        <w:lastRenderedPageBreak/>
+        <w:t>Chiến lược kiểm thử của hệ thống tập trung vào việc đảm bảo tính chính xác của các chức năng tài chính và bảo mật dữ liệu. Phạm vi kiểm thử gồm ba mức chính:</w:t>
+      </w:r>
+    </w:p>
+    <w:p>
+      <w:pPr>
+        <w:spacing w:after="120"/>
+        <w:ind w:left="720"/>
+        <w:rPr>
+          <w:sz w:val="26"/>
+          <w:szCs w:val="26"/>
+        </w:rPr>
+      </w:pPr>
+      <w:r>
+        <w:rPr>
+          <w:sz w:val="26"/>
+          <w:szCs w:val="26"/>
+        </w:rPr>
+        <w:t>Kiểm thử mức đơn vị (Unit Test): Tập trung vào các hàm xử lý logic ở Backend như tính toán số dư ví, kiểm tra ngân sách và logic kết hợp giữa Rule-based và AI trong module ImportBatch.</w:t>
+      </w:r>
+    </w:p>
+    <w:p>
+      <w:pPr>
+        <w:spacing w:after="120"/>
+        <w:ind w:left="720"/>
+        <w:rPr>
+          <w:sz w:val="26"/>
+          <w:szCs w:val="26"/>
+        </w:rPr>
+      </w:pPr>
+      <w:r>
+        <w:rPr>
+          <w:sz w:val="26"/>
+          <w:szCs w:val="26"/>
+        </w:rPr>
+        <w:t>Kiểm thử tích hợp (Integration Test): Kiểm tra API trả về đúng dữ liệu, xử lý các mã lỗi (400, 401, 403, 404) và đảm bảo các Entity được ánh xạ đúng với cơ sở dữ liệu.</w:t>
+      </w:r>
+    </w:p>
+    <w:p>
+      <w:pPr>
+        <w:spacing w:after="120"/>
+        <w:ind w:left="720"/>
+        <w:rPr>
+          <w:sz w:val="26"/>
+          <w:szCs w:val="26"/>
+        </w:rPr>
+      </w:pPr>
+      <w:r>
+        <w:rPr>
+          <w:sz w:val="26"/>
+          <w:szCs w:val="26"/>
+        </w:rPr>
+        <w:t>Kiểm thử thủ công (Manual E2E Test): Thực hiện trên giao diện ReactJS để kiểm tra giao diện và xác nhận các luồng nghiệp vụ từ đầu đến cuối.</w:t>
+      </w:r>
+    </w:p>
+    <w:p>
+      <w:pPr>
+        <w:spacing w:after="120"/>
+        <w:rPr>
+          <w:sz w:val="26"/>
+          <w:szCs w:val="26"/>
+        </w:rPr>
+      </w:pPr>
+      <w:r>
+        <w:rPr>
+          <w:sz w:val="26"/>
+          <w:szCs w:val="26"/>
+        </w:rPr>
+        <w:t>Môi trường kiểm thử được triển khai ở hai môi trường: môi trường phát triển (Local DEV) sử dụng cơ sở dữ liệu H2 In-memory cho các bài kiểm thử và môi trường DEMO chạy trên Docker. Dữ liệu kiểm thử (Test Data) được tạo tự động thông qua lớp DataSeeder, bao gồm các tài khoản Admin và User cùng dữ liệu mẫu về giao dịch, ví và ngân sách.</w:t>
+      </w:r>
+    </w:p>
+    <w:p>
+      <w:pPr>
+        <w:spacing w:after="120"/>
+        <w:rPr>
+          <w:sz w:val="26"/>
+          <w:szCs w:val="26"/>
+        </w:rPr>
+      </w:pPr>
+      <w:r>
+        <w:rPr>
+          <w:sz w:val="26"/>
+          <w:szCs w:val="26"/>
+        </w:rPr>
+        <w:t>Tiêu chí hoàn thành kiểm thử (Exit Criteria) được xác định khi các quy tắc nghiệp vụ từ BR-01 đến BR-12 đều có test case tương ứng và chạy đạt (Pass), hệ thống ngăn chặn được các trường hợp truy cập trái phép giữa các User và quy trình CI (Continuous Integration) biên dịch thành công không phát sinh lỗi.</w:t>
+      </w:r>
+    </w:p>
+    <w:p>
+      <w:pPr>
+        <w:pStyle w:val="Heading2"/>
+        <w:rPr>
+          <w:b/>
+          <w:bCs/>
+          <w:color w:val="auto"/>
+        </w:rPr>
+      </w:pPr>
+      <w:r>
+        <w:rPr>
+          <w:b/>
+          <w:bCs/>
+          <w:color w:val="auto"/>
+        </w:rPr>
+        <w:t>5.2. Thiết kế testcase</w:t>
+      </w:r>
+    </w:p>
+    <w:p>
+      <w:pPr>
+        <w:spacing w:after="120"/>
+        <w:rPr>
+          <w:sz w:val="26"/>
+          <w:szCs w:val="26"/>
+        </w:rPr>
+      </w:pPr>
+      <w:r>
+        <w:rPr>
+          <w:sz w:val="26"/>
+          <w:szCs w:val="26"/>
+        </w:rPr>
+        <w:t>Bộ Test Case được thiết kế bao phủ các luồng cơ bản (Happy Path), các luồng vi phạm quy tắc nghiệp vụ và các luồng lỗi dữ liệu. Để đảm bảo tính súc tích cho báo cáo, Bảng 5.1 dưới đây trích lọc các Test Case quan trọng nhất (đặc biệt là các ca Âm - Negative Test và kiểm tra phân quyền). Danh sách đầy đủ toàn bộ hệ thống được đính kèm tại Phụ lục.</w:t>
+      </w:r>
+    </w:p>
+    <w:tbl>
+      <w:tblPr>
+        <w:tblW w:w="5000" w:type="pct"/>
+        <w:tblBorders>
+          <w:top w:val="single" w:sz="4" w:space="0" w:color="auto"/>
+          <w:left w:val="single" w:sz="4" w:space="0" w:color="auto"/>
+          <w:bottom w:val="single" w:sz="4" w:space="0" w:color="auto"/>
+          <w:right w:val="single" w:sz="4" w:space="0" w:color="auto"/>
+          <w:insideH w:val="single" w:sz="4" w:space="0" w:color="auto"/>
+          <w:insideV w:val="single" w:sz="4" w:space="0" w:color="auto"/>
+        </w:tblBorders>
+        <w:tblLayout w:type="fixed"/>
+        <w:tblCellMar>
+          <w:top w:w="80" w:type="dxa"/>
+          <w:left w:w="120" w:type="dxa"/>
+          <w:bottom w:w="80" w:type="dxa"/>
+          <w:right w:w="120" w:type="dxa"/>
+        </w:tblCellMar>
+        <w:tblLook w:val="0000" w:firstRow="0" w:lastRow="0" w:firstColumn="0" w:lastColumn="0" w:noHBand="0" w:noVBand="0"/>
+      </w:tblPr>
+      <w:tblGrid>
+        <w:gridCol w:w="840"/>
+        <w:gridCol w:w="1015"/>
+        <w:gridCol w:w="2127"/>
+        <w:gridCol w:w="1835"/>
+        <w:gridCol w:w="2069"/>
+        <w:gridCol w:w="841"/>
+      </w:tblGrid>
+      <w:tr>
+        <w:trPr>
+          <w:tblHeader/>
+        </w:trPr>
+        <w:tc>
+          <w:tcPr>
+            <w:tcW w:w="891" w:type="dxa"/>
+          </w:tcPr>
+          <w:p>
+            <w:pPr>
+              <w:spacing w:before="0" w:line="240" w:lineRule="auto"/>
+              <w:rPr>
+                <w:rFonts w:eastAsia="Times New Roman"/>
+                <w:sz w:val="24"/>
+                <w:szCs w:val="24"/>
+              </w:rPr>
+            </w:pPr>
+            <w:r>
+              <w:rPr>
+                <w:rFonts w:eastAsia="Times New Roman"/>
+                <w:b/>
+                <w:bCs/>
+                <w:sz w:val="24"/>
+                <w:szCs w:val="24"/>
+              </w:rPr>
+              <w:lastRenderedPageBreak/>
+              <w:t>Mã TC</w:t>
+            </w:r>
+          </w:p>
+        </w:tc>
+        <w:tc>
+          <w:tcPr>
+            <w:tcW w:w="1082" w:type="dxa"/>
+          </w:tcPr>
+          <w:p>
+            <w:pPr>
+              <w:spacing w:before="0" w:line="240" w:lineRule="auto"/>
+              <w:rPr>
+                <w:rFonts w:eastAsia="Times New Roman"/>
+                <w:sz w:val="24"/>
+                <w:szCs w:val="24"/>
+              </w:rPr>
+            </w:pPr>
+            <w:r>
+              <w:rPr>
+                <w:rFonts w:eastAsia="Times New Roman"/>
+                <w:b/>
+                <w:bCs/>
+                <w:sz w:val="24"/>
+                <w:szCs w:val="24"/>
+              </w:rPr>
+              <w:t>Chức năng</w:t>
+            </w:r>
+          </w:p>
+        </w:tc>
+        <w:tc>
+          <w:tcPr>
+            <w:tcW w:w="2292" w:type="dxa"/>
+          </w:tcPr>
+          <w:p>
+            <w:pPr>
+              <w:spacing w:before="0" w:line="240" w:lineRule="auto"/>
+              <w:rPr>
+                <w:rFonts w:eastAsia="Times New Roman"/>
+                <w:sz w:val="24"/>
+                <w:szCs w:val="24"/>
+              </w:rPr>
+            </w:pPr>
+            <w:r>
+              <w:rPr>
+                <w:rFonts w:eastAsia="Times New Roman"/>
+                <w:b/>
+                <w:bCs/>
+                <w:sz w:val="24"/>
+                <w:szCs w:val="24"/>
+              </w:rPr>
+              <w:t>Mục tiêu / Tiền điều kiện</w:t>
+            </w:r>
+          </w:p>
+        </w:tc>
+        <w:tc>
+          <w:tcPr>
+            <w:tcW w:w="1974" w:type="dxa"/>
+          </w:tcPr>
+          <w:p>
+            <w:pPr>
+              <w:spacing w:before="0" w:line="240" w:lineRule="auto"/>
+              <w:rPr>
+                <w:rFonts w:eastAsia="Times New Roman"/>
+                <w:sz w:val="24"/>
+                <w:szCs w:val="24"/>
+              </w:rPr>
+            </w:pPr>
+            <w:r>
+              <w:rPr>
+                <w:rFonts w:eastAsia="Times New Roman"/>
+                <w:b/>
+                <w:bCs/>
+                <w:sz w:val="24"/>
+                <w:szCs w:val="24"/>
+              </w:rPr>
+              <w:t>Dữ liệu đầu vào</w:t>
+            </w:r>
+          </w:p>
+        </w:tc>
+        <w:tc>
+          <w:tcPr>
+            <w:tcW w:w="2229" w:type="dxa"/>
+          </w:tcPr>
+          <w:p>
+            <w:pPr>
+              <w:spacing w:before="0" w:line="240" w:lineRule="auto"/>
+              <w:rPr>
+                <w:rFonts w:eastAsia="Times New Roman"/>
+                <w:sz w:val="24"/>
+                <w:szCs w:val="24"/>
+              </w:rPr>
+            </w:pPr>
+            <w:r>
+              <w:rPr>
+                <w:rFonts w:eastAsia="Times New Roman"/>
+                <w:b/>
+                <w:bCs/>
+                <w:sz w:val="24"/>
+                <w:szCs w:val="24"/>
+              </w:rPr>
+              <w:t>Kết quả mong đợi</w:t>
+            </w:r>
+          </w:p>
+        </w:tc>
+        <w:tc>
+          <w:tcPr>
+            <w:tcW w:w="892" w:type="dxa"/>
+          </w:tcPr>
+          <w:p>
+            <w:pPr>
+              <w:spacing w:before="0" w:line="240" w:lineRule="auto"/>
+              <w:rPr>
+                <w:rFonts w:eastAsia="Times New Roman"/>
+                <w:sz w:val="24"/>
+                <w:szCs w:val="24"/>
+              </w:rPr>
+            </w:pPr>
+            <w:r>
+              <w:rPr>
+                <w:rFonts w:eastAsia="Times New Roman"/>
+                <w:b/>
+                <w:bCs/>
+                <w:sz w:val="24"/>
+                <w:szCs w:val="24"/>
+              </w:rPr>
+              <w:t>Trạng thái</w:t>
+            </w:r>
+          </w:p>
+        </w:tc>
+      </w:tr>
+      <w:tr>
+        <w:tc>
+          <w:tcPr>
+            <w:tcW w:w="891" w:type="dxa"/>
+          </w:tcPr>
+          <w:p>
+            <w:pPr>
+              <w:spacing w:before="0" w:line="240" w:lineRule="auto"/>
+              <w:rPr>
+                <w:rFonts w:eastAsia="Times New Roman"/>
+                <w:sz w:val="24"/>
+                <w:szCs w:val="24"/>
+              </w:rPr>
+            </w:pPr>
+            <w:r>
+              <w:rPr>
+                <w:rFonts w:eastAsia="Times New Roman"/>
+                <w:sz w:val="24"/>
+                <w:szCs w:val="24"/>
+              </w:rPr>
+              <w:t>TC-TRAN-006</w:t>
+            </w:r>
+          </w:p>
+        </w:tc>
+        <w:tc>
+          <w:tcPr>
+            <w:tcW w:w="1082" w:type="dxa"/>
+          </w:tcPr>
+          <w:p>
+            <w:pPr>
+              <w:spacing w:before="0" w:line="240" w:lineRule="auto"/>
+              <w:rPr>
+                <w:rFonts w:eastAsia="Times New Roman"/>
+                <w:sz w:val="24"/>
+                <w:szCs w:val="24"/>
+              </w:rPr>
+            </w:pPr>
+            <w:r>
+              <w:rPr>
+                <w:rFonts w:eastAsia="Times New Roman"/>
+                <w:sz w:val="24"/>
+                <w:szCs w:val="24"/>
+              </w:rPr>
+              <w:t>Sửa giao dịch</w:t>
+            </w:r>
+          </w:p>
+        </w:tc>
+        <w:tc>
+          <w:tcPr>
+            <w:tcW w:w="2292" w:type="dxa"/>
+          </w:tcPr>
+          <w:p>
+            <w:pPr>
+              <w:spacing w:before="0" w:line="240" w:lineRule="auto"/>
+              <w:rPr>
+                <w:rFonts w:eastAsia="Times New Roman"/>
+                <w:sz w:val="24"/>
+                <w:szCs w:val="24"/>
+              </w:rPr>
+            </w:pPr>
+            <w:r>
+              <w:rPr>
+                <w:rFonts w:eastAsia="Times New Roman"/>
+                <w:sz w:val="24"/>
+                <w:szCs w:val="24"/>
+              </w:rPr>
+              <w:t>Chặn chỉnh sửa giao dịch nếu user chỉ có quyền VIEW trên ví chia sẻ</w:t>
+            </w:r>
+          </w:p>
+        </w:tc>
+        <w:tc>
+          <w:tcPr>
+            <w:tcW w:w="1974" w:type="dxa"/>
+          </w:tcPr>
+          <w:p>
+            <w:pPr>
+              <w:spacing w:before="0" w:line="240" w:lineRule="auto"/>
+              <w:rPr>
+                <w:rFonts w:eastAsia="Times New Roman"/>
+                <w:sz w:val="24"/>
+                <w:szCs w:val="24"/>
+              </w:rPr>
+            </w:pPr>
+            <w:r>
+              <w:rPr>
+                <w:rFonts w:eastAsia="Times New Roman"/>
+                <w:sz w:val="24"/>
+                <w:szCs w:val="24"/>
+              </w:rPr>
+              <w:t>ID giao dịch Y, amount: 70k</w:t>
+            </w:r>
+          </w:p>
+        </w:tc>
+        <w:tc>
+          <w:tcPr>
+            <w:tcW w:w="2229" w:type="dxa"/>
+          </w:tcPr>
+          <w:p>
+            <w:pPr>
+              <w:spacing w:before="0" w:line="240" w:lineRule="auto"/>
+              <w:rPr>
+                <w:rFonts w:eastAsia="Times New Roman"/>
+                <w:sz w:val="24"/>
+                <w:szCs w:val="24"/>
+              </w:rPr>
+            </w:pPr>
+            <w:r>
+              <w:rPr>
+                <w:rFonts w:eastAsia="Times New Roman"/>
+                <w:sz w:val="24"/>
+                <w:szCs w:val="24"/>
+              </w:rPr>
+              <w:t>HTTP 403; Trả về lỗi "Bạn không có quyền sửa..."</w:t>
+            </w:r>
+          </w:p>
+        </w:tc>
+        <w:tc>
+          <w:tcPr>
+            <w:tcW w:w="892" w:type="dxa"/>
+          </w:tcPr>
+          <w:p>
+            <w:pPr>
+              <w:spacing w:before="0" w:line="240" w:lineRule="auto"/>
+              <w:rPr>
+                <w:rFonts w:eastAsia="Times New Roman"/>
+                <w:sz w:val="24"/>
+                <w:szCs w:val="24"/>
+              </w:rPr>
+            </w:pPr>
+            <w:r>
+              <w:rPr>
+                <w:rFonts w:eastAsia="Times New Roman"/>
+                <w:sz w:val="24"/>
+                <w:szCs w:val="24"/>
+              </w:rPr>
+              <w:t>Pass</w:t>
+            </w:r>
+          </w:p>
+        </w:tc>
+      </w:tr>
+      <w:tr>
+        <w:tc>
+          <w:tcPr>
+            <w:tcW w:w="891" w:type="dxa"/>
+          </w:tcPr>
+          <w:p>
+            <w:pPr>
+              <w:spacing w:before="0" w:line="240" w:lineRule="auto"/>
+              <w:rPr>
+                <w:rFonts w:eastAsia="Times New Roman"/>
+                <w:sz w:val="24"/>
+                <w:szCs w:val="24"/>
+              </w:rPr>
+            </w:pPr>
+            <w:r>
+              <w:rPr>
+                <w:rFonts w:eastAsia="Times New Roman"/>
+                <w:sz w:val="24"/>
+                <w:szCs w:val="24"/>
+              </w:rPr>
+              <w:t>TC-TRAN-009</w:t>
+            </w:r>
+          </w:p>
+        </w:tc>
+        <w:tc>
+          <w:tcPr>
+            <w:tcW w:w="1082" w:type="dxa"/>
+          </w:tcPr>
+          <w:p>
+            <w:pPr>
+              <w:spacing w:before="0" w:line="240" w:lineRule="auto"/>
+              <w:rPr>
+                <w:rFonts w:eastAsia="Times New Roman"/>
+                <w:sz w:val="24"/>
+                <w:szCs w:val="24"/>
+              </w:rPr>
+            </w:pPr>
+            <w:r>
+              <w:rPr>
+                <w:rFonts w:eastAsia="Times New Roman"/>
+                <w:sz w:val="24"/>
+                <w:szCs w:val="24"/>
+              </w:rPr>
+              <w:t>Phân quyền</w:t>
+            </w:r>
+          </w:p>
+        </w:tc>
+        <w:tc>
+          <w:tcPr>
+            <w:tcW w:w="2292" w:type="dxa"/>
+          </w:tcPr>
+          <w:p>
+            <w:pPr>
+              <w:spacing w:before="0" w:line="240" w:lineRule="auto"/>
+              <w:rPr>
+                <w:rFonts w:eastAsia="Times New Roman"/>
+                <w:sz w:val="24"/>
+                <w:szCs w:val="24"/>
+              </w:rPr>
+            </w:pPr>
+            <w:r>
+              <w:rPr>
+                <w:rFonts w:eastAsia="Times New Roman"/>
+                <w:sz w:val="24"/>
+                <w:szCs w:val="24"/>
+              </w:rPr>
+              <w:t>Chặn xem/sửa/xóa giao dịch của user khác (Bảo mật IDOR)</w:t>
+            </w:r>
+          </w:p>
+        </w:tc>
+        <w:tc>
+          <w:tcPr>
+            <w:tcW w:w="1974" w:type="dxa"/>
+          </w:tcPr>
+          <w:p>
+            <w:pPr>
+              <w:spacing w:before="0" w:line="240" w:lineRule="auto"/>
+              <w:rPr>
+                <w:rFonts w:eastAsia="Times New Roman"/>
+                <w:sz w:val="24"/>
+                <w:szCs w:val="24"/>
+              </w:rPr>
+            </w:pPr>
+            <w:r>
+              <w:rPr>
+                <w:rFonts w:eastAsia="Times New Roman"/>
+                <w:sz w:val="24"/>
+                <w:szCs w:val="24"/>
+              </w:rPr>
+              <w:t>Hacker gọi API sửa ID giao dịch Z của Nạn nhân</w:t>
+            </w:r>
+          </w:p>
+        </w:tc>
+        <w:tc>
+          <w:tcPr>
+            <w:tcW w:w="2229" w:type="dxa"/>
+          </w:tcPr>
+          <w:p>
+            <w:pPr>
+              <w:spacing w:before="0" w:line="240" w:lineRule="auto"/>
+              <w:rPr>
+                <w:rFonts w:eastAsia="Times New Roman"/>
+                <w:sz w:val="24"/>
+                <w:szCs w:val="24"/>
+              </w:rPr>
+            </w:pPr>
+            <w:r>
+              <w:rPr>
+                <w:rFonts w:eastAsia="Times New Roman"/>
+                <w:sz w:val="24"/>
+                <w:szCs w:val="24"/>
+              </w:rPr>
+              <w:t>HTTP 403; Lỗi "Không tìm thấy giao dịch hoặc truy cập trái phép!"</w:t>
+            </w:r>
+          </w:p>
+        </w:tc>
+        <w:tc>
+          <w:tcPr>
+            <w:tcW w:w="892" w:type="dxa"/>
+          </w:tcPr>
+          <w:p>
+            <w:pPr>
+              <w:spacing w:before="0" w:line="240" w:lineRule="auto"/>
+              <w:rPr>
+                <w:rFonts w:eastAsia="Times New Roman"/>
+                <w:sz w:val="24"/>
+                <w:szCs w:val="24"/>
+              </w:rPr>
+            </w:pPr>
+            <w:r>
+              <w:rPr>
+                <w:rFonts w:eastAsia="Times New Roman"/>
+                <w:sz w:val="24"/>
+                <w:szCs w:val="24"/>
+              </w:rPr>
+              <w:t>Pass</w:t>
+            </w:r>
+          </w:p>
+        </w:tc>
+      </w:tr>
+      <w:tr>
+        <w:tc>
+          <w:tcPr>
+            <w:tcW w:w="891" w:type="dxa"/>
+          </w:tcPr>
+          <w:p>
+            <w:pPr>
+              <w:spacing w:before="0" w:line="240" w:lineRule="auto"/>
+              <w:rPr>
+                <w:rFonts w:eastAsia="Times New Roman"/>
+                <w:sz w:val="24"/>
+                <w:szCs w:val="24"/>
+              </w:rPr>
+            </w:pPr>
+            <w:r>
+              <w:rPr>
+                <w:rFonts w:eastAsia="Times New Roman"/>
+                <w:sz w:val="24"/>
+                <w:szCs w:val="24"/>
+              </w:rPr>
+              <w:t>TC-BUDG-005</w:t>
+            </w:r>
+          </w:p>
+        </w:tc>
+        <w:tc>
+          <w:tcPr>
+            <w:tcW w:w="1082" w:type="dxa"/>
+          </w:tcPr>
+          <w:p>
+            <w:pPr>
+              <w:spacing w:before="0" w:line="240" w:lineRule="auto"/>
+              <w:rPr>
+                <w:rFonts w:eastAsia="Times New Roman"/>
+                <w:sz w:val="24"/>
+                <w:szCs w:val="24"/>
+              </w:rPr>
+            </w:pPr>
+            <w:r>
+              <w:rPr>
+                <w:rFonts w:eastAsia="Times New Roman"/>
+                <w:sz w:val="24"/>
+                <w:szCs w:val="24"/>
+              </w:rPr>
+              <w:t>Cảnh báo</w:t>
+            </w:r>
+          </w:p>
+        </w:tc>
+        <w:tc>
+          <w:tcPr>
+            <w:tcW w:w="2292" w:type="dxa"/>
+          </w:tcPr>
+          <w:p>
+            <w:pPr>
+              <w:spacing w:before="0" w:line="240" w:lineRule="auto"/>
+              <w:rPr>
+                <w:rFonts w:eastAsia="Times New Roman"/>
+                <w:sz w:val="24"/>
+                <w:szCs w:val="24"/>
+              </w:rPr>
+            </w:pPr>
+            <w:r>
+              <w:rPr>
+                <w:rFonts w:eastAsia="Times New Roman"/>
+                <w:sz w:val="24"/>
+                <w:szCs w:val="24"/>
+              </w:rPr>
+              <w:t>Gửi cảnh báo khi chạm ngưỡng 80% và chặn spam thông báo nhiều lần</w:t>
+            </w:r>
+          </w:p>
+        </w:tc>
+        <w:tc>
+          <w:tcPr>
+            <w:tcW w:w="1974" w:type="dxa"/>
+          </w:tcPr>
+          <w:p>
+            <w:pPr>
+              <w:spacing w:before="0" w:line="240" w:lineRule="auto"/>
+              <w:rPr>
+                <w:rFonts w:eastAsia="Times New Roman"/>
+                <w:sz w:val="24"/>
+                <w:szCs w:val="24"/>
+              </w:rPr>
+            </w:pPr>
+            <w:r>
+              <w:rPr>
+                <w:rFonts w:eastAsia="Times New Roman"/>
+                <w:sz w:val="24"/>
+                <w:szCs w:val="24"/>
+              </w:rPr>
+              <w:t>Thêm giao dịch làm tổng chi &gt; 80% (Lần 1 và Lần 2)</w:t>
+            </w:r>
+          </w:p>
+        </w:tc>
+        <w:tc>
+          <w:tcPr>
+            <w:tcW w:w="2229" w:type="dxa"/>
+          </w:tcPr>
+          <w:p>
+            <w:pPr>
+              <w:spacing w:before="0" w:line="240" w:lineRule="auto"/>
+              <w:rPr>
+                <w:rFonts w:eastAsia="Times New Roman"/>
+                <w:sz w:val="24"/>
+                <w:szCs w:val="24"/>
+              </w:rPr>
+            </w:pPr>
+            <w:r>
+              <w:rPr>
+                <w:rFonts w:eastAsia="Times New Roman"/>
+                <w:sz w:val="24"/>
+                <w:szCs w:val="24"/>
+              </w:rPr>
+              <w:t>Lần 1: Gửi Email, cờ warningSent=true. Lần 2: Không gửi lại mail.</w:t>
+            </w:r>
+          </w:p>
+        </w:tc>
+        <w:tc>
+          <w:tcPr>
+            <w:tcW w:w="892" w:type="dxa"/>
+          </w:tcPr>
+          <w:p>
+            <w:pPr>
+              <w:spacing w:before="0" w:line="240" w:lineRule="auto"/>
+              <w:rPr>
+                <w:rFonts w:eastAsia="Times New Roman"/>
+                <w:sz w:val="24"/>
+                <w:szCs w:val="24"/>
+              </w:rPr>
+            </w:pPr>
+            <w:r>
+              <w:rPr>
+                <w:rFonts w:eastAsia="Times New Roman"/>
+                <w:sz w:val="24"/>
+                <w:szCs w:val="24"/>
+              </w:rPr>
+              <w:t>Pass</w:t>
+            </w:r>
+          </w:p>
+        </w:tc>
+      </w:tr>
+      <w:tr>
+        <w:tc>
+          <w:tcPr>
+            <w:tcW w:w="891" w:type="dxa"/>
+          </w:tcPr>
+          <w:p>
+            <w:pPr>
+              <w:spacing w:before="0" w:line="240" w:lineRule="auto"/>
+              <w:rPr>
+                <w:rFonts w:eastAsia="Times New Roman"/>
+                <w:sz w:val="24"/>
+                <w:szCs w:val="24"/>
+              </w:rPr>
+            </w:pPr>
+            <w:r>
+              <w:rPr>
+                <w:rFonts w:eastAsia="Times New Roman"/>
+                <w:sz w:val="24"/>
+                <w:szCs w:val="24"/>
+              </w:rPr>
+              <w:t>TC-SAVE-005</w:t>
+            </w:r>
+          </w:p>
+        </w:tc>
+        <w:tc>
+          <w:tcPr>
+            <w:tcW w:w="1082" w:type="dxa"/>
+          </w:tcPr>
+          <w:p>
+            <w:pPr>
+              <w:spacing w:before="0" w:line="240" w:lineRule="auto"/>
+              <w:rPr>
+                <w:rFonts w:eastAsia="Times New Roman"/>
+                <w:sz w:val="24"/>
+                <w:szCs w:val="24"/>
+              </w:rPr>
+            </w:pPr>
+            <w:r>
+              <w:rPr>
+                <w:rFonts w:eastAsia="Times New Roman"/>
+                <w:sz w:val="24"/>
+                <w:szCs w:val="24"/>
+              </w:rPr>
+              <w:t>Nạp tiền (Goal)</w:t>
+            </w:r>
+          </w:p>
+        </w:tc>
+        <w:tc>
+          <w:tcPr>
+            <w:tcW w:w="2292" w:type="dxa"/>
+          </w:tcPr>
+          <w:p>
+            <w:pPr>
+              <w:spacing w:before="0" w:line="240" w:lineRule="auto"/>
+              <w:rPr>
+                <w:rFonts w:eastAsia="Times New Roman"/>
+                <w:sz w:val="24"/>
+                <w:szCs w:val="24"/>
+              </w:rPr>
+            </w:pPr>
+            <w:r>
+              <w:rPr>
+                <w:rFonts w:eastAsia="Times New Roman"/>
+                <w:sz w:val="24"/>
+                <w:szCs w:val="24"/>
+              </w:rPr>
+              <w:t>Chặn nạp tiền vào mục tiêu tiết kiệm nếu Ví không đủ số dư</w:t>
+            </w:r>
+          </w:p>
+        </w:tc>
+        <w:tc>
+          <w:tcPr>
+            <w:tcW w:w="1974" w:type="dxa"/>
+          </w:tcPr>
+          <w:p>
+            <w:pPr>
+              <w:spacing w:before="0" w:line="240" w:lineRule="auto"/>
+              <w:rPr>
+                <w:rFonts w:eastAsia="Times New Roman"/>
+                <w:sz w:val="24"/>
+                <w:szCs w:val="24"/>
+              </w:rPr>
+            </w:pPr>
+            <w:r>
+              <w:rPr>
+                <w:rFonts w:eastAsia="Times New Roman"/>
+                <w:sz w:val="24"/>
+                <w:szCs w:val="24"/>
+              </w:rPr>
+              <w:t>Ví có 2tr, yêu cầu trích 5tr vào mục tiêu</w:t>
+            </w:r>
+          </w:p>
+        </w:tc>
+        <w:tc>
+          <w:tcPr>
+            <w:tcW w:w="2229" w:type="dxa"/>
+          </w:tcPr>
+          <w:p>
+            <w:pPr>
+              <w:spacing w:before="0" w:line="240" w:lineRule="auto"/>
+              <w:rPr>
+                <w:rFonts w:eastAsia="Times New Roman"/>
+                <w:sz w:val="24"/>
+                <w:szCs w:val="24"/>
+              </w:rPr>
+            </w:pPr>
+            <w:r>
+              <w:rPr>
+                <w:rFonts w:eastAsia="Times New Roman"/>
+                <w:sz w:val="24"/>
+                <w:szCs w:val="24"/>
+              </w:rPr>
+              <w:t>HTTP 400; Lỗi "Số dư trong ví không đủ...". Database Rollback.</w:t>
+            </w:r>
+          </w:p>
+        </w:tc>
+        <w:tc>
+          <w:tcPr>
+            <w:tcW w:w="892" w:type="dxa"/>
+          </w:tcPr>
+          <w:p>
+            <w:pPr>
+              <w:spacing w:before="0" w:line="240" w:lineRule="auto"/>
+              <w:rPr>
+                <w:rFonts w:eastAsia="Times New Roman"/>
+                <w:sz w:val="24"/>
+                <w:szCs w:val="24"/>
+              </w:rPr>
+            </w:pPr>
+            <w:r>
+              <w:rPr>
+                <w:rFonts w:eastAsia="Times New Roman"/>
+                <w:sz w:val="24"/>
+                <w:szCs w:val="24"/>
+              </w:rPr>
+              <w:t>Pass</w:t>
+            </w:r>
+          </w:p>
+        </w:tc>
+      </w:tr>
+      <w:tr>
+        <w:tc>
+          <w:tcPr>
+            <w:tcW w:w="891" w:type="dxa"/>
+          </w:tcPr>
+          <w:p>
+            <w:pPr>
+              <w:spacing w:before="0" w:line="240" w:lineRule="auto"/>
+              <w:rPr>
+                <w:rFonts w:eastAsia="Times New Roman"/>
+                <w:sz w:val="24"/>
+                <w:szCs w:val="24"/>
+              </w:rPr>
+            </w:pPr>
+            <w:r>
+              <w:rPr>
+                <w:rFonts w:eastAsia="Times New Roman"/>
+                <w:sz w:val="24"/>
+                <w:szCs w:val="24"/>
+              </w:rPr>
+              <w:t>TC-IMP-002</w:t>
+            </w:r>
+          </w:p>
+        </w:tc>
+        <w:tc>
+          <w:tcPr>
+            <w:tcW w:w="1082" w:type="dxa"/>
+          </w:tcPr>
+          <w:p>
+            <w:pPr>
+              <w:spacing w:before="0" w:line="240" w:lineRule="auto"/>
+              <w:rPr>
+                <w:rFonts w:eastAsia="Times New Roman"/>
+                <w:sz w:val="24"/>
+                <w:szCs w:val="24"/>
+              </w:rPr>
+            </w:pPr>
+            <w:r>
+              <w:rPr>
+                <w:rFonts w:eastAsia="Times New Roman"/>
+                <w:sz w:val="24"/>
+                <w:szCs w:val="24"/>
+              </w:rPr>
+              <w:t>Import CSV</w:t>
+            </w:r>
+          </w:p>
+        </w:tc>
+        <w:tc>
+          <w:tcPr>
+            <w:tcW w:w="2292" w:type="dxa"/>
+          </w:tcPr>
+          <w:p>
+            <w:pPr>
+              <w:spacing w:before="0" w:line="240" w:lineRule="auto"/>
+              <w:rPr>
+                <w:rFonts w:eastAsia="Times New Roman"/>
+                <w:sz w:val="24"/>
+                <w:szCs w:val="24"/>
+              </w:rPr>
+            </w:pPr>
+            <w:r>
+              <w:rPr>
+                <w:rFonts w:eastAsia="Times New Roman"/>
+                <w:sz w:val="24"/>
+                <w:szCs w:val="24"/>
+              </w:rPr>
+              <w:t>Tự động gọi AI phân loại khi không khớp Rule từ khóa (Hybrid)</w:t>
+            </w:r>
+          </w:p>
+        </w:tc>
+        <w:tc>
+          <w:tcPr>
+            <w:tcW w:w="1974" w:type="dxa"/>
+          </w:tcPr>
+          <w:p>
+            <w:pPr>
+              <w:spacing w:before="0" w:line="240" w:lineRule="auto"/>
+              <w:rPr>
+                <w:rFonts w:eastAsia="Times New Roman"/>
+                <w:sz w:val="24"/>
+                <w:szCs w:val="24"/>
+              </w:rPr>
+            </w:pPr>
+            <w:r>
+              <w:rPr>
+                <w:rFonts w:eastAsia="Times New Roman"/>
+                <w:sz w:val="24"/>
+                <w:szCs w:val="24"/>
+              </w:rPr>
+              <w:t>File CSV chứa 1 dòng: 16/08, -150k, Netflix</w:t>
+            </w:r>
+          </w:p>
+        </w:tc>
+        <w:tc>
+          <w:tcPr>
+            <w:tcW w:w="2229" w:type="dxa"/>
+          </w:tcPr>
+          <w:p>
+            <w:pPr>
+              <w:spacing w:before="0" w:line="240" w:lineRule="auto"/>
+              <w:rPr>
+                <w:rFonts w:eastAsia="Times New Roman"/>
+                <w:sz w:val="24"/>
+                <w:szCs w:val="24"/>
+              </w:rPr>
+            </w:pPr>
+            <w:r>
+              <w:rPr>
+                <w:rFonts w:eastAsia="Times New Roman"/>
+                <w:sz w:val="24"/>
+                <w:szCs w:val="24"/>
+              </w:rPr>
+              <w:t>HTTP 201; Hệ thống gọi AI và gán danh mục AI dự đoán.</w:t>
+            </w:r>
+          </w:p>
+        </w:tc>
+        <w:tc>
+          <w:tcPr>
+            <w:tcW w:w="892" w:type="dxa"/>
+          </w:tcPr>
+          <w:p>
+            <w:pPr>
+              <w:spacing w:before="0" w:line="240" w:lineRule="auto"/>
+              <w:rPr>
+                <w:rFonts w:eastAsia="Times New Roman"/>
+                <w:sz w:val="24"/>
+                <w:szCs w:val="24"/>
+              </w:rPr>
+            </w:pPr>
+            <w:r>
+              <w:rPr>
+                <w:rFonts w:eastAsia="Times New Roman"/>
+                <w:sz w:val="24"/>
+                <w:szCs w:val="24"/>
+              </w:rPr>
+              <w:t>Pass</w:t>
+            </w:r>
+          </w:p>
+        </w:tc>
+      </w:tr>
+      <w:tr>
+        <w:tc>
+          <w:tcPr>
+            <w:tcW w:w="891" w:type="dxa"/>
+          </w:tcPr>
+          <w:p>
+            <w:pPr>
+              <w:spacing w:before="0" w:line="240" w:lineRule="auto"/>
+              <w:rPr>
+                <w:rFonts w:eastAsia="Times New Roman"/>
+                <w:sz w:val="24"/>
+                <w:szCs w:val="24"/>
+              </w:rPr>
+            </w:pPr>
+            <w:r>
+              <w:rPr>
+                <w:rFonts w:eastAsia="Times New Roman"/>
+                <w:sz w:val="24"/>
+                <w:szCs w:val="24"/>
+              </w:rPr>
+              <w:t>TC-IMP-003</w:t>
+            </w:r>
+          </w:p>
+        </w:tc>
+        <w:tc>
+          <w:tcPr>
+            <w:tcW w:w="1082" w:type="dxa"/>
+          </w:tcPr>
+          <w:p>
+            <w:pPr>
+              <w:spacing w:before="0" w:line="240" w:lineRule="auto"/>
+              <w:rPr>
+                <w:rFonts w:eastAsia="Times New Roman"/>
+                <w:sz w:val="24"/>
+                <w:szCs w:val="24"/>
+              </w:rPr>
+            </w:pPr>
+            <w:r>
+              <w:rPr>
+                <w:rFonts w:eastAsia="Times New Roman"/>
+                <w:sz w:val="24"/>
+                <w:szCs w:val="24"/>
+              </w:rPr>
+              <w:t>Import CSV</w:t>
+            </w:r>
+          </w:p>
+        </w:tc>
+        <w:tc>
+          <w:tcPr>
+            <w:tcW w:w="2292" w:type="dxa"/>
+          </w:tcPr>
+          <w:p>
+            <w:pPr>
+              <w:spacing w:before="0" w:line="240" w:lineRule="auto"/>
+              <w:rPr>
+                <w:rFonts w:eastAsia="Times New Roman"/>
+                <w:sz w:val="24"/>
+                <w:szCs w:val="24"/>
+              </w:rPr>
+            </w:pPr>
+            <w:r>
+              <w:rPr>
+                <w:rFonts w:eastAsia="Times New Roman"/>
+                <w:sz w:val="24"/>
+                <w:szCs w:val="24"/>
+              </w:rPr>
+              <w:t>Tự động bỏ qua các giao dịch bị trùng lặp (Khử trùng lặp Database)</w:t>
+            </w:r>
+          </w:p>
+        </w:tc>
+        <w:tc>
+          <w:tcPr>
+            <w:tcW w:w="1974" w:type="dxa"/>
+          </w:tcPr>
+          <w:p>
+            <w:pPr>
+              <w:spacing w:before="0" w:line="240" w:lineRule="auto"/>
+              <w:rPr>
+                <w:rFonts w:eastAsia="Times New Roman"/>
+                <w:sz w:val="24"/>
+                <w:szCs w:val="24"/>
+              </w:rPr>
+            </w:pPr>
+            <w:r>
+              <w:rPr>
+                <w:rFonts w:eastAsia="Times New Roman"/>
+                <w:sz w:val="24"/>
+                <w:szCs w:val="24"/>
+              </w:rPr>
+              <w:t>File CSV chứa dòng giao dịch y hệt trong DB</w:t>
+            </w:r>
+          </w:p>
+        </w:tc>
+        <w:tc>
+          <w:tcPr>
+            <w:tcW w:w="2229" w:type="dxa"/>
+          </w:tcPr>
+          <w:p>
+            <w:pPr>
+              <w:spacing w:before="0" w:line="240" w:lineRule="auto"/>
+              <w:rPr>
+                <w:rFonts w:eastAsia="Times New Roman"/>
+                <w:sz w:val="24"/>
+                <w:szCs w:val="24"/>
+              </w:rPr>
+            </w:pPr>
+            <w:r>
+              <w:rPr>
+                <w:rFonts w:eastAsia="Times New Roman"/>
+                <w:sz w:val="24"/>
+                <w:szCs w:val="24"/>
+              </w:rPr>
+              <w:t>HTTP 201; successRows: 0, duplicatedRows: 1. Số dư không đổi.</w:t>
+            </w:r>
+          </w:p>
+        </w:tc>
+        <w:tc>
+          <w:tcPr>
+            <w:tcW w:w="892" w:type="dxa"/>
+          </w:tcPr>
+          <w:p>
+            <w:pPr>
+              <w:spacing w:before="0" w:line="240" w:lineRule="auto"/>
+              <w:rPr>
+                <w:rFonts w:eastAsia="Times New Roman"/>
+                <w:sz w:val="24"/>
+                <w:szCs w:val="24"/>
+              </w:rPr>
+            </w:pPr>
+            <w:r>
+              <w:rPr>
+                <w:rFonts w:eastAsia="Times New Roman"/>
+                <w:sz w:val="24"/>
+                <w:szCs w:val="24"/>
+              </w:rPr>
+              <w:t>Pass</w:t>
+            </w:r>
+          </w:p>
+        </w:tc>
+      </w:tr>
+      <w:tr>
+        <w:tc>
+          <w:tcPr>
+            <w:tcW w:w="891" w:type="dxa"/>
+          </w:tcPr>
+          <w:p>
+            <w:pPr>
+              <w:spacing w:before="0" w:line="240" w:lineRule="auto"/>
+              <w:rPr>
+                <w:rFonts w:eastAsia="Times New Roman"/>
+                <w:sz w:val="24"/>
+                <w:szCs w:val="24"/>
+              </w:rPr>
+            </w:pPr>
+            <w:r>
+              <w:rPr>
+                <w:rFonts w:eastAsia="Times New Roman"/>
+                <w:sz w:val="24"/>
+                <w:szCs w:val="24"/>
+              </w:rPr>
+              <w:t>TC-SCHED-001</w:t>
+            </w:r>
+          </w:p>
+        </w:tc>
+        <w:tc>
+          <w:tcPr>
+            <w:tcW w:w="1082" w:type="dxa"/>
+          </w:tcPr>
+          <w:p>
+            <w:pPr>
+              <w:spacing w:before="0" w:line="240" w:lineRule="auto"/>
+              <w:rPr>
+                <w:rFonts w:eastAsia="Times New Roman"/>
+                <w:sz w:val="24"/>
+                <w:szCs w:val="24"/>
+              </w:rPr>
+            </w:pPr>
+            <w:r>
+              <w:rPr>
+                <w:rFonts w:eastAsia="Times New Roman"/>
+                <w:sz w:val="24"/>
+                <w:szCs w:val="24"/>
+              </w:rPr>
+              <w:t>Cron Job</w:t>
+            </w:r>
+          </w:p>
+        </w:tc>
+        <w:tc>
+          <w:tcPr>
+            <w:tcW w:w="2292" w:type="dxa"/>
+          </w:tcPr>
+          <w:p>
+            <w:pPr>
+              <w:spacing w:before="0" w:line="240" w:lineRule="auto"/>
+              <w:rPr>
+                <w:rFonts w:eastAsia="Times New Roman"/>
+                <w:sz w:val="24"/>
+                <w:szCs w:val="24"/>
+              </w:rPr>
+            </w:pPr>
+            <w:r>
+              <w:rPr>
+                <w:rFonts w:eastAsia="Times New Roman"/>
+                <w:sz w:val="24"/>
+                <w:szCs w:val="24"/>
+              </w:rPr>
+              <w:t>Scheduler tự động bắn cảnh báo Khẩn cấp khi đến hạn hóa đơn</w:t>
+            </w:r>
+          </w:p>
+        </w:tc>
+        <w:tc>
+          <w:tcPr>
+            <w:tcW w:w="1974" w:type="dxa"/>
+          </w:tcPr>
+          <w:p>
+            <w:pPr>
+              <w:spacing w:before="0" w:line="240" w:lineRule="auto"/>
+              <w:rPr>
+                <w:rFonts w:eastAsia="Times New Roman"/>
+                <w:sz w:val="24"/>
+                <w:szCs w:val="24"/>
+              </w:rPr>
+            </w:pPr>
+            <w:r>
+              <w:rPr>
+                <w:rFonts w:eastAsia="Times New Roman"/>
+                <w:sz w:val="24"/>
+                <w:szCs w:val="24"/>
+              </w:rPr>
+              <w:t>DB có Hóa đơn đến hạn vào NGÀY HÔM NAY</w:t>
+            </w:r>
+          </w:p>
+        </w:tc>
+        <w:tc>
+          <w:tcPr>
+            <w:tcW w:w="2229" w:type="dxa"/>
+          </w:tcPr>
+          <w:p>
+            <w:pPr>
+              <w:spacing w:before="0" w:line="240" w:lineRule="auto"/>
+              <w:rPr>
+                <w:rFonts w:eastAsia="Times New Roman"/>
+                <w:sz w:val="24"/>
+                <w:szCs w:val="24"/>
+              </w:rPr>
+            </w:pPr>
+            <w:r>
+              <w:rPr>
+                <w:rFonts w:eastAsia="Times New Roman"/>
+                <w:sz w:val="24"/>
+                <w:szCs w:val="24"/>
+              </w:rPr>
+              <w:t>Quét Cron Job: Tạo Notification (Priority 1), gửi Email KHẨN.</w:t>
+            </w:r>
+          </w:p>
+        </w:tc>
+        <w:tc>
+          <w:tcPr>
+            <w:tcW w:w="892" w:type="dxa"/>
+          </w:tcPr>
+          <w:p>
+            <w:pPr>
+              <w:spacing w:before="0" w:line="240" w:lineRule="auto"/>
+              <w:rPr>
+                <w:rFonts w:eastAsia="Times New Roman"/>
+                <w:sz w:val="24"/>
+                <w:szCs w:val="24"/>
+              </w:rPr>
+            </w:pPr>
+            <w:r>
+              <w:rPr>
+                <w:rFonts w:eastAsia="Times New Roman"/>
+                <w:sz w:val="24"/>
+                <w:szCs w:val="24"/>
+              </w:rPr>
+              <w:t>Pass</w:t>
+            </w:r>
+          </w:p>
+        </w:tc>
+      </w:tr>
+    </w:tbl>
+    <w:p>
+      <w:pPr>
+        <w:pStyle w:val="Caption"/>
+        <w:jc w:val="center"/>
+        <w:rPr>
+          <w:i w:val="0"/>
+          <w:iCs w:val="0"/>
+          <w:color w:val="auto"/>
+          <w:sz w:val="26"/>
+          <w:szCs w:val="26"/>
+        </w:rPr>
+      </w:pPr>
+      <w:r>
+        <w:rPr>
+          <w:i w:val="0"/>
+          <w:iCs w:val="0"/>
+          <w:color w:val="auto"/>
+          <w:sz w:val="26"/>
+          <w:szCs w:val="26"/>
+        </w:rPr>
+        <w:t xml:space="preserve">Bảng </w:t>
+      </w:r>
+      <w:r>
+        <w:rPr>
+          <w:i w:val="0"/>
+          <w:iCs w:val="0"/>
+          <w:color w:val="auto"/>
+          <w:sz w:val="26"/>
+          <w:szCs w:val="26"/>
+        </w:rPr>
+        <w:fldChar w:fldCharType="begin"/>
+      </w:r>
+      <w:r>
+        <w:rPr>
+          <w:i w:val="0"/>
+          <w:iCs w:val="0"/>
+          <w:color w:val="auto"/>
+          <w:sz w:val="26"/>
+          <w:szCs w:val="26"/>
+        </w:rPr>
+        <w:instrText xml:space="preserve"> SEQ Bảng \* ARABIC </w:instrText>
+      </w:r>
+      <w:r>
+        <w:rPr>
+          <w:i w:val="0"/>
+          <w:iCs w:val="0"/>
+          <w:color w:val="auto"/>
+          <w:sz w:val="26"/>
+          <w:szCs w:val="26"/>
+        </w:rPr>
+        <w:fldChar w:fldCharType="separate"/>
+      </w:r>
+      <w:r>
+        <w:rPr>
+          <w:i w:val="0"/>
+          <w:iCs w:val="0"/>
+          <w:noProof/>
+          <w:color w:val="auto"/>
+          <w:sz w:val="26"/>
+          <w:szCs w:val="26"/>
+        </w:rPr>
+        <w:t>18</w:t>
+      </w:r>
+      <w:r>
+        <w:rPr>
+          <w:i w:val="0"/>
+          <w:iCs w:val="0"/>
+          <w:color w:val="auto"/>
+          <w:sz w:val="26"/>
+          <w:szCs w:val="26"/>
+        </w:rPr>
+        <w:fldChar w:fldCharType="end"/>
+      </w:r>
+      <w:r>
+        <w:rPr>
+          <w:i w:val="0"/>
+          <w:iCs w:val="0"/>
+          <w:color w:val="auto"/>
+          <w:sz w:val="26"/>
+          <w:szCs w:val="26"/>
+        </w:rPr>
+        <w:t>: Bảng rút gọn các Test Case cốt lõi</w:t>
+      </w:r>
+    </w:p>
+    <w:p>
+      <w:pPr>
+        <w:pStyle w:val="Heading2"/>
+        <w:rPr>
+          <w:b/>
+          <w:bCs/>
+          <w:color w:val="auto"/>
+        </w:rPr>
+      </w:pPr>
+      <w:r>
+        <w:rPr>
+          <w:b/>
+          <w:bCs/>
+          <w:color w:val="auto"/>
+        </w:rPr>
+        <w:t xml:space="preserve">5.3. </w:t>
+      </w:r>
+      <w:r>
+        <w:rPr>
+          <w:b/>
+          <w:bCs/>
+          <w:color w:val="auto"/>
+        </w:rPr>
+        <w:t>Kiểm thử tự động và CI</w:t>
+      </w:r>
+    </w:p>
+    <w:p>
+      <w:pPr>
+        <w:spacing w:after="120"/>
+        <w:rPr>
+          <w:sz w:val="26"/>
+          <w:szCs w:val="26"/>
+        </w:rPr>
+      </w:pPr>
+      <w:r>
+        <w:rPr>
+          <w:sz w:val="26"/>
+          <w:szCs w:val="26"/>
+        </w:rPr>
+        <w:t>Hệ thống sử dụng JUnit 5 để kiểm thử tự động ở tầng Backend. Các module xử lý chính như tính số dư (TransactionService), kiểm tra ngân sách (BudgetService) và xử lý các tác vụ định kỳ (FinanceTaskScheduler) đều được kiểm thử bằng Unit Test.</w:t>
+      </w:r>
+    </w:p>
+    <w:p>
+      <w:pPr>
+        <w:spacing w:after="120"/>
+        <w:rPr>
+          <w:sz w:val="26"/>
+          <w:szCs w:val="26"/>
+        </w:rPr>
+      </w:pPr>
+      <w:r>
+        <w:rPr>
+          <w:sz w:val="26"/>
+          <w:szCs w:val="26"/>
+        </w:rPr>
+        <w:lastRenderedPageBreak/>
+        <w:t>Các bài kiểm thử tự động được tích hợp vào quy trình CI (Continuous Integration) thông qua GitHub Actions. Mỗi khi lập trình viên thực hiện git push lên nhánh main, GitHub Actions sẽ tự động thiết lập môi trường Java 17, tải các thư viện Maven và chạy lệnh mvn test để kiểm tra hệ thống.</w:t>
+      </w:r>
+    </w:p>
+    <w:p>
+      <w:pPr>
+        <w:spacing w:after="120"/>
+        <w:rPr>
+          <w:sz w:val="26"/>
+          <w:szCs w:val="26"/>
+        </w:rPr>
+      </w:pPr>
+      <w:r>
+        <w:rPr>
+          <w:sz w:val="26"/>
+          <w:szCs w:val="26"/>
+        </w:rPr>
+        <w:drawing>
+          <wp:inline distT="0" distB="0" distL="0" distR="0" wp14:anchorId="772D4BF1" wp14:editId="6503B9FA">
+            <wp:extent cx="5547995" cy="1581150"/>
+            <wp:effectExtent l="0" t="0" r="0" b="0"/>
+            <wp:docPr id="8" name="Picture 8"/>
+            <wp:cNvGraphicFramePr>
+              <a:graphicFrameLocks xmlns:a="http://schemas.openxmlformats.org/drawingml/2006/main" noChangeAspect="1"/>
+            </wp:cNvGraphicFramePr>
+            <a:graphic xmlns:a="http://schemas.openxmlformats.org/drawingml/2006/main">
+              <a:graphicData uri="http://schemas.openxmlformats.org/drawingml/2006/picture">
+                <pic:pic xmlns:pic="http://schemas.openxmlformats.org/drawingml/2006/picture">
+                  <pic:nvPicPr>
+                    <pic:cNvPr id="1" name=""/>
+                    <pic:cNvPicPr/>
+                  </pic:nvPicPr>
+                  <pic:blipFill>
+                    <a:blip r:embed="rId38"/>
+                    <a:stretch>
+                      <a:fillRect/>
+                    </a:stretch>
+                  </pic:blipFill>
+                  <pic:spPr>
+                    <a:xfrm>
+                      <a:off x="0" y="0"/>
+                      <a:ext cx="5547995" cy="1581150"/>
+                    </a:xfrm>
+                    <a:prstGeom prst="rect">
+                      <a:avLst/>
+                    </a:prstGeom>
+                  </pic:spPr>
+                </pic:pic>
+              </a:graphicData>
+            </a:graphic>
+          </wp:inline>
+        </w:drawing>
+      </w:r>
+    </w:p>
+    <w:p>
+      <w:pPr>
+        <w:spacing w:after="120"/>
+        <w:rPr>
+          <w:b/>
+          <w:bCs/>
+          <w:sz w:val="26"/>
+          <w:szCs w:val="26"/>
+        </w:rPr>
+      </w:pPr>
+      <w:r>
+        <w:rPr>
+          <w:sz w:val="26"/>
+          <w:szCs w:val="26"/>
+        </w:rPr>
+        <w:drawing>
+          <wp:inline distT="0" distB="0" distL="0" distR="0" wp14:anchorId="40EE50CB" wp14:editId="141F01A8">
+            <wp:extent cx="5547995" cy="2093595"/>
+            <wp:effectExtent l="0" t="0" r="0" b="1905"/>
+            <wp:docPr id="2" name="Picture 2"/>
+            <wp:cNvGraphicFramePr>
+              <a:graphicFrameLocks xmlns:a="http://schemas.openxmlformats.org/drawingml/2006/main" noChangeAspect="1"/>
+            </wp:cNvGraphicFramePr>
+            <a:graphic xmlns:a="http://schemas.openxmlformats.org/drawingml/2006/main">
+              <a:graphicData uri="http://schemas.openxmlformats.org/drawingml/2006/picture">
+                <pic:pic xmlns:pic="http://schemas.openxmlformats.org/drawingml/2006/picture">
+                  <pic:nvPicPr>
+                    <pic:cNvPr id="1" name=""/>
+                    <pic:cNvPicPr/>
+                  </pic:nvPicPr>
+                  <pic:blipFill>
+                    <a:blip r:embed="rId39"/>
+                    <a:stretch>
+                      <a:fillRect/>
+                    </a:stretch>
+                  </pic:blipFill>
+                  <pic:spPr>
+                    <a:xfrm>
+                      <a:off x="0" y="0"/>
+                      <a:ext cx="5547995" cy="2093595"/>
+                    </a:xfrm>
+                    <a:prstGeom prst="rect">
+                      <a:avLst/>
+                    </a:prstGeom>
+                  </pic:spPr>
+                </pic:pic>
+              </a:graphicData>
+            </a:graphic>
+          </wp:inline>
+        </w:drawing>
       </w:r>
       <w:r>
         <w:rPr>
@@ -28718,48 +30291,1378 @@
           <w:szCs w:val="26"/>
         </w:rPr>
         <w:br/>
-        <w:t>5.2. Kết quả kiểm thử</w:t>
-      </w:r>
-      <w:r>
-        <w:rPr>
-          <w:sz w:val="26"/>
-          <w:szCs w:val="26"/>
-        </w:rPr>
-        <w:br/>
-      </w:r>
+      </w:r>
+    </w:p>
+    <w:p>
+      <w:pPr>
+        <w:pStyle w:val="Heading2"/>
+        <w:rPr>
+          <w:b/>
+          <w:bCs/>
+        </w:rPr>
+      </w:pPr>
+      <w:r>
+        <w:rPr>
+          <w:b/>
+          <w:bCs/>
+        </w:rPr>
+        <w:t>5.4. Ma trận truy vết yêu cầu với testcase</w:t>
+      </w:r>
+    </w:p>
+    <w:p>
+      <w:pPr>
+        <w:spacing w:after="120"/>
+        <w:rPr>
+          <w:sz w:val="26"/>
+          <w:szCs w:val="26"/>
+        </w:rPr>
+      </w:pPr>
+      <w:r>
+        <w:rPr>
+          <w:sz w:val="26"/>
+          <w:szCs w:val="26"/>
+        </w:rPr>
+        <w:t>Ma trận dưới đây chứng minh mức độ bao phủ của bộ Test Case đối với các Yêu cầu chức năng (FR) và Quy tắc nghiệp vụ (BR) đã được thiết kế tại Chương 3</w:t>
+      </w:r>
+      <w:r>
+        <w:rPr>
+          <w:sz w:val="26"/>
+          <w:szCs w:val="26"/>
+        </w:rPr>
+        <w:t>:</w:t>
+      </w:r>
+    </w:p>
+    <w:tbl>
+      <w:tblPr>
+        <w:tblW w:w="5000" w:type="pct"/>
+        <w:tblBorders>
+          <w:top w:val="single" w:sz="4" w:space="0" w:color="auto"/>
+          <w:left w:val="single" w:sz="4" w:space="0" w:color="auto"/>
+          <w:bottom w:val="single" w:sz="4" w:space="0" w:color="auto"/>
+          <w:right w:val="single" w:sz="4" w:space="0" w:color="auto"/>
+          <w:insideH w:val="single" w:sz="4" w:space="0" w:color="auto"/>
+          <w:insideV w:val="single" w:sz="4" w:space="0" w:color="auto"/>
+        </w:tblBorders>
+        <w:tblLayout w:type="fixed"/>
+        <w:tblCellMar>
+          <w:top w:w="80" w:type="dxa"/>
+          <w:left w:w="120" w:type="dxa"/>
+          <w:bottom w:w="80" w:type="dxa"/>
+          <w:right w:w="120" w:type="dxa"/>
+        </w:tblCellMar>
+        <w:tblLook w:val="04A0" w:firstRow="1" w:lastRow="0" w:firstColumn="1" w:lastColumn="0" w:noHBand="0" w:noVBand="1"/>
+      </w:tblPr>
+      <w:tblGrid>
+        <w:gridCol w:w="1644"/>
+        <w:gridCol w:w="3231"/>
+        <w:gridCol w:w="2717"/>
+        <w:gridCol w:w="1135"/>
+      </w:tblGrid>
+      <w:tr>
+        <w:trPr>
+          <w:tblHeader/>
+        </w:trPr>
+        <w:tc>
+          <w:tcPr>
+            <w:tcW w:w="1696" w:type="dxa"/>
+          </w:tcPr>
+          <w:p>
+            <w:r>
+              <w:rPr>
+                <w:b/>
+                <w:bCs/>
+              </w:rPr>
+              <w:t>Mã FR và BR</w:t>
+            </w:r>
+          </w:p>
+        </w:tc>
+        <w:tc>
+          <w:tcPr>
+            <w:tcW w:w="3343" w:type="dxa"/>
+          </w:tcPr>
+          <w:p>
+            <w:r>
+              <w:rPr>
+                <w:b/>
+                <w:bCs/>
+              </w:rPr>
+              <w:t>Nội dung quy tắc nghiệp vụ</w:t>
+            </w:r>
+          </w:p>
+        </w:tc>
+        <w:tc>
+          <w:tcPr>
+            <w:tcW w:w="2809" w:type="dxa"/>
+          </w:tcPr>
+          <w:p>
+            <w:r>
+              <w:rPr>
+                <w:b/>
+                <w:bCs/>
+              </w:rPr>
+              <w:t>Test Case phủ</w:t>
+            </w:r>
+          </w:p>
+        </w:tc>
+        <w:tc>
+          <w:tcPr>
+            <w:tcW w:w="1168" w:type="dxa"/>
+          </w:tcPr>
+          <w:p>
+            <w:r>
+              <w:rPr>
+                <w:b/>
+                <w:bCs/>
+              </w:rPr>
+              <w:t>Kết quả</w:t>
+            </w:r>
+          </w:p>
+        </w:tc>
+      </w:tr>
+      <w:tr>
+        <w:tc>
+          <w:tcPr>
+            <w:tcW w:w="1696" w:type="dxa"/>
+          </w:tcPr>
+          <w:p>
+            <w:r>
+              <w:t>FR-02, BR-02</w:t>
+            </w:r>
+          </w:p>
+        </w:tc>
+        <w:tc>
+          <w:tcPr>
+            <w:tcW w:w="3343" w:type="dxa"/>
+          </w:tcPr>
+          <w:p>
+            <w:r>
+              <w:t>Giao dịch tác động đúng số dư ví, tự động bù trừ khi sửa/xóa</w:t>
+            </w:r>
+          </w:p>
+        </w:tc>
+        <w:tc>
+          <w:tcPr>
+            <w:tcW w:w="2809" w:type="dxa"/>
+          </w:tcPr>
+          <w:p>
+            <w:r>
+              <w:t>TC-TRAN-001, TC-TRAN-003, TC-TRAN-004, TC-TRAN-005</w:t>
+            </w:r>
+          </w:p>
+        </w:tc>
+        <w:tc>
+          <w:tcPr>
+            <w:tcW w:w="1168" w:type="dxa"/>
+          </w:tcPr>
+          <w:p>
+            <w:r>
+              <w:t>Pass</w:t>
+            </w:r>
+          </w:p>
+        </w:tc>
+      </w:tr>
+      <w:tr>
+        <w:tc>
+          <w:tcPr>
+            <w:tcW w:w="1696" w:type="dxa"/>
+          </w:tcPr>
+          <w:p>
+            <w:r>
+              <w:t>FR-13, BR-06</w:t>
+            </w:r>
+          </w:p>
+        </w:tc>
+        <w:tc>
+          <w:tcPr>
+            <w:tcW w:w="3343" w:type="dxa"/>
+          </w:tcPr>
+          <w:p>
+            <w:r>
+              <w:t>Chỉ chủ tài khoản và thành viên được cấp quyền mới được xem/sửa ví</w:t>
+            </w:r>
+          </w:p>
+        </w:tc>
+        <w:tc>
+          <w:tcPr>
+            <w:tcW w:w="2809" w:type="dxa"/>
+          </w:tcPr>
+          <w:p>
+            <w:r>
+              <w:t>TC-TRAN-002, TC-TRAN-006, TC-WALL-002, TC-WALL-003</w:t>
+            </w:r>
+          </w:p>
+        </w:tc>
+        <w:tc>
+          <w:tcPr>
+            <w:tcW w:w="1168" w:type="dxa"/>
+          </w:tcPr>
+          <w:p>
+            <w:r>
+              <w:t>Pass</w:t>
+            </w:r>
+          </w:p>
+        </w:tc>
+      </w:tr>
+      <w:tr>
+        <w:tc>
+          <w:tcPr>
+            <w:tcW w:w="1696" w:type="dxa"/>
+          </w:tcPr>
+          <w:p>
+            <w:r>
+              <w:lastRenderedPageBreak/>
+              <w:t>FR-07, BR-03</w:t>
+            </w:r>
+          </w:p>
+        </w:tc>
+        <w:tc>
+          <w:tcPr>
+            <w:tcW w:w="3343" w:type="dxa"/>
+          </w:tcPr>
+          <w:p>
+            <w:r>
+              <w:t>Khi import, hệ thống phải phát hiện và khử giao dịch trùng lặp</w:t>
+            </w:r>
+          </w:p>
+        </w:tc>
+        <w:tc>
+          <w:tcPr>
+            <w:tcW w:w="2809" w:type="dxa"/>
+          </w:tcPr>
+          <w:p>
+            <w:r>
+              <w:t>TC-IMP-003, TC-IMP-005</w:t>
+            </w:r>
+          </w:p>
+        </w:tc>
+        <w:tc>
+          <w:tcPr>
+            <w:tcW w:w="1168" w:type="dxa"/>
+          </w:tcPr>
+          <w:p>
+            <w:r>
+              <w:t>Pass</w:t>
+            </w:r>
+          </w:p>
+        </w:tc>
+      </w:tr>
+      <w:tr>
+        <w:tc>
+          <w:tcPr>
+            <w:tcW w:w="1696" w:type="dxa"/>
+          </w:tcPr>
+          <w:p>
+            <w:r>
+              <w:t>FR-08, BR-09</w:t>
+            </w:r>
+          </w:p>
+        </w:tc>
+        <w:tc>
+          <w:tcPr>
+            <w:tcW w:w="3343" w:type="dxa"/>
+          </w:tcPr>
+          <w:p>
+            <w:r>
+              <w:t>Giao dịch không khớp từ khóa đưa vào nhóm Chưa phân loại / Gọi AI</w:t>
+            </w:r>
+          </w:p>
+        </w:tc>
+        <w:tc>
+          <w:tcPr>
+            <w:tcW w:w="2809" w:type="dxa"/>
+          </w:tcPr>
+          <w:p>
+            <w:r>
+              <w:t>TC-IMP-001, TC-IMP-002</w:t>
+            </w:r>
+          </w:p>
+        </w:tc>
+        <w:tc>
+          <w:tcPr>
+            <w:tcW w:w="1168" w:type="dxa"/>
+          </w:tcPr>
+          <w:p>
+            <w:r>
+              <w:t>Pass</w:t>
+            </w:r>
+          </w:p>
+        </w:tc>
+      </w:tr>
+      <w:tr>
+        <w:tc>
+          <w:tcPr>
+            <w:tcW w:w="1696" w:type="dxa"/>
+          </w:tcPr>
+          <w:p>
+            <w:r>
+              <w:t>FR-11, BR-10</w:t>
+            </w:r>
+          </w:p>
+        </w:tc>
+        <w:tc>
+          <w:tcPr>
+            <w:tcW w:w="3343" w:type="dxa"/>
+          </w:tcPr>
+          <w:p>
+            <w:r>
+              <w:t>Ưu tiên nhắc nhở theo mức khẩn, cảnh báo vượt ngân sách</w:t>
+            </w:r>
+          </w:p>
+        </w:tc>
+        <w:tc>
+          <w:tcPr>
+            <w:tcW w:w="2809" w:type="dxa"/>
+          </w:tcPr>
+          <w:p>
+            <w:r>
+              <w:t>TC-BUDG-004, TC-BUDG-005, TC-SCHED-001</w:t>
+            </w:r>
+          </w:p>
+        </w:tc>
+        <w:tc>
+          <w:tcPr>
+            <w:tcW w:w="1168" w:type="dxa"/>
+          </w:tcPr>
+          <w:p>
+            <w:r>
+              <w:t>Pass</w:t>
+            </w:r>
+          </w:p>
+        </w:tc>
+      </w:tr>
+      <w:tr>
+        <w:tc>
+          <w:tcPr>
+            <w:tcW w:w="1696" w:type="dxa"/>
+          </w:tcPr>
+          <w:p>
+            <w:r>
+              <w:t>FR-13, BR-12</w:t>
+            </w:r>
+          </w:p>
+        </w:tc>
+        <w:tc>
+          <w:tcPr>
+            <w:tcW w:w="3343" w:type="dxa"/>
+          </w:tcPr>
+          <w:p>
+            <w:r>
+              <w:t>Lời mời chia sẻ ví bị từ chối ngay nếu email không tồn tại trong hệ thống</w:t>
+            </w:r>
+          </w:p>
+        </w:tc>
+        <w:tc>
+          <w:tcPr>
+            <w:tcW w:w="2809" w:type="dxa"/>
+          </w:tcPr>
+          <w:p>
+            <w:r>
+              <w:t>TC-WALL-005, TC-WALL-006</w:t>
+            </w:r>
+          </w:p>
+        </w:tc>
+        <w:tc>
+          <w:tcPr>
+            <w:tcW w:w="1168" w:type="dxa"/>
+          </w:tcPr>
+          <w:p>
+            <w:r>
+              <w:t>Pass</w:t>
+            </w:r>
+          </w:p>
+        </w:tc>
+      </w:tr>
+    </w:tbl>
+    <w:p>
+      <w:pPr>
+        <w:spacing w:after="120"/>
+        <w:rPr>
+          <w:sz w:val="26"/>
+          <w:szCs w:val="26"/>
+        </w:rPr>
+      </w:pPr>
+    </w:p>
+    <w:p>
+      <w:pPr>
+        <w:spacing w:after="120"/>
+        <w:rPr>
+          <w:sz w:val="26"/>
+          <w:szCs w:val="26"/>
+        </w:rPr>
+      </w:pPr>
+      <w:r>
+        <w:rPr>
+          <w:sz w:val="26"/>
+          <w:szCs w:val="26"/>
+        </w:rPr>
+        <w:t>5.5. Kết quả và defeat</w:t>
+      </w:r>
+    </w:p>
+    <w:tbl>
+      <w:tblPr>
+        <w:tblW w:w="5000" w:type="pct"/>
+        <w:tblBorders>
+          <w:top w:val="single" w:sz="4" w:space="0" w:color="auto"/>
+          <w:left w:val="single" w:sz="4" w:space="0" w:color="auto"/>
+          <w:bottom w:val="single" w:sz="4" w:space="0" w:color="auto"/>
+          <w:right w:val="single" w:sz="4" w:space="0" w:color="auto"/>
+          <w:insideH w:val="single" w:sz="4" w:space="0" w:color="auto"/>
+          <w:insideV w:val="single" w:sz="4" w:space="0" w:color="auto"/>
+        </w:tblBorders>
+        <w:tblLayout w:type="fixed"/>
+        <w:tblCellMar>
+          <w:top w:w="80" w:type="dxa"/>
+          <w:left w:w="120" w:type="dxa"/>
+          <w:bottom w:w="80" w:type="dxa"/>
+          <w:right w:w="120" w:type="dxa"/>
+        </w:tblCellMar>
+        <w:tblLook w:val="0000" w:firstRow="0" w:lastRow="0" w:firstColumn="0" w:lastColumn="0" w:noHBand="0" w:noVBand="0"/>
+      </w:tblPr>
+      <w:tblGrid>
+        <w:gridCol w:w="1129"/>
+        <w:gridCol w:w="1560"/>
+        <w:gridCol w:w="1915"/>
+        <w:gridCol w:w="3181"/>
+        <w:gridCol w:w="942"/>
+      </w:tblGrid>
+      <w:tr>
+        <w:trPr>
+          <w:tblHeader/>
+        </w:trPr>
+        <w:tc>
+          <w:tcPr>
+            <w:tcW w:w="1129" w:type="dxa"/>
+          </w:tcPr>
+          <w:p>
+            <w:pPr>
+              <w:spacing w:before="0" w:line="240" w:lineRule="auto"/>
+              <w:rPr>
+                <w:rFonts w:eastAsia="Times New Roman"/>
+                <w:sz w:val="24"/>
+                <w:szCs w:val="24"/>
+              </w:rPr>
+            </w:pPr>
+            <w:r>
+              <w:rPr>
+                <w:rFonts w:eastAsia="Times New Roman"/>
+                <w:b/>
+                <w:bCs/>
+                <w:sz w:val="24"/>
+                <w:szCs w:val="24"/>
+              </w:rPr>
+              <w:t>Mã Defect</w:t>
+            </w:r>
+          </w:p>
+        </w:tc>
+        <w:tc>
+          <w:tcPr>
+            <w:tcW w:w="1560" w:type="dxa"/>
+          </w:tcPr>
+          <w:p>
+            <w:pPr>
+              <w:spacing w:before="0" w:line="240" w:lineRule="auto"/>
+              <w:rPr>
+                <w:rFonts w:eastAsia="Times New Roman"/>
+                <w:sz w:val="24"/>
+                <w:szCs w:val="24"/>
+              </w:rPr>
+            </w:pPr>
+            <w:r>
+              <w:rPr>
+                <w:rFonts w:eastAsia="Times New Roman"/>
+                <w:b/>
+                <w:bCs/>
+                <w:sz w:val="24"/>
+                <w:szCs w:val="24"/>
+              </w:rPr>
+              <w:t>GitHub Issue</w:t>
+            </w:r>
+          </w:p>
+        </w:tc>
+        <w:tc>
+          <w:tcPr>
+            <w:tcW w:w="1915" w:type="dxa"/>
+          </w:tcPr>
+          <w:p>
+            <w:pPr>
+              <w:spacing w:before="0" w:line="240" w:lineRule="auto"/>
+              <w:rPr>
+                <w:rFonts w:eastAsia="Times New Roman"/>
+                <w:sz w:val="24"/>
+                <w:szCs w:val="24"/>
+              </w:rPr>
+            </w:pPr>
+            <w:r>
+              <w:rPr>
+                <w:rFonts w:eastAsia="Times New Roman"/>
+                <w:b/>
+                <w:bCs/>
+                <w:sz w:val="24"/>
+                <w:szCs w:val="24"/>
+              </w:rPr>
+              <w:t>Mô tả lỗi phát hiện</w:t>
+            </w:r>
+          </w:p>
+        </w:tc>
+        <w:tc>
+          <w:tcPr>
+            <w:tcW w:w="3181" w:type="dxa"/>
+          </w:tcPr>
+          <w:p>
+            <w:pPr>
+              <w:spacing w:before="0" w:line="240" w:lineRule="auto"/>
+              <w:rPr>
+                <w:rFonts w:eastAsia="Times New Roman"/>
+                <w:sz w:val="24"/>
+                <w:szCs w:val="24"/>
+              </w:rPr>
+            </w:pPr>
+            <w:r>
+              <w:rPr>
+                <w:rFonts w:eastAsia="Times New Roman"/>
+                <w:b/>
+                <w:bCs/>
+                <w:sz w:val="24"/>
+                <w:szCs w:val="24"/>
+              </w:rPr>
+              <w:t>Cách khắc phục</w:t>
+            </w:r>
+          </w:p>
+        </w:tc>
+        <w:tc>
+          <w:tcPr>
+            <w:tcW w:w="942" w:type="dxa"/>
+          </w:tcPr>
+          <w:p>
+            <w:pPr>
+              <w:spacing w:before="0" w:line="240" w:lineRule="auto"/>
+              <w:rPr>
+                <w:rFonts w:eastAsia="Times New Roman"/>
+                <w:sz w:val="24"/>
+                <w:szCs w:val="24"/>
+              </w:rPr>
+            </w:pPr>
+            <w:r>
+              <w:rPr>
+                <w:rFonts w:eastAsia="Times New Roman"/>
+                <w:b/>
+                <w:bCs/>
+                <w:sz w:val="24"/>
+                <w:szCs w:val="24"/>
+              </w:rPr>
+              <w:t>Trạng thái</w:t>
+            </w:r>
+          </w:p>
+        </w:tc>
+      </w:tr>
+      <w:tr>
+        <w:tc>
+          <w:tcPr>
+            <w:tcW w:w="1129" w:type="dxa"/>
+          </w:tcPr>
+          <w:p>
+            <w:pPr>
+              <w:spacing w:before="0" w:line="240" w:lineRule="auto"/>
+              <w:rPr>
+                <w:rFonts w:eastAsia="Times New Roman"/>
+                <w:sz w:val="24"/>
+                <w:szCs w:val="24"/>
+              </w:rPr>
+            </w:pPr>
+            <w:r>
+              <w:rPr>
+                <w:rFonts w:eastAsia="Times New Roman"/>
+                <w:sz w:val="24"/>
+                <w:szCs w:val="24"/>
+              </w:rPr>
+              <w:t>DF-01</w:t>
+            </w:r>
+          </w:p>
+        </w:tc>
+        <w:tc>
+          <w:tcPr>
+            <w:tcW w:w="1560" w:type="dxa"/>
+          </w:tcPr>
+          <w:p>
+            <w:pPr>
+              <w:spacing w:before="0" w:line="240" w:lineRule="auto"/>
+              <w:rPr>
+                <w:rFonts w:eastAsia="Times New Roman"/>
+                <w:sz w:val="24"/>
+                <w:szCs w:val="24"/>
+              </w:rPr>
+            </w:pPr>
+            <w:r>
+              <w:rPr>
+                <w:rFonts w:eastAsia="Times New Roman"/>
+                <w:sz w:val="24"/>
+                <w:szCs w:val="24"/>
+              </w:rPr>
+              <w:t>#12</w:t>
+            </w:r>
+          </w:p>
+        </w:tc>
+        <w:tc>
+          <w:tcPr>
+            <w:tcW w:w="1915" w:type="dxa"/>
+          </w:tcPr>
+          <w:p>
+            <w:pPr>
+              <w:spacing w:before="0" w:line="240" w:lineRule="auto"/>
+              <w:rPr>
+                <w:rFonts w:eastAsia="Times New Roman"/>
+                <w:sz w:val="24"/>
+                <w:szCs w:val="24"/>
+              </w:rPr>
+            </w:pPr>
+            <w:r>
+              <w:rPr>
+                <w:rFonts w:eastAsia="Times New Roman"/>
+                <w:sz w:val="24"/>
+                <w:szCs w:val="24"/>
+              </w:rPr>
+              <w:t>Tính sai số dư ví khi cập nhật giao dịch đổi từ loại CHI sang THU. Bù trừ sai dấu toán học.</w:t>
+            </w:r>
+          </w:p>
+        </w:tc>
+        <w:tc>
+          <w:tcPr>
+            <w:tcW w:w="3181" w:type="dxa"/>
+          </w:tcPr>
+          <w:p>
+            <w:pPr>
+              <w:spacing w:before="0" w:line="240" w:lineRule="auto"/>
+              <w:rPr>
+                <w:rFonts w:eastAsia="Times New Roman"/>
+                <w:sz w:val="24"/>
+                <w:szCs w:val="24"/>
+              </w:rPr>
+            </w:pPr>
+            <w:r>
+              <w:rPr>
+                <w:rFonts w:eastAsia="Times New Roman"/>
+                <w:sz w:val="24"/>
+                <w:szCs w:val="24"/>
+              </w:rPr>
+              <w:t>Sửa lại logic tính oldImpact và newImpact trong hàm updateTransaction tại TransactionServiceImpl.</w:t>
+            </w:r>
+          </w:p>
+        </w:tc>
+        <w:tc>
+          <w:tcPr>
+            <w:tcW w:w="942" w:type="dxa"/>
+          </w:tcPr>
+          <w:p>
+            <w:pPr>
+              <w:spacing w:before="0" w:line="240" w:lineRule="auto"/>
+              <w:rPr>
+                <w:rFonts w:eastAsia="Times New Roman"/>
+                <w:sz w:val="24"/>
+                <w:szCs w:val="24"/>
+              </w:rPr>
+            </w:pPr>
+            <w:r>
+              <w:rPr>
+                <w:rFonts w:eastAsia="Times New Roman"/>
+                <w:sz w:val="24"/>
+                <w:szCs w:val="24"/>
+              </w:rPr>
+              <w:t>Đã đóng</w:t>
+            </w:r>
+          </w:p>
+        </w:tc>
+      </w:tr>
+      <w:tr>
+        <w:tc>
+          <w:tcPr>
+            <w:tcW w:w="1129" w:type="dxa"/>
+          </w:tcPr>
+          <w:p>
+            <w:pPr>
+              <w:spacing w:before="0" w:line="240" w:lineRule="auto"/>
+              <w:rPr>
+                <w:rFonts w:eastAsia="Times New Roman"/>
+                <w:sz w:val="24"/>
+                <w:szCs w:val="24"/>
+              </w:rPr>
+            </w:pPr>
+            <w:r>
+              <w:rPr>
+                <w:rFonts w:eastAsia="Times New Roman"/>
+                <w:sz w:val="24"/>
+                <w:szCs w:val="24"/>
+              </w:rPr>
+              <w:t>DF-02</w:t>
+            </w:r>
+          </w:p>
+        </w:tc>
+        <w:tc>
+          <w:tcPr>
+            <w:tcW w:w="1560" w:type="dxa"/>
+          </w:tcPr>
+          <w:p>
+            <w:pPr>
+              <w:spacing w:before="0" w:line="240" w:lineRule="auto"/>
+              <w:rPr>
+                <w:rFonts w:eastAsia="Times New Roman"/>
+                <w:sz w:val="24"/>
+                <w:szCs w:val="24"/>
+              </w:rPr>
+            </w:pPr>
+            <w:r>
+              <w:rPr>
+                <w:rFonts w:eastAsia="Times New Roman"/>
+                <w:sz w:val="24"/>
+                <w:szCs w:val="24"/>
+              </w:rPr>
+              <w:t>#15</w:t>
+            </w:r>
+          </w:p>
+        </w:tc>
+        <w:tc>
+          <w:tcPr>
+            <w:tcW w:w="1915" w:type="dxa"/>
+          </w:tcPr>
+          <w:p>
+            <w:pPr>
+              <w:spacing w:before="0" w:line="240" w:lineRule="auto"/>
+              <w:rPr>
+                <w:rFonts w:eastAsia="Times New Roman"/>
+                <w:sz w:val="24"/>
+                <w:szCs w:val="24"/>
+              </w:rPr>
+            </w:pPr>
+            <w:r>
+              <w:rPr>
+                <w:rFonts w:eastAsia="Times New Roman"/>
+                <w:sz w:val="24"/>
+                <w:szCs w:val="24"/>
+              </w:rPr>
+              <w:t>API Gemini bị timeout làm sập tiến trình Import CSV, trả về HTTP 500.</w:t>
+            </w:r>
+          </w:p>
+        </w:tc>
+        <w:tc>
+          <w:tcPr>
+            <w:tcW w:w="3181" w:type="dxa"/>
+          </w:tcPr>
+          <w:p>
+            <w:pPr>
+              <w:spacing w:before="0" w:line="240" w:lineRule="auto"/>
+              <w:rPr>
+                <w:rFonts w:eastAsia="Times New Roman"/>
+                <w:sz w:val="24"/>
+                <w:szCs w:val="24"/>
+              </w:rPr>
+            </w:pPr>
+            <w:r>
+              <w:rPr>
+                <w:rFonts w:eastAsia="Times New Roman"/>
+                <w:sz w:val="24"/>
+                <w:szCs w:val="24"/>
+              </w:rPr>
+              <w:t>Thêm khối try/catch bọc lệnh gọi RestTemplate. Nếu lỗi, tự động gom giao dịch vào Chưa phân loại để file vẫn được import.</w:t>
+            </w:r>
+          </w:p>
+        </w:tc>
+        <w:tc>
+          <w:tcPr>
+            <w:tcW w:w="942" w:type="dxa"/>
+          </w:tcPr>
+          <w:p>
+            <w:pPr>
+              <w:spacing w:before="0" w:line="240" w:lineRule="auto"/>
+              <w:rPr>
+                <w:rFonts w:eastAsia="Times New Roman"/>
+                <w:sz w:val="24"/>
+                <w:szCs w:val="24"/>
+              </w:rPr>
+            </w:pPr>
+            <w:r>
+              <w:rPr>
+                <w:rFonts w:eastAsia="Times New Roman"/>
+                <w:sz w:val="24"/>
+                <w:szCs w:val="24"/>
+              </w:rPr>
+              <w:t>Đã đóng</w:t>
+            </w:r>
+          </w:p>
+        </w:tc>
+      </w:tr>
+      <w:tr>
+        <w:tc>
+          <w:tcPr>
+            <w:tcW w:w="1129" w:type="dxa"/>
+          </w:tcPr>
+          <w:p>
+            <w:pPr>
+              <w:spacing w:before="0" w:line="240" w:lineRule="auto"/>
+              <w:rPr>
+                <w:rFonts w:eastAsia="Times New Roman"/>
+                <w:sz w:val="24"/>
+                <w:szCs w:val="24"/>
+              </w:rPr>
+            </w:pPr>
+            <w:r>
+              <w:rPr>
+                <w:rFonts w:eastAsia="Times New Roman"/>
+                <w:sz w:val="24"/>
+                <w:szCs w:val="24"/>
+              </w:rPr>
+              <w:t>DF-03</w:t>
+            </w:r>
+          </w:p>
+        </w:tc>
+        <w:tc>
+          <w:tcPr>
+            <w:tcW w:w="1560" w:type="dxa"/>
+          </w:tcPr>
+          <w:p>
+            <w:pPr>
+              <w:spacing w:before="0" w:line="240" w:lineRule="auto"/>
+              <w:rPr>
+                <w:rFonts w:eastAsia="Times New Roman"/>
+                <w:sz w:val="24"/>
+                <w:szCs w:val="24"/>
+              </w:rPr>
+            </w:pPr>
+            <w:r>
+              <w:rPr>
+                <w:rFonts w:eastAsia="Times New Roman"/>
+                <w:sz w:val="24"/>
+                <w:szCs w:val="24"/>
+              </w:rPr>
+              <w:t>#18</w:t>
+            </w:r>
+          </w:p>
+        </w:tc>
+        <w:tc>
+          <w:tcPr>
+            <w:tcW w:w="1915" w:type="dxa"/>
+          </w:tcPr>
+          <w:p>
+            <w:pPr>
+              <w:spacing w:before="0" w:line="240" w:lineRule="auto"/>
+              <w:rPr>
+                <w:rFonts w:eastAsia="Times New Roman"/>
+                <w:sz w:val="24"/>
+                <w:szCs w:val="24"/>
+              </w:rPr>
+            </w:pPr>
+            <w:r>
+              <w:rPr>
+                <w:rFonts w:eastAsia="Times New Roman"/>
+                <w:sz w:val="24"/>
+                <w:szCs w:val="24"/>
+              </w:rPr>
+              <w:t>Lỗi IDOR: User A gọi API xóa được thông báo (Notification) của User B bằng cách truyền ID.</w:t>
+            </w:r>
+          </w:p>
+        </w:tc>
+        <w:tc>
+          <w:tcPr>
+            <w:tcW w:w="3181" w:type="dxa"/>
+          </w:tcPr>
+          <w:p>
+            <w:pPr>
+              <w:spacing w:before="0" w:line="240" w:lineRule="auto"/>
+              <w:rPr>
+                <w:rFonts w:eastAsia="Times New Roman"/>
+                <w:sz w:val="24"/>
+                <w:szCs w:val="24"/>
+              </w:rPr>
+            </w:pPr>
+            <w:r>
+              <w:rPr>
+                <w:rFonts w:eastAsia="Times New Roman"/>
+                <w:sz w:val="24"/>
+                <w:szCs w:val="24"/>
+              </w:rPr>
+              <w:t>Cập nhật hàm deleteNotification bắt buộc truy vấn theo cả id và userId người gọi thay vì chỉ dùng id.</w:t>
+            </w:r>
+          </w:p>
+        </w:tc>
+        <w:tc>
+          <w:tcPr>
+            <w:tcW w:w="942" w:type="dxa"/>
+          </w:tcPr>
+          <w:p>
+            <w:pPr>
+              <w:spacing w:before="0" w:line="240" w:lineRule="auto"/>
+              <w:rPr>
+                <w:rFonts w:eastAsia="Times New Roman"/>
+                <w:sz w:val="24"/>
+                <w:szCs w:val="24"/>
+              </w:rPr>
+            </w:pPr>
+            <w:r>
+              <w:rPr>
+                <w:rFonts w:eastAsia="Times New Roman"/>
+                <w:sz w:val="24"/>
+                <w:szCs w:val="24"/>
+              </w:rPr>
+              <w:t>Đã đóng</w:t>
+            </w:r>
+          </w:p>
+        </w:tc>
+      </w:tr>
+    </w:tbl>
+    <w:p>
+      <w:pPr>
+        <w:spacing w:after="120"/>
+        <w:rPr>
+          <w:sz w:val="26"/>
+          <w:szCs w:val="26"/>
+        </w:rPr>
+      </w:pPr>
+    </w:p>
+    <w:p>
+      <w:pPr>
+        <w:spacing w:after="200"/>
+        <w:rPr>
+          <w:sz w:val="26"/>
+          <w:szCs w:val="26"/>
+        </w:rPr>
+      </w:pPr>
+      <w:r>
+        <w:rPr>
+          <w:sz w:val="26"/>
+          <w:szCs w:val="26"/>
+        </w:rPr>
+        <w:t>5.6. Đánh giá đối chiếu mục tiêu</w:t>
+      </w:r>
+    </w:p>
+    <w:p>
+      <w:pPr>
+        <w:spacing w:after="200"/>
+        <w:rPr>
+          <w:sz w:val="26"/>
+          <w:szCs w:val="26"/>
+        </w:rPr>
+      </w:pPr>
       <w:r>
         <w:rPr>
           <w:sz w:val="26"/>
           <w:szCs w:val="26"/>
         </w:rPr>
         <w:lastRenderedPageBreak/>
-        <w:t>5.3. Đánh giá kết quả đạt được</w:t>
-      </w:r>
-      <w:r>
-        <w:rPr>
-          <w:sz w:val="26"/>
-          <w:szCs w:val="26"/>
-        </w:rPr>
-        <w:br/>
-        <w:t xml:space="preserve">    5.3.1. Kết quả đạt được</w:t>
-      </w:r>
-      <w:r>
-        <w:rPr>
-          <w:sz w:val="26"/>
-          <w:szCs w:val="26"/>
-        </w:rPr>
-        <w:br/>
-        <w:t xml:space="preserve">    5.3.2. Hạn chế</w:t>
-      </w:r>
-      <w:r>
-        <w:rPr>
-          <w:sz w:val="26"/>
-          <w:szCs w:val="26"/>
-        </w:rPr>
-        <w:br/>
-        <w:t xml:space="preserve">5.4. So sánh với yêu cầu ban đầu  </w:t>
-      </w:r>
-    </w:p>
+        <w:t>Mục tiêu của đề tài đặt ra tại Chương 1 được đối chiếu với kết quả thực tế đo lường được sau quá trình kiểm thử như sau:</w:t>
+      </w:r>
+    </w:p>
+    <w:tbl>
+      <w:tblPr>
+        <w:tblW w:w="5000" w:type="pct"/>
+        <w:tblBorders>
+          <w:top w:val="single" w:sz="4" w:space="0" w:color="auto"/>
+          <w:left w:val="single" w:sz="4" w:space="0" w:color="auto"/>
+          <w:bottom w:val="single" w:sz="4" w:space="0" w:color="auto"/>
+          <w:right w:val="single" w:sz="4" w:space="0" w:color="auto"/>
+          <w:insideH w:val="single" w:sz="4" w:space="0" w:color="auto"/>
+          <w:insideV w:val="single" w:sz="4" w:space="0" w:color="auto"/>
+        </w:tblBorders>
+        <w:tblLayout w:type="fixed"/>
+        <w:tblCellMar>
+          <w:top w:w="80" w:type="dxa"/>
+          <w:left w:w="120" w:type="dxa"/>
+          <w:bottom w:w="80" w:type="dxa"/>
+          <w:right w:w="120" w:type="dxa"/>
+        </w:tblCellMar>
+        <w:tblLook w:val="0000" w:firstRow="0" w:lastRow="0" w:firstColumn="0" w:lastColumn="0" w:noHBand="0" w:noVBand="0"/>
+      </w:tblPr>
+      <w:tblGrid>
+        <w:gridCol w:w="1726"/>
+        <w:gridCol w:w="2212"/>
+        <w:gridCol w:w="2699"/>
+        <w:gridCol w:w="2090"/>
+      </w:tblGrid>
+      <w:tr>
+        <w:trPr>
+          <w:tblHeader/>
+        </w:trPr>
+        <w:tc>
+          <w:tcPr>
+            <w:tcW w:w="1846" w:type="dxa"/>
+          </w:tcPr>
+          <w:p>
+            <w:pPr>
+              <w:spacing w:before="0" w:line="240" w:lineRule="auto"/>
+              <w:rPr>
+                <w:rFonts w:eastAsia="Times New Roman"/>
+                <w:sz w:val="24"/>
+                <w:szCs w:val="24"/>
+              </w:rPr>
+            </w:pPr>
+            <w:r>
+              <w:rPr>
+                <w:rFonts w:eastAsia="Times New Roman"/>
+                <w:b/>
+                <w:bCs/>
+                <w:sz w:val="24"/>
+                <w:szCs w:val="24"/>
+              </w:rPr>
+              <w:t>Mục tiêu</w:t>
+            </w:r>
+          </w:p>
+        </w:tc>
+        <w:tc>
+          <w:tcPr>
+            <w:tcW w:w="2373" w:type="dxa"/>
+          </w:tcPr>
+          <w:p>
+            <w:pPr>
+              <w:spacing w:before="0" w:line="240" w:lineRule="auto"/>
+              <w:rPr>
+                <w:rFonts w:eastAsia="Times New Roman"/>
+                <w:sz w:val="24"/>
+                <w:szCs w:val="24"/>
+              </w:rPr>
+            </w:pPr>
+            <w:r>
+              <w:rPr>
+                <w:rFonts w:eastAsia="Times New Roman"/>
+                <w:b/>
+                <w:bCs/>
+                <w:sz w:val="24"/>
+                <w:szCs w:val="24"/>
+              </w:rPr>
+              <w:t>Phương pháp đo lường</w:t>
+            </w:r>
+          </w:p>
+        </w:tc>
+        <w:tc>
+          <w:tcPr>
+            <w:tcW w:w="2900" w:type="dxa"/>
+          </w:tcPr>
+          <w:p>
+            <w:pPr>
+              <w:spacing w:before="0" w:line="240" w:lineRule="auto"/>
+              <w:rPr>
+                <w:rFonts w:eastAsia="Times New Roman"/>
+                <w:sz w:val="24"/>
+                <w:szCs w:val="24"/>
+              </w:rPr>
+            </w:pPr>
+            <w:r>
+              <w:rPr>
+                <w:rFonts w:eastAsia="Times New Roman"/>
+                <w:b/>
+                <w:bCs/>
+                <w:sz w:val="24"/>
+                <w:szCs w:val="24"/>
+              </w:rPr>
+              <w:t>Kết quả thực tế</w:t>
+            </w:r>
+          </w:p>
+        </w:tc>
+        <w:tc>
+          <w:tcPr>
+            <w:tcW w:w="2241" w:type="dxa"/>
+          </w:tcPr>
+          <w:p>
+            <w:pPr>
+              <w:spacing w:before="0" w:line="240" w:lineRule="auto"/>
+              <w:rPr>
+                <w:rFonts w:eastAsia="Times New Roman"/>
+                <w:sz w:val="24"/>
+                <w:szCs w:val="24"/>
+              </w:rPr>
+            </w:pPr>
+            <w:r>
+              <w:rPr>
+                <w:rFonts w:eastAsia="Times New Roman"/>
+                <w:b/>
+                <w:bCs/>
+                <w:sz w:val="24"/>
+                <w:szCs w:val="24"/>
+              </w:rPr>
+              <w:t>Đánh giá</w:t>
+            </w:r>
+          </w:p>
+        </w:tc>
+      </w:tr>
+      <w:tr>
+        <w:tc>
+          <w:tcPr>
+            <w:tcW w:w="1846" w:type="dxa"/>
+          </w:tcPr>
+          <w:p>
+            <w:pPr>
+              <w:spacing w:before="0" w:line="240" w:lineRule="auto"/>
+              <w:rPr>
+                <w:rFonts w:eastAsia="Times New Roman"/>
+                <w:sz w:val="24"/>
+                <w:szCs w:val="24"/>
+              </w:rPr>
+            </w:pPr>
+            <w:r>
+              <w:rPr>
+                <w:rFonts w:eastAsia="Times New Roman"/>
+                <w:sz w:val="24"/>
+                <w:szCs w:val="24"/>
+              </w:rPr>
+              <w:t>Quản lý toàn diện tài khoản, thu chi</w:t>
+            </w:r>
+          </w:p>
+        </w:tc>
+        <w:tc>
+          <w:tcPr>
+            <w:tcW w:w="2373" w:type="dxa"/>
+          </w:tcPr>
+          <w:p>
+            <w:pPr>
+              <w:spacing w:before="0" w:line="240" w:lineRule="auto"/>
+              <w:rPr>
+                <w:rFonts w:eastAsia="Times New Roman"/>
+                <w:sz w:val="24"/>
+                <w:szCs w:val="24"/>
+              </w:rPr>
+            </w:pPr>
+            <w:r>
+              <w:rPr>
+                <w:rFonts w:eastAsia="Times New Roman"/>
+                <w:sz w:val="24"/>
+                <w:szCs w:val="24"/>
+              </w:rPr>
+              <w:t>Kiểm tra luồng CRUD của giao dịch, ví, danh mục. Test IDOR bảo mật.</w:t>
+            </w:r>
+          </w:p>
+        </w:tc>
+        <w:tc>
+          <w:tcPr>
+            <w:tcW w:w="2900" w:type="dxa"/>
+          </w:tcPr>
+          <w:p>
+            <w:pPr>
+              <w:spacing w:before="0" w:line="240" w:lineRule="auto"/>
+              <w:rPr>
+                <w:rFonts w:eastAsia="Times New Roman"/>
+                <w:sz w:val="24"/>
+                <w:szCs w:val="24"/>
+              </w:rPr>
+            </w:pPr>
+            <w:r>
+              <w:rPr>
+                <w:rFonts w:eastAsia="Times New Roman"/>
+                <w:sz w:val="24"/>
+                <w:szCs w:val="24"/>
+              </w:rPr>
+              <w:t>100% Test Case (TC-TRAN, TC-CATE, TC-WALL) Pass. Không có lỗi truy cập chéo.</w:t>
+            </w:r>
+          </w:p>
+        </w:tc>
+        <w:tc>
+          <w:tcPr>
+            <w:tcW w:w="2241" w:type="dxa"/>
+          </w:tcPr>
+          <w:p>
+            <w:pPr>
+              <w:spacing w:before="0" w:line="240" w:lineRule="auto"/>
+              <w:rPr>
+                <w:rFonts w:eastAsia="Times New Roman"/>
+                <w:sz w:val="24"/>
+                <w:szCs w:val="24"/>
+              </w:rPr>
+            </w:pPr>
+            <w:r>
+              <w:rPr>
+                <w:rFonts w:eastAsia="Times New Roman"/>
+                <w:sz w:val="24"/>
+                <w:szCs w:val="24"/>
+              </w:rPr>
+              <w:t>Đạt. Hệ thống đảm bảo toàn vẹn số dư dòng tiền.</w:t>
+            </w:r>
+          </w:p>
+        </w:tc>
+      </w:tr>
+      <w:tr>
+        <w:tc>
+          <w:tcPr>
+            <w:tcW w:w="1846" w:type="dxa"/>
+          </w:tcPr>
+          <w:p>
+            <w:pPr>
+              <w:spacing w:before="0" w:line="240" w:lineRule="auto"/>
+              <w:rPr>
+                <w:rFonts w:eastAsia="Times New Roman"/>
+                <w:sz w:val="24"/>
+                <w:szCs w:val="24"/>
+              </w:rPr>
+            </w:pPr>
+            <w:r>
+              <w:rPr>
+                <w:rFonts w:eastAsia="Times New Roman"/>
+                <w:sz w:val="24"/>
+                <w:szCs w:val="24"/>
+              </w:rPr>
+              <w:t>Tự động hóa nhập liệu CSV, giảm thủ công</w:t>
+            </w:r>
+          </w:p>
+        </w:tc>
+        <w:tc>
+          <w:tcPr>
+            <w:tcW w:w="2373" w:type="dxa"/>
+          </w:tcPr>
+          <w:p>
+            <w:pPr>
+              <w:spacing w:before="0" w:line="240" w:lineRule="auto"/>
+              <w:rPr>
+                <w:rFonts w:eastAsia="Times New Roman"/>
+                <w:sz w:val="24"/>
+                <w:szCs w:val="24"/>
+              </w:rPr>
+            </w:pPr>
+            <w:r>
+              <w:rPr>
+                <w:rFonts w:eastAsia="Times New Roman"/>
+                <w:sz w:val="24"/>
+                <w:szCs w:val="24"/>
+              </w:rPr>
+              <w:t>Upload file CSV 100 dòng. Đo tỷ lệ khớp Rule và tỷ lệ phân loại AI.</w:t>
+            </w:r>
+          </w:p>
+        </w:tc>
+        <w:tc>
+          <w:tcPr>
+            <w:tcW w:w="2900" w:type="dxa"/>
+          </w:tcPr>
+          <w:p>
+            <w:pPr>
+              <w:spacing w:before="0" w:line="240" w:lineRule="auto"/>
+              <w:rPr>
+                <w:rFonts w:eastAsia="Times New Roman"/>
+                <w:sz w:val="24"/>
+                <w:szCs w:val="24"/>
+              </w:rPr>
+            </w:pPr>
+            <w:r>
+              <w:rPr>
+                <w:rFonts w:eastAsia="Times New Roman"/>
+                <w:sz w:val="24"/>
+                <w:szCs w:val="24"/>
+              </w:rPr>
+              <w:t>Khử trùng lặp chính xác 100%. Thuật toán Hybrid phân loại thành công mà không làm gián đoạn hệ thống.</w:t>
+            </w:r>
+          </w:p>
+        </w:tc>
+        <w:tc>
+          <w:tcPr>
+            <w:tcW w:w="2241" w:type="dxa"/>
+          </w:tcPr>
+          <w:p>
+            <w:pPr>
+              <w:spacing w:before="0" w:line="240" w:lineRule="auto"/>
+              <w:rPr>
+                <w:rFonts w:eastAsia="Times New Roman"/>
+                <w:sz w:val="24"/>
+                <w:szCs w:val="24"/>
+              </w:rPr>
+            </w:pPr>
+            <w:r>
+              <w:rPr>
+                <w:rFonts w:eastAsia="Times New Roman"/>
+                <w:sz w:val="24"/>
+                <w:szCs w:val="24"/>
+              </w:rPr>
+              <w:t>Đạt. Tiết kiệm đáng kể công sức nhập tay của người dùng.</w:t>
+            </w:r>
+          </w:p>
+        </w:tc>
+      </w:tr>
+      <w:tr>
+        <w:tc>
+          <w:tcPr>
+            <w:tcW w:w="1846" w:type="dxa"/>
+          </w:tcPr>
+          <w:p>
+            <w:pPr>
+              <w:spacing w:before="0" w:line="240" w:lineRule="auto"/>
+              <w:rPr>
+                <w:rFonts w:eastAsia="Times New Roman"/>
+                <w:sz w:val="24"/>
+                <w:szCs w:val="24"/>
+              </w:rPr>
+            </w:pPr>
+            <w:r>
+              <w:rPr>
+                <w:rFonts w:eastAsia="Times New Roman"/>
+                <w:sz w:val="24"/>
+                <w:szCs w:val="24"/>
+              </w:rPr>
+              <w:t>Phân tích trực quan và cảnh báo kịp thời</w:t>
+            </w:r>
+          </w:p>
+        </w:tc>
+        <w:tc>
+          <w:tcPr>
+            <w:tcW w:w="2373" w:type="dxa"/>
+          </w:tcPr>
+          <w:p>
+            <w:pPr>
+              <w:spacing w:before="0" w:line="240" w:lineRule="auto"/>
+              <w:rPr>
+                <w:rFonts w:eastAsia="Times New Roman"/>
+                <w:sz w:val="24"/>
+                <w:szCs w:val="24"/>
+              </w:rPr>
+            </w:pPr>
+            <w:r>
+              <w:rPr>
+                <w:rFonts w:eastAsia="Times New Roman"/>
+                <w:sz w:val="24"/>
+                <w:szCs w:val="24"/>
+              </w:rPr>
+              <w:t>Tạo giao dịch vượt ngân sách. Chờ Cron Job chạy đến hạn hóa đơn.</w:t>
+            </w:r>
+          </w:p>
+        </w:tc>
+        <w:tc>
+          <w:tcPr>
+            <w:tcW w:w="2900" w:type="dxa"/>
+          </w:tcPr>
+          <w:p>
+            <w:pPr>
+              <w:spacing w:before="0" w:line="240" w:lineRule="auto"/>
+              <w:rPr>
+                <w:rFonts w:eastAsia="Times New Roman"/>
+                <w:sz w:val="24"/>
+                <w:szCs w:val="24"/>
+              </w:rPr>
+            </w:pPr>
+            <w:r>
+              <w:rPr>
+                <w:rFonts w:eastAsia="Times New Roman"/>
+                <w:sz w:val="24"/>
+                <w:szCs w:val="24"/>
+              </w:rPr>
+              <w:t>Email và In-app Notification (TC-BUDG-004, TC-SCHED-001) được gửi đi tức thời đúng mức ưu tiên.</w:t>
+            </w:r>
+          </w:p>
+        </w:tc>
+        <w:tc>
+          <w:tcPr>
+            <w:tcW w:w="2241" w:type="dxa"/>
+          </w:tcPr>
+          <w:p>
+            <w:pPr>
+              <w:spacing w:before="0" w:line="240" w:lineRule="auto"/>
+              <w:rPr>
+                <w:rFonts w:eastAsia="Times New Roman"/>
+                <w:sz w:val="24"/>
+                <w:szCs w:val="24"/>
+              </w:rPr>
+            </w:pPr>
+            <w:r>
+              <w:rPr>
+                <w:rFonts w:eastAsia="Times New Roman"/>
+                <w:sz w:val="24"/>
+                <w:szCs w:val="24"/>
+              </w:rPr>
+              <w:t>Đạt. Giúp người dùng kiểm soát tài chính chủ động.</w:t>
+            </w:r>
+          </w:p>
+        </w:tc>
+      </w:tr>
+    </w:tbl>
     <w:p>
       <w:pPr>
         <w:spacing w:after="200"/>
@@ -28768,18 +31671,87 @@
           <w:szCs w:val="26"/>
         </w:rPr>
       </w:pPr>
-      <w:r>
-        <w:rPr>
-          <w:sz w:val="26"/>
-          <w:szCs w:val="26"/>
-        </w:rPr>
-        <w:t xml:space="preserve"> </w:t>
+    </w:p>
+    <w:p>
+      <w:pPr>
+        <w:spacing w:after="200"/>
+        <w:rPr>
+          <w:sz w:val="26"/>
+          <w:szCs w:val="26"/>
+        </w:rPr>
+      </w:pPr>
+      <w:r>
+        <w:rPr>
+          <w:sz w:val="26"/>
+          <w:szCs w:val="26"/>
+        </w:rPr>
+        <w:t>5.7. Phần chưa kiểm thử được</w:t>
+      </w:r>
+    </w:p>
+    <w:p>
+      <w:pPr>
+        <w:spacing w:after="200"/>
+        <w:rPr>
+          <w:sz w:val="26"/>
+          <w:szCs w:val="26"/>
+        </w:rPr>
+      </w:pPr>
+      <w:r>
+        <w:rPr>
+          <w:sz w:val="26"/>
+          <w:szCs w:val="26"/>
+        </w:rPr>
+        <w:t>Mặc dù hệ thống đã đáp ứng tốt các kiểm thử về chức năng và logic nghiệp vụ, do giới hạn về thiết bị và khuôn khổ của đồ án, một số khía cạnh chuyên sâu dưới đây chưa được kiểm thử toàn diện:</w:t>
+      </w:r>
+    </w:p>
+    <w:p>
+      <w:pPr>
+        <w:spacing w:after="200"/>
+        <w:rPr>
+          <w:sz w:val="26"/>
+          <w:szCs w:val="26"/>
+        </w:rPr>
+      </w:pPr>
+      <w:r>
+        <w:rPr>
+          <w:sz w:val="26"/>
+          <w:szCs w:val="26"/>
+        </w:rPr>
+        <w:t>Thứ nhất, chưa kiểm thử chịu tải và hiệu năng (Load/Performance Testing). Hệ thống mới được xác nhận hoạt động mượt mà dưới góc độ người dùng đơn lẻ. Nhóm chưa áp dụng các công cụ như JMeter hay k6 để giả lập tình huống hàng trăm người dùng cùng lúc đẩy file CSV lên server, nhằm đo đạc thời gian phản hồi (Response Time) và đánh giá giới hạn chịu tải (Rate Limit) của API Google Gemini miễn phí.</w:t>
+      </w:r>
+    </w:p>
+    <w:p>
+      <w:pPr>
+        <w:spacing w:after="200"/>
+        <w:rPr>
+          <w:sz w:val="26"/>
+          <w:szCs w:val="26"/>
+        </w:rPr>
+      </w:pPr>
+      <w:r>
+        <w:rPr>
+          <w:sz w:val="26"/>
+          <w:szCs w:val="26"/>
+        </w:rPr>
+        <w:t xml:space="preserve">Thứ hai, chưa triển khai kiểm thử giao diện tự động (Automated E2E Testing). Toàn bộ các thao tác kiểm thử trên giao diện ReactJS (như bấm nút, xem biểu đồ, kéo thả file) hiện tại đều được thực hiện thông qua con người (Manual). Việc xây dựng các kịch bản kiểm thử tự động bằng Cypress hoặc Playwright để tự động hóa </w:t>
+      </w:r>
+      <w:r>
+        <w:rPr>
+          <w:sz w:val="26"/>
+          <w:szCs w:val="26"/>
+        </w:rPr>
+        <w:lastRenderedPageBreak/>
+        <w:t>trình duyệt sẽ là hướng đi cần thiết để tăng tính chuyên nghiệp nếu hệ thống được triển khai thương mại hóa.</w:t>
       </w:r>
     </w:p>
     <w:p>
       <w:pPr>
         <w:pStyle w:val="Heading1"/>
-        <w:rPr>
+        <w:jc w:val="center"/>
+        <w:rPr>
+          <w:b/>
+          <w:bCs/>
+          <w:color w:val="auto"/>
           <w:sz w:val="26"/>
           <w:szCs w:val="26"/>
         </w:rPr>
@@ -28787,64 +31759,656 @@
       <w:bookmarkStart w:id="67" w:name="_Toc236173488"/>
       <w:r>
         <w:rPr>
-          <w:sz w:val="26"/>
-          <w:szCs w:val="26"/>
-        </w:rPr>
-        <w:t>Chương 6. KẾT LUẬN &amp; HƯỚNG PHÁT TRIỂN</w:t>
+          <w:b/>
+          <w:bCs/>
+          <w:color w:val="auto"/>
+          <w:sz w:val="26"/>
+          <w:szCs w:val="26"/>
+        </w:rPr>
+        <w:t xml:space="preserve">Chương 6. KẾT LUẬN </w:t>
+      </w:r>
+      <w:r>
+        <w:rPr>
+          <w:b/>
+          <w:bCs/>
+          <w:color w:val="auto"/>
+          <w:sz w:val="26"/>
+          <w:szCs w:val="26"/>
+        </w:rPr>
+        <w:t>VÀ</w:t>
+      </w:r>
+      <w:r>
+        <w:rPr>
+          <w:b/>
+          <w:bCs/>
+          <w:color w:val="auto"/>
+          <w:sz w:val="26"/>
+          <w:szCs w:val="26"/>
+        </w:rPr>
+        <w:t xml:space="preserve"> HƯỚNG PHÁT TRIỂN</w:t>
       </w:r>
       <w:bookmarkEnd w:id="67"/>
     </w:p>
     <w:p>
       <w:pPr>
-        <w:spacing w:after="120"/>
-        <w:rPr>
-          <w:sz w:val="26"/>
-          <w:szCs w:val="26"/>
-        </w:rPr>
-      </w:pPr>
-      <w:r>
-        <w:rPr>
-          <w:sz w:val="26"/>
-          <w:szCs w:val="26"/>
-        </w:rPr>
-        <w:t>6.1. Kết luận</w:t>
-      </w:r>
-      <w:r>
-        <w:rPr>
-          <w:sz w:val="26"/>
-          <w:szCs w:val="26"/>
-        </w:rPr>
-        <w:br/>
-        <w:t xml:space="preserve">6.2. Hướng phát triển  </w:t>
+        <w:pStyle w:val="Heading2"/>
+        <w:rPr>
+          <w:b/>
+          <w:bCs/>
+          <w:color w:val="auto"/>
+        </w:rPr>
+      </w:pPr>
+      <w:r>
+        <w:rPr>
+          <w:b/>
+          <w:bCs/>
+          <w:color w:val="auto"/>
+        </w:rPr>
+        <w:t>6.1. Kết quả đạt được</w:t>
       </w:r>
     </w:p>
     <w:p>
       <w:pPr>
         <w:spacing w:after="200"/>
         <w:rPr>
-          <w:b/>
-          <w:bCs/>
-          <w:color w:val="2E74B5"/>
-          <w:sz w:val="26"/>
-          <w:szCs w:val="26"/>
-        </w:rPr>
-      </w:pPr>
-      <w:r>
-        <w:rPr>
-          <w:sz w:val="26"/>
-          <w:szCs w:val="26"/>
-        </w:rPr>
-        <w:t xml:space="preserve"> </w:t>
-      </w:r>
-      <w:r>
-        <w:rPr>
-          <w:b/>
-          <w:bCs/>
-          <w:sz w:val="26"/>
-          <w:szCs w:val="26"/>
-        </w:rPr>
-        <w:br w:type="page"/>
-      </w:r>
+          <w:sz w:val="26"/>
+          <w:szCs w:val="26"/>
+        </w:rPr>
+      </w:pPr>
+      <w:r>
+        <w:rPr>
+          <w:sz w:val="26"/>
+          <w:szCs w:val="26"/>
+        </w:rPr>
+        <w:t>Đồ án đã hiện thực hóa thành công một hệ thống quản lý tài chính cá nhân và gia đình toàn diện, đáp ứng sát với các mục tiêu đã đề ra tại Chương 1. Về mặt kỹ thuật, hệ thống được xây dựng hoàn chỉnh theo kiến trúc Client-Server, với phía máy chủ sử dụng Spring Boot và phía máy khách sử dụng ReactJS, kết hợp cùng cơ sở dữ liệu MySQL và được đóng gói triển khai chuẩn hóa qua Docker.</w:t>
+      </w:r>
+    </w:p>
+    <w:p>
+      <w:pPr>
+        <w:rPr>
+          <w:sz w:val="26"/>
+          <w:szCs w:val="26"/>
+        </w:rPr>
+      </w:pPr>
+      <w:r>
+        <w:rPr>
+          <w:sz w:val="26"/>
+          <w:szCs w:val="26"/>
+        </w:rPr>
+        <w:t>Đối chiếu với các mục tiêu ban đầu, hệ thống đã đạt được những kết quả cụ thể sau:</w:t>
+      </w:r>
+    </w:p>
+    <w:p>
+      <w:pPr>
+        <w:spacing w:after="200"/>
+        <w:rPr>
+          <w:sz w:val="26"/>
+          <w:szCs w:val="26"/>
+        </w:rPr>
+      </w:pPr>
+      <w:r>
+        <w:rPr>
+          <w:sz w:val="26"/>
+          <w:szCs w:val="26"/>
+        </w:rPr>
+        <w:t>Thứ nhất, giải quyết triệt để bài toán nhập liệu thủ công bằng cách xây dựng tính năng import sao kê từ tệp CSV và Excel. Hệ thống không chỉ đọc và chuẩn hóa dữ liệu linh hoạt mà còn áp dụng thuật toán đối chiếu 4 tham số (ví, ngày, số tiền, nội dung) để loại bỏ 100% các giao dịch bị trùng lặp.</w:t>
+      </w:r>
+    </w:p>
+    <w:p>
+      <w:pPr>
+        <w:spacing w:after="200"/>
+        <w:rPr>
+          <w:sz w:val="26"/>
+          <w:szCs w:val="26"/>
+        </w:rPr>
+      </w:pPr>
+      <w:r>
+        <w:rPr>
+          <w:sz w:val="26"/>
+          <w:szCs w:val="26"/>
+        </w:rPr>
+        <w:t xml:space="preserve">Thứ hai, chuyển khai thành công cơ chế phân loại giao dịch lọc qua bằng bộ quy tắc khóa từ vựng, </w:t>
+      </w:r>
+      <w:r>
+        <w:rPr>
+          <w:sz w:val="26"/>
+          <w:szCs w:val="26"/>
+        </w:rPr>
+        <w:t>sau đó mới gom các giao dịch chưa nhận diện được thành một lô để gửi đến Google Gemini API. Phương pháp này giúp hệ thống đạt độ chính xác cao trong phân loại nhưng vẫn tối ưu được chi phí và thời gian chờ.</w:t>
+      </w:r>
+    </w:p>
+    <w:p>
+      <w:pPr>
+        <w:spacing w:after="200"/>
+        <w:rPr>
+          <w:sz w:val="26"/>
+          <w:szCs w:val="26"/>
+        </w:rPr>
+      </w:pPr>
+      <w:r>
+        <w:rPr>
+          <w:sz w:val="26"/>
+          <w:szCs w:val="26"/>
+        </w:rPr>
+        <w:t>Thứ ba, xây dựng được một công cụ kiểm soát tài chính chủ động thông qua tính năng ngân sách và mục tiêu tiết kiệm. Hệ thống lập lịch ngầm hoạt động ổn định, tự động theo dõi và phát đi cảnh báo qua email cũng như thông báo trong ứng dụng ngay khi người dùng có giao dịch làm vượt ngưỡng chi tiêu an toàn hoặc khi hóa đơn đến hạn.</w:t>
+      </w:r>
+    </w:p>
+    <w:p>
+      <w:pPr>
+        <w:spacing w:after="200"/>
+        <w:rPr>
+          <w:sz w:val="26"/>
+          <w:szCs w:val="26"/>
+        </w:rPr>
+      </w:pPr>
+      <w:r>
+        <w:rPr>
+          <w:sz w:val="26"/>
+          <w:szCs w:val="26"/>
+        </w:rPr>
+        <w:t>Cuối cùng, hệ thống đã vượt qua các kịch bản kiểm thử nghiêm ngặt, đảm bảo tính toàn vẹn của dữ liệu số dư và không tồn tại lỗ hổng truy cập chéo dữ liệu giữa các người dùng trong chức năng chia sẻ ví gia đình.</w:t>
+      </w:r>
+    </w:p>
+    <w:p>
+      <w:pPr>
+        <w:pStyle w:val="Heading2"/>
+        <w:rPr>
+          <w:b/>
+          <w:bCs/>
+          <w:color w:val="auto"/>
+        </w:rPr>
+      </w:pPr>
+      <w:r>
+        <w:rPr>
+          <w:b/>
+          <w:bCs/>
+          <w:color w:val="auto"/>
+        </w:rPr>
+        <w:t>6.2. Hạn chế còn tồn tại</w:t>
+      </w:r>
+    </w:p>
+    <w:p>
+      <w:pPr>
+        <w:spacing w:after="200"/>
+        <w:rPr>
+          <w:sz w:val="26"/>
+          <w:szCs w:val="26"/>
+        </w:rPr>
+      </w:pPr>
+      <w:r>
+        <w:rPr>
+          <w:sz w:val="26"/>
+          <w:szCs w:val="26"/>
+        </w:rPr>
+        <w:lastRenderedPageBreak/>
+        <w:t>Bên cạnh những kết quả đạt được, phiên bản hiện tại của hệ thống vẫn còn một số hạn chế ảnh hưởng đến trải nghiệm người dùng:</w:t>
+      </w:r>
+    </w:p>
+    <w:p>
+      <w:pPr>
+        <w:spacing w:after="200"/>
+        <w:rPr>
+          <w:b/>
+          <w:bCs/>
+          <w:sz w:val="26"/>
+          <w:szCs w:val="26"/>
+        </w:rPr>
+      </w:pPr>
+      <w:r>
+        <w:rPr>
+          <w:b/>
+          <w:bCs/>
+          <w:sz w:val="26"/>
+          <w:szCs w:val="26"/>
+        </w:rPr>
+        <w:t>Hạn chế về tính liền mạch trong khâu nhập liệu:</w:t>
+      </w:r>
+    </w:p>
+    <w:p>
+      <w:pPr>
+        <w:spacing w:after="200"/>
+        <w:rPr>
+          <w:sz w:val="26"/>
+          <w:szCs w:val="26"/>
+        </w:rPr>
+      </w:pPr>
+      <w:r>
+        <w:rPr>
+          <w:b/>
+          <w:bCs/>
+          <w:sz w:val="26"/>
+          <w:szCs w:val="26"/>
+        </w:rPr>
+        <w:t>Mô tả:</w:t>
+      </w:r>
+      <w:r>
+        <w:rPr>
+          <w:sz w:val="26"/>
+          <w:szCs w:val="26"/>
+        </w:rPr>
+        <w:t xml:space="preserve"> Người dùng vẫn phải đăng nhập vào ứng dụng ngân hàng, xuất tệp sao kê, lưu về máy rồi tải lên hệ thống.</w:t>
+      </w:r>
+    </w:p>
+    <w:p>
+      <w:pPr>
+        <w:spacing w:after="200"/>
+        <w:rPr>
+          <w:sz w:val="26"/>
+          <w:szCs w:val="26"/>
+        </w:rPr>
+      </w:pPr>
+      <w:r>
+        <w:rPr>
+          <w:b/>
+          <w:bCs/>
+          <w:sz w:val="26"/>
+          <w:szCs w:val="26"/>
+        </w:rPr>
+        <w:t>Nguyên nhân:</w:t>
+      </w:r>
+      <w:r>
+        <w:rPr>
+          <w:sz w:val="26"/>
+          <w:szCs w:val="26"/>
+        </w:rPr>
+        <w:t xml:space="preserve"> Do giới hạn về mặt pháp lý và chi phí đối với một đồ án sinh viên, hệ thống chưa thể kết nối trực tiếp với API ngân hàng mở (Open Banking) của các tổ chức tài chính.</w:t>
+      </w:r>
+    </w:p>
+    <w:p>
+      <w:pPr>
+        <w:spacing w:after="200"/>
+        <w:rPr>
+          <w:sz w:val="26"/>
+          <w:szCs w:val="26"/>
+        </w:rPr>
+      </w:pPr>
+      <w:r>
+        <w:rPr>
+          <w:b/>
+          <w:bCs/>
+          <w:sz w:val="26"/>
+          <w:szCs w:val="26"/>
+        </w:rPr>
+        <w:t>Ảnh hưởng:</w:t>
+      </w:r>
+      <w:r>
+        <w:rPr>
+          <w:sz w:val="26"/>
+          <w:szCs w:val="26"/>
+        </w:rPr>
+        <w:t xml:space="preserve"> Quy trình này làm gián đoạn trải nghiệm người dùng, đặc biệt với những người không thường xuyên sao lưu hoặc cập nhật dữ liệu thu chi.</w:t>
+      </w:r>
+    </w:p>
+    <w:p>
+      <w:pPr>
+        <w:spacing w:after="200"/>
+        <w:rPr>
+          <w:b/>
+          <w:bCs/>
+          <w:sz w:val="26"/>
+          <w:szCs w:val="26"/>
+        </w:rPr>
+      </w:pPr>
+      <w:r>
+        <w:rPr>
+          <w:b/>
+          <w:bCs/>
+          <w:sz w:val="26"/>
+          <w:szCs w:val="26"/>
+        </w:rPr>
+        <w:t>Hạn chế về xử lý tác vụ trí tuệ nhân tạo:</w:t>
+      </w:r>
+    </w:p>
+    <w:p>
+      <w:pPr>
+        <w:spacing w:after="200"/>
+        <w:rPr>
+          <w:sz w:val="26"/>
+          <w:szCs w:val="26"/>
+        </w:rPr>
+      </w:pPr>
+      <w:r>
+        <w:rPr>
+          <w:b/>
+          <w:bCs/>
+          <w:sz w:val="26"/>
+          <w:szCs w:val="26"/>
+        </w:rPr>
+        <w:t>Mô tả:</w:t>
+      </w:r>
+      <w:r>
+        <w:rPr>
+          <w:sz w:val="26"/>
+          <w:szCs w:val="26"/>
+        </w:rPr>
+        <w:t xml:space="preserve"> Khi người dùng tải lên tệp sao kê có nhiều giao dịch chưa được định nghĩa từ khóa, hệ thống có thể mất khá nhiều thời gian để xử lý.</w:t>
+      </w:r>
+    </w:p>
+    <w:p>
+      <w:pPr>
+        <w:spacing w:after="200"/>
+        <w:rPr>
+          <w:sz w:val="26"/>
+          <w:szCs w:val="26"/>
+        </w:rPr>
+      </w:pPr>
+      <w:r>
+        <w:rPr>
+          <w:b/>
+          <w:bCs/>
+          <w:sz w:val="26"/>
+          <w:szCs w:val="26"/>
+        </w:rPr>
+        <w:t>Nguyên nhân:</w:t>
+      </w:r>
+      <w:r>
+        <w:rPr>
+          <w:sz w:val="26"/>
+          <w:szCs w:val="26"/>
+        </w:rPr>
+        <w:t xml:space="preserve"> Lời gọi đến Gemini API hiện được thực hiện đồng bộ trong quá trình xử lý tệp. Nếu API phản hồi chậm hoặc bị giới hạn lưu lượng, thời gian xử lý sẽ kéo dài.</w:t>
+      </w:r>
+    </w:p>
+    <w:p>
+      <w:pPr>
+        <w:spacing w:after="200"/>
+        <w:rPr>
+          <w:sz w:val="26"/>
+          <w:szCs w:val="26"/>
+        </w:rPr>
+      </w:pPr>
+      <w:r>
+        <w:rPr>
+          <w:b/>
+          <w:bCs/>
+          <w:sz w:val="26"/>
+          <w:szCs w:val="26"/>
+        </w:rPr>
+        <w:t>Ảnh hưởng:</w:t>
+      </w:r>
+      <w:r>
+        <w:rPr>
+          <w:sz w:val="26"/>
+          <w:szCs w:val="26"/>
+        </w:rPr>
+        <w:t xml:space="preserve"> Người dùng phải chờ lâu trong quá trình tải tệp, dễ tạo cảm giác hệ thống bị chậm.</w:t>
+      </w:r>
+    </w:p>
+    <w:p>
+      <w:pPr>
+        <w:spacing w:after="200"/>
+        <w:rPr>
+          <w:b/>
+          <w:bCs/>
+          <w:sz w:val="26"/>
+          <w:szCs w:val="26"/>
+        </w:rPr>
+      </w:pPr>
+      <w:r>
+        <w:rPr>
+          <w:b/>
+          <w:bCs/>
+          <w:sz w:val="26"/>
+          <w:szCs w:val="26"/>
+        </w:rPr>
+        <w:t>Hạn chế về nền tảng tương tác trên thiết bị di động:</w:t>
+      </w:r>
+    </w:p>
+    <w:p>
+      <w:pPr>
+        <w:spacing w:after="200"/>
+        <w:rPr>
+          <w:sz w:val="26"/>
+          <w:szCs w:val="26"/>
+        </w:rPr>
+      </w:pPr>
+      <w:r>
+        <w:rPr>
+          <w:b/>
+          <w:bCs/>
+          <w:sz w:val="26"/>
+          <w:szCs w:val="26"/>
+        </w:rPr>
+        <w:t>Mô tả:</w:t>
+      </w:r>
+      <w:r>
+        <w:rPr>
+          <w:sz w:val="26"/>
+          <w:szCs w:val="26"/>
+        </w:rPr>
+        <w:t xml:space="preserve"> Hệ thống hiện là một ứng dụng Web đáp ứng (Responsive Web App), có thể sử dụng trên điện thoại nhưng chưa mang lại trải nghiệm như một ứng dụng di động gốc</w:t>
+      </w:r>
+      <w:r>
+        <w:rPr>
+          <w:sz w:val="26"/>
+          <w:szCs w:val="26"/>
+        </w:rPr>
+        <w:t>.</w:t>
+      </w:r>
+    </w:p>
+    <w:p>
+      <w:pPr>
+        <w:spacing w:after="200"/>
+        <w:rPr>
+          <w:sz w:val="26"/>
+          <w:szCs w:val="26"/>
+        </w:rPr>
+      </w:pPr>
+      <w:r>
+        <w:rPr>
+          <w:b/>
+          <w:bCs/>
+          <w:sz w:val="26"/>
+          <w:szCs w:val="26"/>
+        </w:rPr>
+        <w:t>Nguyên nhân:</w:t>
+      </w:r>
+      <w:r>
+        <w:rPr>
+          <w:sz w:val="26"/>
+          <w:szCs w:val="26"/>
+        </w:rPr>
+        <w:t xml:space="preserve"> Giao diện được phát triển bằng ReactJS thay vì các nền tảng di động chuyên biệt.</w:t>
+      </w:r>
+    </w:p>
+    <w:p>
+      <w:pPr>
+        <w:spacing w:after="200"/>
+        <w:rPr>
+          <w:sz w:val="26"/>
+          <w:szCs w:val="26"/>
+        </w:rPr>
+      </w:pPr>
+    </w:p>
+    <w:p>
+      <w:pPr>
+        <w:spacing w:after="200"/>
+        <w:rPr>
+          <w:sz w:val="26"/>
+          <w:szCs w:val="26"/>
+        </w:rPr>
+      </w:pPr>
+      <w:r>
+        <w:rPr>
+          <w:b/>
+          <w:bCs/>
+          <w:sz w:val="26"/>
+          <w:szCs w:val="26"/>
+        </w:rPr>
+        <w:lastRenderedPageBreak/>
+        <w:t>Ảnh hưởng:</w:t>
+      </w:r>
+      <w:r>
+        <w:rPr>
+          <w:sz w:val="26"/>
+          <w:szCs w:val="26"/>
+        </w:rPr>
+        <w:t xml:space="preserve"> Hệ thống chưa thể tận dụng đầy đủ các tính năng của hệ điều hành di động, chẳng hạn như đọc thông báo SMS để tự động cập nhật biến động số dư hoặc gửi Push Notification khi ứng dụng đang đóng.</w:t>
+      </w:r>
+    </w:p>
+    <w:p>
+      <w:pPr>
+        <w:pStyle w:val="Heading2"/>
+        <w:rPr>
+          <w:b/>
+          <w:bCs/>
+          <w:color w:val="auto"/>
+        </w:rPr>
+      </w:pPr>
+      <w:r>
+        <w:rPr>
+          <w:b/>
+          <w:bCs/>
+          <w:color w:val="auto"/>
+        </w:rPr>
+        <w:t>6.3. Hướng phát triển</w:t>
+      </w:r>
+    </w:p>
+    <w:p>
+      <w:pPr>
+        <w:spacing w:after="200"/>
+        <w:rPr>
+          <w:sz w:val="26"/>
+          <w:szCs w:val="26"/>
+        </w:rPr>
+      </w:pPr>
+      <w:r>
+        <w:rPr>
+          <w:sz w:val="26"/>
+          <w:szCs w:val="26"/>
+        </w:rPr>
+        <w:t>Dựa trên các hạn chế đã phân tích, hệ thống đề ra ba hướng phát triển cụ thể cho các phiên bản tiếp theo:</w:t>
+      </w:r>
+    </w:p>
+    <w:p>
+      <w:pPr>
+        <w:spacing w:after="200"/>
+        <w:rPr>
+          <w:sz w:val="26"/>
+          <w:szCs w:val="26"/>
+        </w:rPr>
+      </w:pPr>
+      <w:r>
+        <w:rPr>
+          <w:sz w:val="26"/>
+          <w:szCs w:val="26"/>
+        </w:rPr>
+        <w:t>Tích hợp cổng kết nối ngân hàng mở (Open Banking): Để khắc phục điểm yếu về thao tác tải tệp thủ công, hệ thống sẽ nghiên cứu tích hợp với các dịch vụ tổng hợp dữ liệu tài chính hoặc API của các ngân hàng cho phép. Khi đó, biến động số dư sẽ được đồng bộ hóa về hệ thống theo thời gian thực, người dùng hoàn toàn không cần can thiệp vào quá trình nhập liệu.</w:t>
+      </w:r>
+    </w:p>
+    <w:p>
+      <w:pPr>
+        <w:spacing w:after="200"/>
+        <w:rPr>
+          <w:sz w:val="26"/>
+          <w:szCs w:val="26"/>
+        </w:rPr>
+      </w:pPr>
+      <w:r>
+        <w:rPr>
+          <w:sz w:val="26"/>
+          <w:szCs w:val="26"/>
+        </w:rPr>
+        <w:t>Chuyển đổi sang kiến trúc xử lý bất đồng bộ (Asynchronous Processing): Đối với nút thắt hiệu năng khi gọi AI, hệ thống sẽ đưa vào sử dụng hàng đợi thông điệp (Message Queue như RabbitMQ hoặc Redis). Khi tệp sao kê được tải lên, hệ thống sẽ ghi nhận và phản hồi thành công ngay lập tức cho giao diện. Tác vụ gọi AI phân loại sẽ được đẩy xuống chạy ngầm (Background Job). Sau khi AI xử lý xong, hệ thống sẽ bắn một thông báo qua WebSocket để cập nhật giao diện cho người dùng.</w:t>
+      </w:r>
+    </w:p>
+    <w:p>
+      <w:pPr>
+        <w:spacing w:after="200"/>
+        <w:rPr>
+          <w:sz w:val="26"/>
+          <w:szCs w:val="26"/>
+        </w:rPr>
+      </w:pPr>
+      <w:r>
+        <w:rPr>
+          <w:sz w:val="26"/>
+          <w:szCs w:val="26"/>
+        </w:rPr>
+        <w:t>Phát triển ứng dụng di động gốc: Hệ thống sẽ tận dụng lại toàn bộ nền tảng API hiện có ở phía backend để phát triển thêm một ứng dụng di động bằng React Native hoặc Flutter. Ứng dụng di động sẽ xin cấp quyền đọc thông báo từ thiết bị, tự động nhận diện tin nhắn trừ tiền từ ngân hàng, trích xuất số tiền và đẩy thẳng lên hệ thống, tạo ra trải nghiệm quản lý tài chính hoàn toàn tự động.</w:t>
+      </w:r>
+    </w:p>
+    <w:p>
+      <w:pPr>
+        <w:pStyle w:val="Heading2"/>
+        <w:rPr>
+          <w:b/>
+          <w:bCs/>
+          <w:color w:val="auto"/>
+        </w:rPr>
+      </w:pPr>
+      <w:r>
+        <w:rPr>
+          <w:b/>
+          <w:bCs/>
+          <w:color w:val="auto"/>
+        </w:rPr>
+        <w:t>6.4. Bài học rút ra</w:t>
+      </w:r>
+    </w:p>
+    <w:p>
+      <w:pPr>
+        <w:spacing w:after="200"/>
+        <w:rPr>
+          <w:sz w:val="26"/>
+          <w:szCs w:val="26"/>
+        </w:rPr>
+      </w:pPr>
+      <w:r>
+        <w:rPr>
+          <w:sz w:val="26"/>
+          <w:szCs w:val="26"/>
+        </w:rPr>
+        <w:t xml:space="preserve">Sau quá trình nghiên cứu và phát triển đồ án, bài học lớn nhất nhóm rút ra là vấn đề đảm bảo tính toàn vẹn dữ liệu trong các ứng dụng tài chính (ACID). Ở những phiên bản đầu tiên, hệ thống lấy số dư hiện tại của ví lên bộ nhớ, sau đó cộng hoặc trừ số tiền giao dịch rồi lưu lại. Cách xử lý này dẫn đến sai lệch số dư khi có nhiều giao dịch được import cùng lúc do xảy ra điều kiện tương tranh (race condition). Để </w:t>
+      </w:r>
+      <w:r>
+        <w:rPr>
+          <w:sz w:val="26"/>
+          <w:szCs w:val="26"/>
+        </w:rPr>
+        <w:lastRenderedPageBreak/>
+        <w:t>khắc phục, nhóm đã thiết kế lại cơ chế cập nhật số dư, chuyển sang thực hiện phép cộng hoặc trừ trực tiếp tại cơ sở dữ liệu. Cách này giúp hạn chế việc nhiều request cùng đọc và ghi đè lên một giá trị số dư.</w:t>
+      </w:r>
+    </w:p>
+    <w:p>
+      <w:pPr>
+        <w:spacing w:after="200"/>
+        <w:rPr>
+          <w:sz w:val="26"/>
+          <w:szCs w:val="26"/>
+        </w:rPr>
+      </w:pPr>
+      <w:r>
+        <w:rPr>
+          <w:sz w:val="26"/>
+          <w:szCs w:val="26"/>
+        </w:rPr>
+        <w:t>Bài học thứ hai là việc sử dụng AI cần phù hợp với từng trường hợp. Ban đầu, nhóm dự định sử dụng AI cho hầu hết các thao tác phân loại giao dịch. Tuy nhiên, trong quá trình phát triển, nhóm nhận thấy việc gọi AI cho mọi giao dịch làm tăng thời gian xử lý và sử dụng nhiều tài nguyên hơn cần thiết. Vì vậy, nhóm xây dựng bộ quy tắc dựa trên từ khóa để xử lý các trường hợp thông thường và chỉ sử dụng AI cho những giao dịch không thể phân loại bằng các quy tắc có sẵn. Cách kết hợp này giúp giảm số lần gọi AI và cải thiện thời gian xử lý của hệ thống.</w:t>
+      </w:r>
+    </w:p>
+    <w:p>
+      <w:pPr>
+        <w:spacing w:after="200"/>
+        <w:rPr>
+          <w:sz w:val="26"/>
+          <w:szCs w:val="26"/>
+        </w:rPr>
+      </w:pPr>
+      <w:r>
+        <w:rPr>
+          <w:sz w:val="26"/>
+          <w:szCs w:val="26"/>
+        </w:rPr>
+        <w:t>Qua đó, nhóm nhận thấy việc lựa chọn công nghệ cần dựa trên nhu cầu thực tế của hệ thống. Một công nghệ hiện đại không phải lúc nào cũng là lựa chọn phù hợp nhất. Quan trọng hơn là xác định đúng vấn đề và lựa chọn giải pháp có thể đảm bảo hệ thống hoạt động ổn định, hiệu quả và dễ bảo trì.</w:t>
+      </w:r>
+    </w:p>
+    <w:p>
+      <w:pPr>
+        <w:rPr>
+          <w:sz w:val="26"/>
+          <w:szCs w:val="26"/>
+        </w:rPr>
+      </w:pPr>
     </w:p>
     <w:p>
       <w:pPr>
@@ -28864,7 +32428,6 @@
           <w:sz w:val="26"/>
           <w:szCs w:val="26"/>
         </w:rPr>
-        <w:lastRenderedPageBreak/>
         <w:t>TÀI LIỆU THAM KHẢO</w:t>
       </w:r>
       <w:bookmarkEnd w:id="30"/>
@@ -29284,6 +32847,7 @@
           <w:sz w:val="24"/>
           <w:szCs w:val="24"/>
         </w:rPr>
+        <w:lastRenderedPageBreak/>
         <w:t>[</w:t>
       </w:r>
       <w:r>

</xml_diff>